<commit_message>
Updated java project report document
</commit_message>
<xml_diff>
--- a/Java School Projects/40841063_HLUM HTET AUNG Coursework 2/40841063_Part 2 - Software Development Report.docx
+++ b/Java School Projects/40841063_HLUM HTET AUNG Coursework 2/40841063_Part 2 - Software Development Report.docx
@@ -144,7 +144,7 @@
           <w:r>
             <w:fldChar w:fldCharType="separate"/>
           </w:r>
-          <w:hyperlink w:anchor="_Toc236818892" w:history="1">
+          <w:hyperlink w:anchor="_Toc236953719" w:history="1">
             <w:r>
               <w:rPr>
                 <w:rStyle w:val="Hyperlink"/>
@@ -171,7 +171,7 @@
                 <w:noProof/>
                 <w:webHidden/>
               </w:rPr>
-              <w:instrText xml:space="preserve"> PAGEREF _Toc236818892 \h </w:instrText>
+              <w:instrText xml:space="preserve"> PAGEREF _Toc236953719 \h </w:instrText>
             </w:r>
             <w:r>
               <w:rPr>
@@ -191,7 +191,7 @@
                 <w:noProof/>
                 <w:webHidden/>
               </w:rPr>
-              <w:t>3</w:t>
+              <w:t>4</w:t>
             </w:r>
             <w:r>
               <w:rPr>
@@ -213,7 +213,7 @@
               <w:noProof/>
             </w:rPr>
           </w:pPr>
-          <w:hyperlink w:anchor="_Toc236818893" w:history="1">
+          <w:hyperlink w:anchor="_Toc236953720" w:history="1">
             <w:r>
               <w:rPr>
                 <w:rStyle w:val="Hyperlink"/>
@@ -240,7 +240,7 @@
                 <w:noProof/>
                 <w:webHidden/>
               </w:rPr>
-              <w:instrText xml:space="preserve"> PAGEREF _Toc236818893 \h </w:instrText>
+              <w:instrText xml:space="preserve"> PAGEREF _Toc236953720 \h </w:instrText>
             </w:r>
             <w:r>
               <w:rPr>
@@ -260,7 +260,7 @@
                 <w:noProof/>
                 <w:webHidden/>
               </w:rPr>
-              <w:t>3</w:t>
+              <w:t>4</w:t>
             </w:r>
             <w:r>
               <w:rPr>
@@ -282,7 +282,7 @@
               <w:noProof/>
             </w:rPr>
           </w:pPr>
-          <w:hyperlink w:anchor="_Toc236818894" w:history="1">
+          <w:hyperlink w:anchor="_Toc236953721" w:history="1">
             <w:r>
               <w:rPr>
                 <w:rStyle w:val="Hyperlink"/>
@@ -309,7 +309,7 @@
                 <w:noProof/>
                 <w:webHidden/>
               </w:rPr>
-              <w:instrText xml:space="preserve"> PAGEREF _Toc236818894 \h </w:instrText>
+              <w:instrText xml:space="preserve"> PAGEREF _Toc236953721 \h </w:instrText>
             </w:r>
             <w:r>
               <w:rPr>
@@ -329,7 +329,7 @@
                 <w:noProof/>
                 <w:webHidden/>
               </w:rPr>
-              <w:t>3</w:t>
+              <w:t>4</w:t>
             </w:r>
             <w:r>
               <w:rPr>
@@ -351,7 +351,7 @@
               <w:noProof/>
             </w:rPr>
           </w:pPr>
-          <w:hyperlink w:anchor="_Toc236818895" w:history="1">
+          <w:hyperlink w:anchor="_Toc236953722" w:history="1">
             <w:r>
               <w:rPr>
                 <w:rStyle w:val="Hyperlink"/>
@@ -378,7 +378,7 @@
                 <w:noProof/>
                 <w:webHidden/>
               </w:rPr>
-              <w:instrText xml:space="preserve"> PAGEREF _Toc236818895 \h </w:instrText>
+              <w:instrText xml:space="preserve"> PAGEREF _Toc236953722 \h </w:instrText>
             </w:r>
             <w:r>
               <w:rPr>
@@ -398,7 +398,7 @@
                 <w:noProof/>
                 <w:webHidden/>
               </w:rPr>
-              <w:t>4</w:t>
+              <w:t>5</w:t>
             </w:r>
             <w:r>
               <w:rPr>
@@ -420,7 +420,7 @@
               <w:noProof/>
             </w:rPr>
           </w:pPr>
-          <w:hyperlink w:anchor="_Toc236818896" w:history="1">
+          <w:hyperlink w:anchor="_Toc236953723" w:history="1">
             <w:r>
               <w:rPr>
                 <w:rStyle w:val="Hyperlink"/>
@@ -447,7 +447,7 @@
                 <w:noProof/>
                 <w:webHidden/>
               </w:rPr>
-              <w:instrText xml:space="preserve"> PAGEREF _Toc236818896 \h </w:instrText>
+              <w:instrText xml:space="preserve"> PAGEREF _Toc236953723 \h </w:instrText>
             </w:r>
             <w:r>
               <w:rPr>
@@ -467,7 +467,7 @@
                 <w:noProof/>
                 <w:webHidden/>
               </w:rPr>
-              <w:t>4</w:t>
+              <w:t>5</w:t>
             </w:r>
             <w:r>
               <w:rPr>
@@ -489,7 +489,7 @@
               <w:noProof/>
             </w:rPr>
           </w:pPr>
-          <w:hyperlink w:anchor="_Toc236818897" w:history="1">
+          <w:hyperlink w:anchor="_Toc236953724" w:history="1">
             <w:r>
               <w:rPr>
                 <w:rStyle w:val="Hyperlink"/>
@@ -516,7 +516,7 @@
                 <w:noProof/>
                 <w:webHidden/>
               </w:rPr>
-              <w:instrText xml:space="preserve"> PAGEREF _Toc236818897 \h </w:instrText>
+              <w:instrText xml:space="preserve"> PAGEREF _Toc236953724 \h </w:instrText>
             </w:r>
             <w:r>
               <w:rPr>
@@ -536,7 +536,7 @@
                 <w:noProof/>
                 <w:webHidden/>
               </w:rPr>
-              <w:t>4</w:t>
+              <w:t>5</w:t>
             </w:r>
             <w:r>
               <w:rPr>
@@ -558,7 +558,7 @@
               <w:noProof/>
             </w:rPr>
           </w:pPr>
-          <w:hyperlink w:anchor="_Toc236818898" w:history="1">
+          <w:hyperlink w:anchor="_Toc236953725" w:history="1">
             <w:r>
               <w:rPr>
                 <w:rStyle w:val="Hyperlink"/>
@@ -585,7 +585,7 @@
                 <w:noProof/>
                 <w:webHidden/>
               </w:rPr>
-              <w:instrText xml:space="preserve"> PAGEREF _Toc236818898 \h </w:instrText>
+              <w:instrText xml:space="preserve"> PAGEREF _Toc236953725 \h </w:instrText>
             </w:r>
             <w:r>
               <w:rPr>
@@ -605,7 +605,7 @@
                 <w:noProof/>
                 <w:webHidden/>
               </w:rPr>
-              <w:t>4</w:t>
+              <w:t>5</w:t>
             </w:r>
             <w:r>
               <w:rPr>
@@ -627,7 +627,7 @@
               <w:noProof/>
             </w:rPr>
           </w:pPr>
-          <w:hyperlink w:anchor="_Toc236818899" w:history="1">
+          <w:hyperlink w:anchor="_Toc236953726" w:history="1">
             <w:r>
               <w:rPr>
                 <w:rStyle w:val="Hyperlink"/>
@@ -654,7 +654,7 @@
                 <w:noProof/>
                 <w:webHidden/>
               </w:rPr>
-              <w:instrText xml:space="preserve"> PAGEREF _Toc236818899 \h </w:instrText>
+              <w:instrText xml:space="preserve"> PAGEREF _Toc236953726 \h </w:instrText>
             </w:r>
             <w:r>
               <w:rPr>
@@ -674,7 +674,7 @@
                 <w:noProof/>
                 <w:webHidden/>
               </w:rPr>
-              <w:t>5</w:t>
+              <w:t>6</w:t>
             </w:r>
             <w:r>
               <w:rPr>
@@ -696,7 +696,7 @@
               <w:noProof/>
             </w:rPr>
           </w:pPr>
-          <w:hyperlink w:anchor="_Toc236818900" w:history="1">
+          <w:hyperlink w:anchor="_Toc236953727" w:history="1">
             <w:r>
               <w:rPr>
                 <w:rStyle w:val="Hyperlink"/>
@@ -723,7 +723,7 @@
                 <w:noProof/>
                 <w:webHidden/>
               </w:rPr>
-              <w:instrText xml:space="preserve"> PAGEREF _Toc236818900 \h </w:instrText>
+              <w:instrText xml:space="preserve"> PAGEREF _Toc236953727 \h </w:instrText>
             </w:r>
             <w:r>
               <w:rPr>
@@ -743,7 +743,7 @@
                 <w:noProof/>
                 <w:webHidden/>
               </w:rPr>
-              <w:t>5</w:t>
+              <w:t>6</w:t>
             </w:r>
             <w:r>
               <w:rPr>
@@ -765,7 +765,7 @@
               <w:noProof/>
             </w:rPr>
           </w:pPr>
-          <w:hyperlink w:anchor="_Toc236818901" w:history="1">
+          <w:hyperlink w:anchor="_Toc236953728" w:history="1">
             <w:r>
               <w:rPr>
                 <w:rStyle w:val="Hyperlink"/>
@@ -792,7 +792,7 @@
                 <w:noProof/>
                 <w:webHidden/>
               </w:rPr>
-              <w:instrText xml:space="preserve"> PAGEREF _Toc236818901 \h </w:instrText>
+              <w:instrText xml:space="preserve"> PAGEREF _Toc236953728 \h </w:instrText>
             </w:r>
             <w:r>
               <w:rPr>
@@ -812,7 +812,7 @@
                 <w:noProof/>
                 <w:webHidden/>
               </w:rPr>
-              <w:t>5</w:t>
+              <w:t>6</w:t>
             </w:r>
             <w:r>
               <w:rPr>
@@ -834,7 +834,7 @@
               <w:noProof/>
             </w:rPr>
           </w:pPr>
-          <w:hyperlink w:anchor="_Toc236818902" w:history="1">
+          <w:hyperlink w:anchor="_Toc236953729" w:history="1">
             <w:r>
               <w:rPr>
                 <w:rStyle w:val="Hyperlink"/>
@@ -861,7 +861,7 @@
                 <w:noProof/>
                 <w:webHidden/>
               </w:rPr>
-              <w:instrText xml:space="preserve"> PAGEREF _Toc236818902 \h </w:instrText>
+              <w:instrText xml:space="preserve"> PAGEREF _Toc236953729 \h </w:instrText>
             </w:r>
             <w:r>
               <w:rPr>
@@ -881,7 +881,7 @@
                 <w:noProof/>
                 <w:webHidden/>
               </w:rPr>
-              <w:t>5</w:t>
+              <w:t>6</w:t>
             </w:r>
             <w:r>
               <w:rPr>
@@ -903,7 +903,7 @@
               <w:noProof/>
             </w:rPr>
           </w:pPr>
-          <w:hyperlink w:anchor="_Toc236818903" w:history="1">
+          <w:hyperlink w:anchor="_Toc236953730" w:history="1">
             <w:r>
               <w:rPr>
                 <w:rStyle w:val="Hyperlink"/>
@@ -930,7 +930,7 @@
                 <w:noProof/>
                 <w:webHidden/>
               </w:rPr>
-              <w:instrText xml:space="preserve"> PAGEREF _Toc236818903 \h </w:instrText>
+              <w:instrText xml:space="preserve"> PAGEREF _Toc236953730 \h </w:instrText>
             </w:r>
             <w:r>
               <w:rPr>
@@ -950,7 +950,835 @@
                 <w:noProof/>
                 <w:webHidden/>
               </w:rPr>
-              <w:t>5</w:t>
+              <w:t>6</w:t>
+            </w:r>
+            <w:r>
+              <w:rPr>
+                <w:noProof/>
+                <w:webHidden/>
+              </w:rPr>
+              <w:fldChar w:fldCharType="end"/>
+            </w:r>
+          </w:hyperlink>
+        </w:p>
+        <w:p>
+          <w:pPr>
+            <w:pStyle w:val="TOC2"/>
+            <w:tabs>
+              <w:tab w:val="right" w:leader="dot" w:pos="9350"/>
+            </w:tabs>
+            <w:rPr>
+              <w:rFonts w:asciiTheme="minorHAnsi" w:eastAsiaTheme="minorEastAsia" w:hAnsiTheme="minorHAnsi"/>
+              <w:noProof/>
+            </w:rPr>
+          </w:pPr>
+          <w:hyperlink w:anchor="_Toc236953731" w:history="1">
+            <w:r>
+              <w:rPr>
+                <w:rStyle w:val="Hyperlink"/>
+                <w:noProof/>
+              </w:rPr>
+              <w:t>Extensibility Code</w:t>
+            </w:r>
+            <w:r>
+              <w:rPr>
+                <w:noProof/>
+                <w:webHidden/>
+              </w:rPr>
+              <w:tab/>
+            </w:r>
+            <w:r>
+              <w:rPr>
+                <w:noProof/>
+                <w:webHidden/>
+              </w:rPr>
+              <w:fldChar w:fldCharType="begin"/>
+            </w:r>
+            <w:r>
+              <w:rPr>
+                <w:noProof/>
+                <w:webHidden/>
+              </w:rPr>
+              <w:instrText xml:space="preserve"> PAGEREF _Toc236953731 \h </w:instrText>
+            </w:r>
+            <w:r>
+              <w:rPr>
+                <w:noProof/>
+                <w:webHidden/>
+              </w:rPr>
+            </w:r>
+            <w:r>
+              <w:rPr>
+                <w:noProof/>
+                <w:webHidden/>
+              </w:rPr>
+              <w:fldChar w:fldCharType="separate"/>
+            </w:r>
+            <w:r>
+              <w:rPr>
+                <w:noProof/>
+                <w:webHidden/>
+              </w:rPr>
+              <w:t>7</w:t>
+            </w:r>
+            <w:r>
+              <w:rPr>
+                <w:noProof/>
+                <w:webHidden/>
+              </w:rPr>
+              <w:fldChar w:fldCharType="end"/>
+            </w:r>
+          </w:hyperlink>
+        </w:p>
+        <w:p>
+          <w:pPr>
+            <w:pStyle w:val="TOC3"/>
+            <w:tabs>
+              <w:tab w:val="right" w:leader="dot" w:pos="9350"/>
+            </w:tabs>
+            <w:rPr>
+              <w:rFonts w:asciiTheme="minorHAnsi" w:eastAsiaTheme="minorEastAsia" w:hAnsiTheme="minorHAnsi"/>
+              <w:noProof/>
+            </w:rPr>
+          </w:pPr>
+          <w:hyperlink w:anchor="_Toc236953732" w:history="1">
+            <w:r>
+              <w:rPr>
+                <w:rStyle w:val="Hyperlink"/>
+                <w:noProof/>
+              </w:rPr>
+              <w:t>Separation of Methods</w:t>
+            </w:r>
+            <w:r>
+              <w:rPr>
+                <w:noProof/>
+                <w:webHidden/>
+              </w:rPr>
+              <w:tab/>
+            </w:r>
+            <w:r>
+              <w:rPr>
+                <w:noProof/>
+                <w:webHidden/>
+              </w:rPr>
+              <w:fldChar w:fldCharType="begin"/>
+            </w:r>
+            <w:r>
+              <w:rPr>
+                <w:noProof/>
+                <w:webHidden/>
+              </w:rPr>
+              <w:instrText xml:space="preserve"> PAGEREF _Toc236953732 \h </w:instrText>
+            </w:r>
+            <w:r>
+              <w:rPr>
+                <w:noProof/>
+                <w:webHidden/>
+              </w:rPr>
+            </w:r>
+            <w:r>
+              <w:rPr>
+                <w:noProof/>
+                <w:webHidden/>
+              </w:rPr>
+              <w:fldChar w:fldCharType="separate"/>
+            </w:r>
+            <w:r>
+              <w:rPr>
+                <w:noProof/>
+                <w:webHidden/>
+              </w:rPr>
+              <w:t>7</w:t>
+            </w:r>
+            <w:r>
+              <w:rPr>
+                <w:noProof/>
+                <w:webHidden/>
+              </w:rPr>
+              <w:fldChar w:fldCharType="end"/>
+            </w:r>
+          </w:hyperlink>
+        </w:p>
+        <w:p>
+          <w:pPr>
+            <w:pStyle w:val="TOC3"/>
+            <w:tabs>
+              <w:tab w:val="right" w:leader="dot" w:pos="9350"/>
+            </w:tabs>
+            <w:rPr>
+              <w:rFonts w:asciiTheme="minorHAnsi" w:eastAsiaTheme="minorEastAsia" w:hAnsiTheme="minorHAnsi"/>
+              <w:noProof/>
+            </w:rPr>
+          </w:pPr>
+          <w:hyperlink w:anchor="_Toc236953733" w:history="1">
+            <w:r>
+              <w:rPr>
+                <w:rStyle w:val="Hyperlink"/>
+                <w:noProof/>
+              </w:rPr>
+              <w:t>Method Reusability</w:t>
+            </w:r>
+            <w:r>
+              <w:rPr>
+                <w:noProof/>
+                <w:webHidden/>
+              </w:rPr>
+              <w:tab/>
+            </w:r>
+            <w:r>
+              <w:rPr>
+                <w:noProof/>
+                <w:webHidden/>
+              </w:rPr>
+              <w:fldChar w:fldCharType="begin"/>
+            </w:r>
+            <w:r>
+              <w:rPr>
+                <w:noProof/>
+                <w:webHidden/>
+              </w:rPr>
+              <w:instrText xml:space="preserve"> PAGEREF _Toc236953733 \h </w:instrText>
+            </w:r>
+            <w:r>
+              <w:rPr>
+                <w:noProof/>
+                <w:webHidden/>
+              </w:rPr>
+            </w:r>
+            <w:r>
+              <w:rPr>
+                <w:noProof/>
+                <w:webHidden/>
+              </w:rPr>
+              <w:fldChar w:fldCharType="separate"/>
+            </w:r>
+            <w:r>
+              <w:rPr>
+                <w:noProof/>
+                <w:webHidden/>
+              </w:rPr>
+              <w:t>7</w:t>
+            </w:r>
+            <w:r>
+              <w:rPr>
+                <w:noProof/>
+                <w:webHidden/>
+              </w:rPr>
+              <w:fldChar w:fldCharType="end"/>
+            </w:r>
+          </w:hyperlink>
+        </w:p>
+        <w:p>
+          <w:pPr>
+            <w:pStyle w:val="TOC3"/>
+            <w:tabs>
+              <w:tab w:val="right" w:leader="dot" w:pos="9350"/>
+            </w:tabs>
+            <w:rPr>
+              <w:rFonts w:asciiTheme="minorHAnsi" w:eastAsiaTheme="minorEastAsia" w:hAnsiTheme="minorHAnsi"/>
+              <w:noProof/>
+            </w:rPr>
+          </w:pPr>
+          <w:hyperlink w:anchor="_Toc236953734" w:history="1">
+            <w:r>
+              <w:rPr>
+                <w:rStyle w:val="Hyperlink"/>
+                <w:noProof/>
+              </w:rPr>
+              <w:t>Reward Condition Class</w:t>
+            </w:r>
+            <w:r>
+              <w:rPr>
+                <w:noProof/>
+                <w:webHidden/>
+              </w:rPr>
+              <w:tab/>
+            </w:r>
+            <w:r>
+              <w:rPr>
+                <w:noProof/>
+                <w:webHidden/>
+              </w:rPr>
+              <w:fldChar w:fldCharType="begin"/>
+            </w:r>
+            <w:r>
+              <w:rPr>
+                <w:noProof/>
+                <w:webHidden/>
+              </w:rPr>
+              <w:instrText xml:space="preserve"> PAGEREF _Toc236953734 \h </w:instrText>
+            </w:r>
+            <w:r>
+              <w:rPr>
+                <w:noProof/>
+                <w:webHidden/>
+              </w:rPr>
+            </w:r>
+            <w:r>
+              <w:rPr>
+                <w:noProof/>
+                <w:webHidden/>
+              </w:rPr>
+              <w:fldChar w:fldCharType="separate"/>
+            </w:r>
+            <w:r>
+              <w:rPr>
+                <w:noProof/>
+                <w:webHidden/>
+              </w:rPr>
+              <w:t>8</w:t>
+            </w:r>
+            <w:r>
+              <w:rPr>
+                <w:noProof/>
+                <w:webHidden/>
+              </w:rPr>
+              <w:fldChar w:fldCharType="end"/>
+            </w:r>
+          </w:hyperlink>
+        </w:p>
+        <w:p>
+          <w:pPr>
+            <w:pStyle w:val="TOC3"/>
+            <w:tabs>
+              <w:tab w:val="right" w:leader="dot" w:pos="9350"/>
+            </w:tabs>
+            <w:rPr>
+              <w:rFonts w:asciiTheme="minorHAnsi" w:eastAsiaTheme="minorEastAsia" w:hAnsiTheme="minorHAnsi"/>
+              <w:noProof/>
+            </w:rPr>
+          </w:pPr>
+          <w:hyperlink w:anchor="_Toc236953735" w:history="1">
+            <w:r>
+              <w:rPr>
+                <w:rStyle w:val="Hyperlink"/>
+                <w:noProof/>
+              </w:rPr>
+              <w:t>Number of rounds</w:t>
+            </w:r>
+            <w:r>
+              <w:rPr>
+                <w:noProof/>
+                <w:webHidden/>
+              </w:rPr>
+              <w:tab/>
+            </w:r>
+            <w:r>
+              <w:rPr>
+                <w:noProof/>
+                <w:webHidden/>
+              </w:rPr>
+              <w:fldChar w:fldCharType="begin"/>
+            </w:r>
+            <w:r>
+              <w:rPr>
+                <w:noProof/>
+                <w:webHidden/>
+              </w:rPr>
+              <w:instrText xml:space="preserve"> PAGEREF _Toc236953735 \h </w:instrText>
+            </w:r>
+            <w:r>
+              <w:rPr>
+                <w:noProof/>
+                <w:webHidden/>
+              </w:rPr>
+            </w:r>
+            <w:r>
+              <w:rPr>
+                <w:noProof/>
+                <w:webHidden/>
+              </w:rPr>
+              <w:fldChar w:fldCharType="separate"/>
+            </w:r>
+            <w:r>
+              <w:rPr>
+                <w:noProof/>
+                <w:webHidden/>
+              </w:rPr>
+              <w:t>8</w:t>
+            </w:r>
+            <w:r>
+              <w:rPr>
+                <w:noProof/>
+                <w:webHidden/>
+              </w:rPr>
+              <w:fldChar w:fldCharType="end"/>
+            </w:r>
+          </w:hyperlink>
+        </w:p>
+        <w:p>
+          <w:pPr>
+            <w:pStyle w:val="TOC3"/>
+            <w:tabs>
+              <w:tab w:val="right" w:leader="dot" w:pos="9350"/>
+            </w:tabs>
+            <w:rPr>
+              <w:rFonts w:asciiTheme="minorHAnsi" w:eastAsiaTheme="minorEastAsia" w:hAnsiTheme="minorHAnsi"/>
+              <w:noProof/>
+            </w:rPr>
+          </w:pPr>
+          <w:hyperlink w:anchor="_Toc236953736" w:history="1">
+            <w:r>
+              <w:rPr>
+                <w:rStyle w:val="Hyperlink"/>
+                <w:noProof/>
+              </w:rPr>
+              <w:t>Sides of die</w:t>
+            </w:r>
+            <w:r>
+              <w:rPr>
+                <w:noProof/>
+                <w:webHidden/>
+              </w:rPr>
+              <w:tab/>
+            </w:r>
+            <w:r>
+              <w:rPr>
+                <w:noProof/>
+                <w:webHidden/>
+              </w:rPr>
+              <w:fldChar w:fldCharType="begin"/>
+            </w:r>
+            <w:r>
+              <w:rPr>
+                <w:noProof/>
+                <w:webHidden/>
+              </w:rPr>
+              <w:instrText xml:space="preserve"> PAGEREF _Toc236953736 \h </w:instrText>
+            </w:r>
+            <w:r>
+              <w:rPr>
+                <w:noProof/>
+                <w:webHidden/>
+              </w:rPr>
+            </w:r>
+            <w:r>
+              <w:rPr>
+                <w:noProof/>
+                <w:webHidden/>
+              </w:rPr>
+              <w:fldChar w:fldCharType="separate"/>
+            </w:r>
+            <w:r>
+              <w:rPr>
+                <w:noProof/>
+                <w:webHidden/>
+              </w:rPr>
+              <w:t>9</w:t>
+            </w:r>
+            <w:r>
+              <w:rPr>
+                <w:noProof/>
+                <w:webHidden/>
+              </w:rPr>
+              <w:fldChar w:fldCharType="end"/>
+            </w:r>
+          </w:hyperlink>
+        </w:p>
+        <w:p>
+          <w:pPr>
+            <w:pStyle w:val="TOC3"/>
+            <w:tabs>
+              <w:tab w:val="right" w:leader="dot" w:pos="9350"/>
+            </w:tabs>
+            <w:rPr>
+              <w:rFonts w:asciiTheme="minorHAnsi" w:eastAsiaTheme="minorEastAsia" w:hAnsiTheme="minorHAnsi"/>
+              <w:noProof/>
+            </w:rPr>
+          </w:pPr>
+          <w:hyperlink w:anchor="_Toc236953737" w:history="1">
+            <w:r>
+              <w:rPr>
+                <w:rStyle w:val="Hyperlink"/>
+                <w:noProof/>
+              </w:rPr>
+              <w:t>Number of dice</w:t>
+            </w:r>
+            <w:r>
+              <w:rPr>
+                <w:noProof/>
+                <w:webHidden/>
+              </w:rPr>
+              <w:tab/>
+            </w:r>
+            <w:r>
+              <w:rPr>
+                <w:noProof/>
+                <w:webHidden/>
+              </w:rPr>
+              <w:fldChar w:fldCharType="begin"/>
+            </w:r>
+            <w:r>
+              <w:rPr>
+                <w:noProof/>
+                <w:webHidden/>
+              </w:rPr>
+              <w:instrText xml:space="preserve"> PAGEREF _Toc236953737 \h </w:instrText>
+            </w:r>
+            <w:r>
+              <w:rPr>
+                <w:noProof/>
+                <w:webHidden/>
+              </w:rPr>
+            </w:r>
+            <w:r>
+              <w:rPr>
+                <w:noProof/>
+                <w:webHidden/>
+              </w:rPr>
+              <w:fldChar w:fldCharType="separate"/>
+            </w:r>
+            <w:r>
+              <w:rPr>
+                <w:noProof/>
+                <w:webHidden/>
+              </w:rPr>
+              <w:t>10</w:t>
+            </w:r>
+            <w:r>
+              <w:rPr>
+                <w:noProof/>
+                <w:webHidden/>
+              </w:rPr>
+              <w:fldChar w:fldCharType="end"/>
+            </w:r>
+          </w:hyperlink>
+        </w:p>
+        <w:p>
+          <w:pPr>
+            <w:pStyle w:val="TOC2"/>
+            <w:tabs>
+              <w:tab w:val="right" w:leader="dot" w:pos="9350"/>
+            </w:tabs>
+            <w:rPr>
+              <w:rFonts w:asciiTheme="minorHAnsi" w:eastAsiaTheme="minorEastAsia" w:hAnsiTheme="minorHAnsi"/>
+              <w:noProof/>
+            </w:rPr>
+          </w:pPr>
+          <w:hyperlink w:anchor="_Toc236953738" w:history="1">
+            <w:r>
+              <w:rPr>
+                <w:rStyle w:val="Hyperlink"/>
+                <w:noProof/>
+              </w:rPr>
+              <w:t>Advanced Features</w:t>
+            </w:r>
+            <w:r>
+              <w:rPr>
+                <w:noProof/>
+                <w:webHidden/>
+              </w:rPr>
+              <w:tab/>
+            </w:r>
+            <w:r>
+              <w:rPr>
+                <w:noProof/>
+                <w:webHidden/>
+              </w:rPr>
+              <w:fldChar w:fldCharType="begin"/>
+            </w:r>
+            <w:r>
+              <w:rPr>
+                <w:noProof/>
+                <w:webHidden/>
+              </w:rPr>
+              <w:instrText xml:space="preserve"> PAGEREF _Toc236953738 \h </w:instrText>
+            </w:r>
+            <w:r>
+              <w:rPr>
+                <w:noProof/>
+                <w:webHidden/>
+              </w:rPr>
+            </w:r>
+            <w:r>
+              <w:rPr>
+                <w:noProof/>
+                <w:webHidden/>
+              </w:rPr>
+              <w:fldChar w:fldCharType="separate"/>
+            </w:r>
+            <w:r>
+              <w:rPr>
+                <w:noProof/>
+                <w:webHidden/>
+              </w:rPr>
+              <w:t>12</w:t>
+            </w:r>
+            <w:r>
+              <w:rPr>
+                <w:noProof/>
+                <w:webHidden/>
+              </w:rPr>
+              <w:fldChar w:fldCharType="end"/>
+            </w:r>
+          </w:hyperlink>
+        </w:p>
+        <w:p>
+          <w:pPr>
+            <w:pStyle w:val="TOC3"/>
+            <w:tabs>
+              <w:tab w:val="right" w:leader="dot" w:pos="9350"/>
+            </w:tabs>
+            <w:rPr>
+              <w:rFonts w:asciiTheme="minorHAnsi" w:eastAsiaTheme="minorEastAsia" w:hAnsiTheme="minorHAnsi"/>
+              <w:noProof/>
+            </w:rPr>
+          </w:pPr>
+          <w:hyperlink w:anchor="_Toc236953739" w:history="1">
+            <w:r>
+              <w:rPr>
+                <w:rStyle w:val="Hyperlink"/>
+                <w:noProof/>
+              </w:rPr>
+              <w:t>Variable bet amount</w:t>
+            </w:r>
+            <w:r>
+              <w:rPr>
+                <w:noProof/>
+                <w:webHidden/>
+              </w:rPr>
+              <w:tab/>
+            </w:r>
+            <w:r>
+              <w:rPr>
+                <w:noProof/>
+                <w:webHidden/>
+              </w:rPr>
+              <w:fldChar w:fldCharType="begin"/>
+            </w:r>
+            <w:r>
+              <w:rPr>
+                <w:noProof/>
+                <w:webHidden/>
+              </w:rPr>
+              <w:instrText xml:space="preserve"> PAGEREF _Toc236953739 \h </w:instrText>
+            </w:r>
+            <w:r>
+              <w:rPr>
+                <w:noProof/>
+                <w:webHidden/>
+              </w:rPr>
+            </w:r>
+            <w:r>
+              <w:rPr>
+                <w:noProof/>
+                <w:webHidden/>
+              </w:rPr>
+              <w:fldChar w:fldCharType="separate"/>
+            </w:r>
+            <w:r>
+              <w:rPr>
+                <w:noProof/>
+                <w:webHidden/>
+              </w:rPr>
+              <w:t>12</w:t>
+            </w:r>
+            <w:r>
+              <w:rPr>
+                <w:noProof/>
+                <w:webHidden/>
+              </w:rPr>
+              <w:fldChar w:fldCharType="end"/>
+            </w:r>
+          </w:hyperlink>
+        </w:p>
+        <w:p>
+          <w:pPr>
+            <w:pStyle w:val="TOC3"/>
+            <w:tabs>
+              <w:tab w:val="right" w:leader="dot" w:pos="9350"/>
+            </w:tabs>
+            <w:rPr>
+              <w:rFonts w:asciiTheme="minorHAnsi" w:eastAsiaTheme="minorEastAsia" w:hAnsiTheme="minorHAnsi"/>
+              <w:noProof/>
+            </w:rPr>
+          </w:pPr>
+          <w:hyperlink w:anchor="_Toc236953740" w:history="1">
+            <w:r>
+              <w:rPr>
+                <w:rStyle w:val="Hyperlink"/>
+                <w:noProof/>
+              </w:rPr>
+              <w:t>High Score Table</w:t>
+            </w:r>
+            <w:r>
+              <w:rPr>
+                <w:noProof/>
+                <w:webHidden/>
+              </w:rPr>
+              <w:tab/>
+            </w:r>
+            <w:r>
+              <w:rPr>
+                <w:noProof/>
+                <w:webHidden/>
+              </w:rPr>
+              <w:fldChar w:fldCharType="begin"/>
+            </w:r>
+            <w:r>
+              <w:rPr>
+                <w:noProof/>
+                <w:webHidden/>
+              </w:rPr>
+              <w:instrText xml:space="preserve"> PAGEREF _Toc236953740 \h </w:instrText>
+            </w:r>
+            <w:r>
+              <w:rPr>
+                <w:noProof/>
+                <w:webHidden/>
+              </w:rPr>
+            </w:r>
+            <w:r>
+              <w:rPr>
+                <w:noProof/>
+                <w:webHidden/>
+              </w:rPr>
+              <w:fldChar w:fldCharType="separate"/>
+            </w:r>
+            <w:r>
+              <w:rPr>
+                <w:noProof/>
+                <w:webHidden/>
+              </w:rPr>
+              <w:t>13</w:t>
+            </w:r>
+            <w:r>
+              <w:rPr>
+                <w:noProof/>
+                <w:webHidden/>
+              </w:rPr>
+              <w:fldChar w:fldCharType="end"/>
+            </w:r>
+          </w:hyperlink>
+        </w:p>
+        <w:p>
+          <w:pPr>
+            <w:pStyle w:val="TOC2"/>
+            <w:tabs>
+              <w:tab w:val="right" w:leader="dot" w:pos="9350"/>
+            </w:tabs>
+            <w:rPr>
+              <w:rFonts w:asciiTheme="minorHAnsi" w:eastAsiaTheme="minorEastAsia" w:hAnsiTheme="minorHAnsi"/>
+              <w:noProof/>
+            </w:rPr>
+          </w:pPr>
+          <w:hyperlink w:anchor="_Toc236953741" w:history="1">
+            <w:r>
+              <w:rPr>
+                <w:rStyle w:val="Hyperlink"/>
+                <w:noProof/>
+              </w:rPr>
+              <w:t>Additional Features</w:t>
+            </w:r>
+            <w:r>
+              <w:rPr>
+                <w:noProof/>
+                <w:webHidden/>
+              </w:rPr>
+              <w:tab/>
+            </w:r>
+            <w:r>
+              <w:rPr>
+                <w:noProof/>
+                <w:webHidden/>
+              </w:rPr>
+              <w:fldChar w:fldCharType="begin"/>
+            </w:r>
+            <w:r>
+              <w:rPr>
+                <w:noProof/>
+                <w:webHidden/>
+              </w:rPr>
+              <w:instrText xml:space="preserve"> PAGEREF _Toc236953741 \h </w:instrText>
+            </w:r>
+            <w:r>
+              <w:rPr>
+                <w:noProof/>
+                <w:webHidden/>
+              </w:rPr>
+            </w:r>
+            <w:r>
+              <w:rPr>
+                <w:noProof/>
+                <w:webHidden/>
+              </w:rPr>
+              <w:fldChar w:fldCharType="separate"/>
+            </w:r>
+            <w:r>
+              <w:rPr>
+                <w:noProof/>
+                <w:webHidden/>
+              </w:rPr>
+              <w:t>14</w:t>
+            </w:r>
+            <w:r>
+              <w:rPr>
+                <w:noProof/>
+                <w:webHidden/>
+              </w:rPr>
+              <w:fldChar w:fldCharType="end"/>
+            </w:r>
+          </w:hyperlink>
+        </w:p>
+        <w:p>
+          <w:pPr>
+            <w:pStyle w:val="TOC3"/>
+            <w:tabs>
+              <w:tab w:val="right" w:leader="dot" w:pos="9350"/>
+            </w:tabs>
+            <w:rPr>
+              <w:rFonts w:asciiTheme="minorHAnsi" w:eastAsiaTheme="minorEastAsia" w:hAnsiTheme="minorHAnsi"/>
+              <w:noProof/>
+            </w:rPr>
+          </w:pPr>
+          <w:hyperlink w:anchor="_Toc236953742" w:history="1">
+            <w:r>
+              <w:rPr>
+                <w:rStyle w:val="Hyperlink"/>
+                <w:noProof/>
+              </w:rPr>
+              <w:t>Currency Changer</w:t>
+            </w:r>
+            <w:r>
+              <w:rPr>
+                <w:noProof/>
+                <w:webHidden/>
+              </w:rPr>
+              <w:tab/>
+            </w:r>
+            <w:r>
+              <w:rPr>
+                <w:noProof/>
+                <w:webHidden/>
+              </w:rPr>
+              <w:fldChar w:fldCharType="begin"/>
+            </w:r>
+            <w:r>
+              <w:rPr>
+                <w:noProof/>
+                <w:webHidden/>
+              </w:rPr>
+              <w:instrText xml:space="preserve"> PAGEREF _Toc236953742 \h </w:instrText>
+            </w:r>
+            <w:r>
+              <w:rPr>
+                <w:noProof/>
+                <w:webHidden/>
+              </w:rPr>
+            </w:r>
+            <w:r>
+              <w:rPr>
+                <w:noProof/>
+                <w:webHidden/>
+              </w:rPr>
+              <w:fldChar w:fldCharType="separate"/>
+            </w:r>
+            <w:r>
+              <w:rPr>
+                <w:noProof/>
+                <w:webHidden/>
+              </w:rPr>
+              <w:t>14</w:t>
             </w:r>
             <w:r>
               <w:rPr>
@@ -968,6 +1796,7 @@
               <w:bCs/>
               <w:noProof/>
             </w:rPr>
+            <w:lastRenderedPageBreak/>
             <w:fldChar w:fldCharType="end"/>
           </w:r>
         </w:p>
@@ -982,7 +1811,7 @@
       <w:pPr>
         <w:pStyle w:val="Heading1"/>
       </w:pPr>
-      <w:bookmarkStart w:id="0" w:name="_Toc236818892"/>
+      <w:bookmarkStart w:id="0" w:name="_Toc236953719"/>
       <w:r>
         <w:lastRenderedPageBreak/>
         <w:t>Dice Game Program</w:t>
@@ -993,7 +1822,7 @@
       <w:pPr>
         <w:pStyle w:val="Heading2"/>
       </w:pPr>
-      <w:bookmarkStart w:id="1" w:name="_Toc236818893"/>
+      <w:bookmarkStart w:id="1" w:name="_Toc236953720"/>
       <w:r>
         <w:t>Program introduction</w:t>
       </w:r>
@@ -1029,7 +1858,7 @@
       <w:pPr>
         <w:pStyle w:val="Heading2"/>
       </w:pPr>
-      <w:bookmarkStart w:id="2" w:name="_Toc236818894"/>
+      <w:bookmarkStart w:id="2" w:name="_Toc236953721"/>
       <w:r>
         <w:t>Class Diagram</w:t>
       </w:r>
@@ -1117,15 +1946,7 @@
     </w:p>
     <w:p>
       <w:r>
-        <w:t xml:space="preserve">Each class in the diagram has their own purpose and every class </w:t>
-      </w:r>
-      <w:proofErr w:type="gramStart"/>
-      <w:r>
-        <w:t>call</w:t>
-      </w:r>
-      <w:proofErr w:type="gramEnd"/>
-      <w:r>
-        <w:t xml:space="preserve"> other classes for code reusability. The purpose of each class is –</w:t>
+        <w:t>Each class in the diagram has their own purpose and every class call other classes for code reusability. The purpose of each class is –</w:t>
       </w:r>
     </w:p>
     <w:p>
@@ -1282,7 +2103,7 @@
       <w:pPr>
         <w:pStyle w:val="Heading2"/>
       </w:pPr>
-      <w:bookmarkStart w:id="3" w:name="_Toc236818895"/>
+      <w:bookmarkStart w:id="3" w:name="_Toc236953722"/>
       <w:r>
         <w:lastRenderedPageBreak/>
         <w:t>Class Descriptor</w:t>
@@ -1305,7 +2126,7 @@
       <w:pPr>
         <w:pStyle w:val="Heading3"/>
       </w:pPr>
-      <w:bookmarkStart w:id="4" w:name="_Toc236818896"/>
+      <w:bookmarkStart w:id="4" w:name="_Toc236953723"/>
       <w:r>
         <w:t>Main Class</w:t>
       </w:r>
@@ -1321,7 +2142,7 @@
       <w:pPr>
         <w:pStyle w:val="Heading3"/>
       </w:pPr>
-      <w:bookmarkStart w:id="5" w:name="_Toc236818897"/>
+      <w:bookmarkStart w:id="5" w:name="_Toc236953724"/>
       <w:r>
         <w:t>Dice Game Class</w:t>
       </w:r>
@@ -1339,7 +2160,7 @@
       <w:pPr>
         <w:pStyle w:val="Heading3"/>
       </w:pPr>
-      <w:bookmarkStart w:id="6" w:name="_Toc236818898"/>
+      <w:bookmarkStart w:id="6" w:name="_Toc236953725"/>
       <w:r>
         <w:t>Betting</w:t>
       </w:r>
@@ -1506,7 +2327,7 @@
       <w:pPr>
         <w:pStyle w:val="Heading3"/>
       </w:pPr>
-      <w:bookmarkStart w:id="7" w:name="_Toc236818899"/>
+      <w:bookmarkStart w:id="7" w:name="_Toc236953726"/>
       <w:r>
         <w:lastRenderedPageBreak/>
         <w:t>Dice Rolling Class</w:t>
@@ -1531,7 +2352,7 @@
       <w:pPr>
         <w:pStyle w:val="Heading3"/>
       </w:pPr>
-      <w:bookmarkStart w:id="8" w:name="_Toc236818900"/>
+      <w:bookmarkStart w:id="8" w:name="_Toc236953727"/>
       <w:r>
         <w:t>Reward Conditions</w:t>
       </w:r>
@@ -1561,7 +2382,7 @@
       <w:pPr>
         <w:pStyle w:val="Heading3"/>
       </w:pPr>
-      <w:bookmarkStart w:id="9" w:name="_Toc236818901"/>
+      <w:bookmarkStart w:id="9" w:name="_Toc236953728"/>
       <w:r>
         <w:t>Round Recorder</w:t>
       </w:r>
@@ -1612,7 +2433,7 @@
       <w:pPr>
         <w:pStyle w:val="Heading3"/>
       </w:pPr>
-      <w:bookmarkStart w:id="10" w:name="_Toc236818902"/>
+      <w:bookmarkStart w:id="10" w:name="_Toc236953729"/>
       <w:r>
         <w:t>Scoreboard Class</w:t>
       </w:r>
@@ -1638,22 +2459,14 @@
         <w:t xml:space="preserve"> and bank balance to place a ranking of user among dummy players. </w:t>
       </w:r>
       <w:r>
-        <w:t xml:space="preserve">This method mainly uses simple </w:t>
-      </w:r>
-      <w:proofErr w:type="spellStart"/>
-      <w:r>
-        <w:t>Arrays.sort</w:t>
-      </w:r>
-      <w:proofErr w:type="spellEnd"/>
-      <w:r>
-        <w:t>() to tackle the ranking problem.</w:t>
+        <w:t>This method mainly uses simple Arrays.sort() to tackle the ranking problem.</w:t>
       </w:r>
     </w:p>
     <w:p>
       <w:pPr>
         <w:pStyle w:val="Heading3"/>
       </w:pPr>
-      <w:bookmarkStart w:id="11" w:name="_Toc236818903"/>
+      <w:bookmarkStart w:id="11" w:name="_Toc236953730"/>
       <w:r>
         <w:t xml:space="preserve">Result </w:t>
       </w:r>
@@ -1686,10 +2499,12 @@
       <w:pPr>
         <w:pStyle w:val="Heading2"/>
       </w:pPr>
+      <w:bookmarkStart w:id="12" w:name="_Toc236953731"/>
       <w:r>
         <w:lastRenderedPageBreak/>
         <w:t>Extensibility Code</w:t>
       </w:r>
+      <w:bookmarkEnd w:id="12"/>
     </w:p>
     <w:p>
       <w:r>
@@ -1718,9 +2533,11 @@
       <w:pPr>
         <w:pStyle w:val="Heading3"/>
       </w:pPr>
+      <w:bookmarkStart w:id="13" w:name="_Toc236953732"/>
       <w:r>
         <w:t>Separation of Methods</w:t>
       </w:r>
+      <w:bookmarkEnd w:id="13"/>
     </w:p>
     <w:p>
       <w:r>
@@ -1744,9 +2561,11 @@
       <w:pPr>
         <w:pStyle w:val="Heading3"/>
       </w:pPr>
+      <w:bookmarkStart w:id="14" w:name="_Toc236953733"/>
       <w:r>
         <w:t>Method Reusability</w:t>
       </w:r>
+      <w:bookmarkEnd w:id="14"/>
     </w:p>
     <w:p>
       <w:r>
@@ -1795,13 +2614,8 @@
           <w:numId w:val="15"/>
         </w:numPr>
       </w:pPr>
-      <w:proofErr w:type="spellStart"/>
-      <w:r>
-        <w:t>ResultBoard.recordRound</w:t>
-      </w:r>
-      <w:proofErr w:type="spellEnd"/>
-      <w:r>
-        <w:t>()</w:t>
+      <w:r>
+        <w:t>ResultBoard.recordRound()</w:t>
       </w:r>
     </w:p>
     <w:p>
@@ -1812,13 +2626,8 @@
           <w:numId w:val="15"/>
         </w:numPr>
       </w:pPr>
-      <w:proofErr w:type="spellStart"/>
-      <w:r>
-        <w:t>ScoreBoard.board</w:t>
-      </w:r>
-      <w:proofErr w:type="spellEnd"/>
-      <w:r>
-        <w:t>()</w:t>
+      <w:r>
+        <w:t>ScoreBoard.board()</w:t>
       </w:r>
     </w:p>
     <w:p>
@@ -1829,26 +2638,13 @@
           <w:numId w:val="15"/>
         </w:numPr>
       </w:pPr>
-      <w:proofErr w:type="spellStart"/>
-      <w:r>
-        <w:t>RoundRecorder.recordRound</w:t>
-      </w:r>
-      <w:proofErr w:type="spellEnd"/>
-      <w:r>
-        <w:t>()</w:t>
-      </w:r>
-    </w:p>
-    <w:p>
-      <w:r>
-        <w:t xml:space="preserve">Apart from these mainly reusables, other methods from some classes, such as </w:t>
-      </w:r>
-      <w:proofErr w:type="spellStart"/>
-      <w:r>
-        <w:t>RewardCondition.applyPayout</w:t>
-      </w:r>
-      <w:proofErr w:type="spellEnd"/>
-      <w:r>
-        <w:t xml:space="preserve">(), </w:t>
+      <w:r>
+        <w:t>RoundRecorder.recordRound()</w:t>
+      </w:r>
+    </w:p>
+    <w:p>
+      <w:r>
+        <w:t xml:space="preserve">Apart from these mainly reusables, other methods from some classes, such as RewardCondition.applyPayout(), </w:t>
       </w:r>
       <w:r>
         <w:t>are</w:t>
@@ -1862,10 +2658,12 @@
       <w:pPr>
         <w:pStyle w:val="Heading3"/>
       </w:pPr>
+      <w:bookmarkStart w:id="15" w:name="_Toc236953734"/>
       <w:r>
         <w:lastRenderedPageBreak/>
         <w:t>Reward Condition Class</w:t>
       </w:r>
+      <w:bookmarkEnd w:id="15"/>
     </w:p>
     <w:p>
       <w:r>
@@ -1877,9 +2675,11 @@
       <w:pPr>
         <w:pStyle w:val="Heading3"/>
       </w:pPr>
+      <w:bookmarkStart w:id="16" w:name="_Toc236953735"/>
       <w:r>
         <w:t>Number of rounds</w:t>
       </w:r>
+      <w:bookmarkEnd w:id="16"/>
     </w:p>
     <w:p>
       <w:r>
@@ -1895,15 +2695,7 @@
         <w:t>rounds</w:t>
       </w:r>
       <w:r>
-        <w:t xml:space="preserve"> </w:t>
-      </w:r>
-      <w:proofErr w:type="gramStart"/>
-      <w:r>
-        <w:t>are</w:t>
-      </w:r>
-      <w:proofErr w:type="gramEnd"/>
-      <w:r>
-        <w:t xml:space="preserve"> passed into the betting program as a parameter so that when there is a need to modify the number of rounds, users can simply modify the variable parameter in the wrapper class dice game</w:t>
+        <w:t xml:space="preserve"> are passed into the betting program as a parameter so that when there is a need to modify the number of rounds, users can simply modify the variable parameter in the wrapper class dice game</w:t>
       </w:r>
       <w:r>
         <w:t xml:space="preserve"> and pass it into betting program.</w:t>
@@ -2054,22 +2846,16 @@
       <w:pPr>
         <w:pStyle w:val="Heading3"/>
       </w:pPr>
+      <w:bookmarkStart w:id="17" w:name="_Toc236953736"/>
       <w:r>
         <w:t>Sides of die</w:t>
       </w:r>
+      <w:bookmarkEnd w:id="17"/>
     </w:p>
     <w:p>
       <w:r>
         <w:tab/>
-        <w:t xml:space="preserve">In the </w:t>
-      </w:r>
-      <w:proofErr w:type="spellStart"/>
-      <w:r>
-        <w:t>diceRolling.diceprogram</w:t>
-      </w:r>
-      <w:proofErr w:type="spellEnd"/>
-      <w:r>
-        <w:t>(), the number of the die faces are not hard coded and is assigned to a variable. What problem does this solve? This gets rid of the hard coding, where if there is a need to change die face, it is possible to modify a single variable rather than changing 6 in every line of code.</w:t>
+        <w:t>In the diceRolling.diceprogram(), the number of the die faces are not hard coded and is assigned to a variable. What problem does this solve? This gets rid of the hard coding, where if there is a need to change die face, it is possible to modify a single variable rather than changing 6 in every line of code.</w:t>
       </w:r>
     </w:p>
     <w:p>
@@ -2152,9 +2938,11 @@
       <w:pPr>
         <w:pStyle w:val="Heading3"/>
       </w:pPr>
+      <w:bookmarkStart w:id="18" w:name="_Toc236953737"/>
       <w:r>
         <w:t>Number of dice</w:t>
       </w:r>
+      <w:bookmarkEnd w:id="18"/>
     </w:p>
     <w:p>
       <w:r>
@@ -2342,10 +3130,12 @@
       <w:pPr>
         <w:pStyle w:val="Heading2"/>
       </w:pPr>
+      <w:bookmarkStart w:id="19" w:name="_Toc236953738"/>
       <w:r>
         <w:lastRenderedPageBreak/>
         <w:t>Advanced Features</w:t>
       </w:r>
+      <w:bookmarkEnd w:id="19"/>
     </w:p>
     <w:p>
       <w:r>
@@ -2383,9 +3173,11 @@
       <w:pPr>
         <w:pStyle w:val="Heading3"/>
       </w:pPr>
+      <w:bookmarkStart w:id="20" w:name="_Toc236953739"/>
       <w:r>
         <w:t>Variable bet amount</w:t>
       </w:r>
+      <w:bookmarkEnd w:id="20"/>
     </w:p>
     <w:p>
       <w:r>
@@ -2397,8 +3189,311 @@
     </w:p>
     <w:p>
       <w:pPr>
+        <w:keepNext/>
         <w:jc w:val="center"/>
       </w:pPr>
+      <w:r>
+        <w:rPr>
+          <w:noProof/>
+        </w:rPr>
+        <w:drawing>
+          <wp:inline distT="0" distB="0" distL="0" distR="0" wp14:anchorId="258EB0E1" wp14:editId="176BD905">
+            <wp:extent cx="5943600" cy="3067050"/>
+            <wp:effectExtent l="19050" t="19050" r="19050" b="19050"/>
+            <wp:docPr id="2079261918" name="Picture 1"/>
+            <wp:cNvGraphicFramePr>
+              <a:graphicFrameLocks xmlns:a="http://schemas.openxmlformats.org/drawingml/2006/main" noChangeAspect="1"/>
+            </wp:cNvGraphicFramePr>
+            <a:graphic xmlns:a="http://schemas.openxmlformats.org/drawingml/2006/main">
+              <a:graphicData uri="http://schemas.openxmlformats.org/drawingml/2006/picture">
+                <pic:pic xmlns:pic="http://schemas.openxmlformats.org/drawingml/2006/picture">
+                  <pic:nvPicPr>
+                    <pic:cNvPr id="2079261918" name=""/>
+                    <pic:cNvPicPr/>
+                  </pic:nvPicPr>
+                  <pic:blipFill>
+                    <a:blip r:embed="rId14"/>
+                    <a:stretch>
+                      <a:fillRect/>
+                    </a:stretch>
+                  </pic:blipFill>
+                  <pic:spPr>
+                    <a:xfrm>
+                      <a:off x="0" y="0"/>
+                      <a:ext cx="5943600" cy="3067050"/>
+                    </a:xfrm>
+                    <a:prstGeom prst="rect">
+                      <a:avLst/>
+                    </a:prstGeom>
+                    <a:ln>
+                      <a:solidFill>
+                        <a:schemeClr val="tx1"/>
+                      </a:solidFill>
+                    </a:ln>
+                  </pic:spPr>
+                </pic:pic>
+              </a:graphicData>
+            </a:graphic>
+          </wp:inline>
+        </w:drawing>
+      </w:r>
+    </w:p>
+    <w:p>
+      <w:pPr>
+        <w:jc w:val="center"/>
+      </w:pPr>
+      <w:r>
+        <w:t xml:space="preserve">Figure </w:t>
+      </w:r>
+      <w:fldSimple w:instr=" SEQ Figure \* ARABIC ">
+        <w:r>
+          <w:rPr>
+            <w:noProof/>
+          </w:rPr>
+          <w:t>7</w:t>
+        </w:r>
+      </w:fldSimple>
+      <w:r>
+        <w:t xml:space="preserve"> Variable bet amount</w:t>
+      </w:r>
+    </w:p>
+    <w:p>
+      <w:r>
+        <w:t>The code block above is the bet amount input function, where the users are required to enter a valid number between the specified bet amount and the system exit to exit the system, if the user chooses to cancel the game.</w:t>
+      </w:r>
+    </w:p>
+    <w:p/>
+    <w:p/>
+    <w:p>
+      <w:pPr>
+        <w:pStyle w:val="Heading3"/>
+      </w:pPr>
+      <w:bookmarkStart w:id="21" w:name="_Toc236953740"/>
+      <w:r>
+        <w:lastRenderedPageBreak/>
+        <w:t>High Score Table</w:t>
+      </w:r>
+      <w:bookmarkEnd w:id="21"/>
+    </w:p>
+    <w:p>
+      <w:r>
+        <w:tab/>
+      </w:r>
+      <w:r>
+        <w:t xml:space="preserve">The high score table is the second advanced feature that shows the ranking of the user based on their bank balance after the game had finished. This was completed using high score class, which </w:t>
+      </w:r>
+      <w:r>
+        <w:t>includes</w:t>
+      </w:r>
+      <w:r>
+        <w:t xml:space="preserve"> a list to store static dummy users and the variable username and final bank balance of the user.</w:t>
+      </w:r>
+      <w:r>
+        <w:t xml:space="preserve"> First, after the game is over, the username and bank balance is added into the list, and the list is sorted using </w:t>
+      </w:r>
+      <w:r>
+        <w:t>Arrays.sort</w:t>
+      </w:r>
+      <w:r>
+        <w:t xml:space="preserve">(). After the array is sorted, ranking numbers are added in </w:t>
+      </w:r>
+      <w:r>
+        <w:t>order,</w:t>
+      </w:r>
+      <w:r>
+        <w:t xml:space="preserve"> and the results are shown in a table.</w:t>
+      </w:r>
+      <w:r>
+        <w:t xml:space="preserve"> The user will be ranked according to their bank balance and the higher their balance is compared to the dummy players, the higher their position in the table will be.</w:t>
+      </w:r>
+    </w:p>
+    <w:p>
+      <w:pPr>
+        <w:keepNext/>
+        <w:jc w:val="center"/>
+      </w:pPr>
+      <w:r>
+        <w:rPr>
+          <w:noProof/>
+        </w:rPr>
+        <w:drawing>
+          <wp:inline distT="0" distB="0" distL="0" distR="0" wp14:anchorId="0B158AA9" wp14:editId="1FAB13EA">
+            <wp:extent cx="5782576" cy="4629150"/>
+            <wp:effectExtent l="19050" t="19050" r="27940" b="19050"/>
+            <wp:docPr id="586276116" name="Picture 1"/>
+            <wp:cNvGraphicFramePr>
+              <a:graphicFrameLocks xmlns:a="http://schemas.openxmlformats.org/drawingml/2006/main" noChangeAspect="1"/>
+            </wp:cNvGraphicFramePr>
+            <a:graphic xmlns:a="http://schemas.openxmlformats.org/drawingml/2006/main">
+              <a:graphicData uri="http://schemas.openxmlformats.org/drawingml/2006/picture">
+                <pic:pic xmlns:pic="http://schemas.openxmlformats.org/drawingml/2006/picture">
+                  <pic:nvPicPr>
+                    <pic:cNvPr id="586276116" name=""/>
+                    <pic:cNvPicPr/>
+                  </pic:nvPicPr>
+                  <pic:blipFill>
+                    <a:blip r:embed="rId15"/>
+                    <a:stretch>
+                      <a:fillRect/>
+                    </a:stretch>
+                  </pic:blipFill>
+                  <pic:spPr>
+                    <a:xfrm>
+                      <a:off x="0" y="0"/>
+                      <a:ext cx="5792692" cy="4637249"/>
+                    </a:xfrm>
+                    <a:prstGeom prst="rect">
+                      <a:avLst/>
+                    </a:prstGeom>
+                    <a:ln>
+                      <a:solidFill>
+                        <a:schemeClr val="tx1"/>
+                      </a:solidFill>
+                    </a:ln>
+                  </pic:spPr>
+                </pic:pic>
+              </a:graphicData>
+            </a:graphic>
+          </wp:inline>
+        </w:drawing>
+      </w:r>
+    </w:p>
+    <w:p>
+      <w:pPr>
+        <w:jc w:val="center"/>
+      </w:pPr>
+      <w:r>
+        <w:t xml:space="preserve">Figure </w:t>
+      </w:r>
+      <w:fldSimple w:instr=" SEQ Figure \* ARABIC ">
+        <w:r>
+          <w:rPr>
+            <w:noProof/>
+          </w:rPr>
+          <w:t>8</w:t>
+        </w:r>
+      </w:fldSimple>
+      <w:r>
+        <w:t xml:space="preserve"> Code block for high score table</w:t>
+      </w:r>
+    </w:p>
+    <w:p>
+      <w:pPr>
+        <w:keepNext/>
+        <w:jc w:val="center"/>
+      </w:pPr>
+      <w:r>
+        <w:rPr>
+          <w:noProof/>
+        </w:rPr>
+        <w:lastRenderedPageBreak/>
+        <w:drawing>
+          <wp:inline distT="0" distB="0" distL="0" distR="0" wp14:anchorId="5268DA69" wp14:editId="74946DF0">
+            <wp:extent cx="3334270" cy="4495800"/>
+            <wp:effectExtent l="19050" t="19050" r="19050" b="19050"/>
+            <wp:docPr id="807623443" name="Picture 1"/>
+            <wp:cNvGraphicFramePr>
+              <a:graphicFrameLocks xmlns:a="http://schemas.openxmlformats.org/drawingml/2006/main" noChangeAspect="1"/>
+            </wp:cNvGraphicFramePr>
+            <a:graphic xmlns:a="http://schemas.openxmlformats.org/drawingml/2006/main">
+              <a:graphicData uri="http://schemas.openxmlformats.org/drawingml/2006/picture">
+                <pic:pic xmlns:pic="http://schemas.openxmlformats.org/drawingml/2006/picture">
+                  <pic:nvPicPr>
+                    <pic:cNvPr id="807623443" name=""/>
+                    <pic:cNvPicPr/>
+                  </pic:nvPicPr>
+                  <pic:blipFill>
+                    <a:blip r:embed="rId16"/>
+                    <a:stretch>
+                      <a:fillRect/>
+                    </a:stretch>
+                  </pic:blipFill>
+                  <pic:spPr>
+                    <a:xfrm>
+                      <a:off x="0" y="0"/>
+                      <a:ext cx="3337847" cy="4500622"/>
+                    </a:xfrm>
+                    <a:prstGeom prst="rect">
+                      <a:avLst/>
+                    </a:prstGeom>
+                    <a:ln>
+                      <a:solidFill>
+                        <a:schemeClr val="tx1"/>
+                      </a:solidFill>
+                    </a:ln>
+                  </pic:spPr>
+                </pic:pic>
+              </a:graphicData>
+            </a:graphic>
+          </wp:inline>
+        </w:drawing>
+      </w:r>
+    </w:p>
+    <w:p>
+      <w:pPr>
+        <w:jc w:val="center"/>
+      </w:pPr>
+      <w:r>
+        <w:t xml:space="preserve">Figure </w:t>
+      </w:r>
+      <w:fldSimple w:instr=" SEQ Figure \* ARABIC ">
+        <w:r>
+          <w:rPr>
+            <w:noProof/>
+          </w:rPr>
+          <w:t>9</w:t>
+        </w:r>
+      </w:fldSimple>
+      <w:r>
+        <w:t xml:space="preserve"> Score board result</w:t>
+      </w:r>
+    </w:p>
+    <w:p>
+      <w:pPr>
+        <w:pStyle w:val="Heading2"/>
+      </w:pPr>
+      <w:bookmarkStart w:id="22" w:name="_Toc236953741"/>
+      <w:r>
+        <w:t>Additional Features</w:t>
+      </w:r>
+      <w:bookmarkEnd w:id="22"/>
+    </w:p>
+    <w:p>
+      <w:r>
+        <w:tab/>
+        <w:t xml:space="preserve">This section is the additional features for the program to be better prepared for deployment. The add-on features </w:t>
+      </w:r>
+      <w:r>
+        <w:t>include</w:t>
+      </w:r>
+      <w:r>
+        <w:t xml:space="preserve"> – currency changer, </w:t>
+      </w:r>
+      <w:r>
+        <w:t>dice fight (player vs computer).</w:t>
+      </w:r>
+    </w:p>
+    <w:p>
+      <w:pPr>
+        <w:pStyle w:val="Heading3"/>
+      </w:pPr>
+      <w:bookmarkStart w:id="23" w:name="_Toc236953742"/>
+      <w:r>
+        <w:t>Currency Changer</w:t>
+      </w:r>
+      <w:bookmarkEnd w:id="23"/>
+    </w:p>
+    <w:p>
+      <w:r>
+        <w:tab/>
+        <w:t xml:space="preserve">For the base game dice poker, the program will include an additional feature, where the user will be allowed to choose the currency, they want to bet on. The currency will include </w:t>
+      </w:r>
+      <w:r>
+        <w:t>£</w:t>
+      </w:r>
+      <w:r>
+        <w:t xml:space="preserve"> (the base currency), $ (USD), mmk (Myanmar Kyat), and jpy (Japanese Yen). The implementation steps will be explained below.</w:t>
+      </w:r>
     </w:p>
     <w:sectPr>
       <w:pgSz w:w="12240" w:h="15840"/>
@@ -5067,6 +6162,7 @@
   <w:style w:type="character" w:default="1" w:styleId="DefaultParagraphFont">
     <w:name w:val="Default Paragraph Font"/>
     <w:uiPriority w:val="1"/>
+    <w:semiHidden/>
     <w:unhideWhenUsed/>
   </w:style>
   <w:style w:type="table" w:default="1" w:styleId="TableNormal">

</xml_diff>

<commit_message>
Added Currency Changer class
</commit_message>
<xml_diff>
--- a/Java School Projects/40841063_HLUM HTET AUNG Coursework 2/40841063_Part 2 - Software Development Report.docx
+++ b/Java School Projects/40841063_HLUM HTET AUNG Coursework 2/40841063_Part 2 - Software Development Report.docx
@@ -1874,10 +1874,10 @@
           <w:noProof/>
         </w:rPr>
         <w:drawing>
-          <wp:inline distT="0" distB="0" distL="0" distR="0" wp14:anchorId="78CFFB55" wp14:editId="7D2439F6">
-            <wp:extent cx="5943600" cy="2691765"/>
-            <wp:effectExtent l="19050" t="19050" r="19050" b="13335"/>
-            <wp:docPr id="20387787" name="Picture 1"/>
+          <wp:inline distT="0" distB="0" distL="0" distR="0" wp14:anchorId="624AFF65" wp14:editId="7E66EB73">
+            <wp:extent cx="5700905" cy="2983230"/>
+            <wp:effectExtent l="19050" t="19050" r="14605" b="26670"/>
+            <wp:docPr id="1501400470" name="Picture 1"/>
             <wp:cNvGraphicFramePr>
               <a:graphicFrameLocks xmlns:a="http://schemas.openxmlformats.org/drawingml/2006/main" noChangeAspect="1"/>
             </wp:cNvGraphicFramePr>
@@ -1906,7 +1906,7 @@
                   <pic:spPr bwMode="auto">
                     <a:xfrm>
                       <a:off x="0" y="0"/>
-                      <a:ext cx="5943600" cy="2691765"/>
+                      <a:ext cx="5710477" cy="2988239"/>
                     </a:xfrm>
                     <a:prstGeom prst="rect">
                       <a:avLst/>
@@ -1946,7 +1946,13 @@
     </w:p>
     <w:p>
       <w:r>
-        <w:t>Each class in the diagram has their own purpose and every class call other classes for code reusability. The purpose of each class is –</w:t>
+        <w:t xml:space="preserve">Each class in the diagram has their own purpose and every class </w:t>
+      </w:r>
+      <w:r>
+        <w:t>calls</w:t>
+      </w:r>
+      <w:r>
+        <w:t xml:space="preserve"> other classes for code reusability. The purpose of each class is –</w:t>
       </w:r>
     </w:p>
     <w:p>
@@ -2090,6 +2096,7 @@
         </w:numPr>
       </w:pPr>
       <w:r>
+        <w:lastRenderedPageBreak/>
         <w:t xml:space="preserve">Result Board </w:t>
       </w:r>
       <w:r>
@@ -2101,14 +2108,34 @@
     </w:p>
     <w:p>
       <w:pPr>
+        <w:pStyle w:val="ListParagraph"/>
+        <w:numPr>
+          <w:ilvl w:val="0"/>
+          <w:numId w:val="13"/>
+        </w:numPr>
+      </w:pPr>
+      <w:r>
+        <w:t xml:space="preserve">Currency Changer </w:t>
+      </w:r>
+      <w:r>
+        <w:t>→</w:t>
+      </w:r>
+      <w:r>
+        <w:t xml:space="preserve"> additional class that allow users to see their final balance in other currencies</w:t>
+      </w:r>
+    </w:p>
+    <w:p>
+      <w:pPr>
         <w:pStyle w:val="Heading2"/>
       </w:pPr>
       <w:bookmarkStart w:id="3" w:name="_Toc236953722"/>
       <w:r>
-        <w:lastRenderedPageBreak/>
         <w:t>Class Descriptor</w:t>
       </w:r>
       <w:bookmarkEnd w:id="3"/>
+      <w:r>
+        <w:t xml:space="preserve"> (Main Features Only)</w:t>
+      </w:r>
     </w:p>
     <w:p>
       <w:r>
@@ -2322,7 +2349,6 @@
         <w:t>Calls score board class to show player’s ranking among dummy users</w:t>
       </w:r>
     </w:p>
-    <w:p/>
     <w:p>
       <w:pPr>
         <w:pStyle w:val="Heading3"/>
@@ -2459,7 +2485,15 @@
         <w:t xml:space="preserve"> and bank balance to place a ranking of user among dummy players. </w:t>
       </w:r>
       <w:r>
-        <w:t>This method mainly uses simple Arrays.sort() to tackle the ranking problem.</w:t>
+        <w:t xml:space="preserve">This method mainly uses simple </w:t>
+      </w:r>
+      <w:proofErr w:type="spellStart"/>
+      <w:r>
+        <w:t>Arrays.sort</w:t>
+      </w:r>
+      <w:proofErr w:type="spellEnd"/>
+      <w:r>
+        <w:t>() to tackle the ranking problem.</w:t>
       </w:r>
     </w:p>
     <w:p>
@@ -2572,8 +2606,13 @@
         <w:tab/>
         <w:t xml:space="preserve">Methods in the program, such as </w:t>
       </w:r>
-      <w:r>
-        <w:t>DiceRolling.diceprogram()</w:t>
+      <w:proofErr w:type="spellStart"/>
+      <w:r>
+        <w:t>DiceRolling.diceprogram</w:t>
+      </w:r>
+      <w:proofErr w:type="spellEnd"/>
+      <w:r>
+        <w:t>()</w:t>
       </w:r>
       <w:r>
         <w:t xml:space="preserve">, are reusable as they are a standalone function. For example, if </w:t>
@@ -2602,8 +2641,13 @@
           <w:numId w:val="15"/>
         </w:numPr>
       </w:pPr>
-      <w:r>
-        <w:t>DiceRolling.diceprogram()</w:t>
+      <w:proofErr w:type="spellStart"/>
+      <w:r>
+        <w:t>DiceRolling.diceprogram</w:t>
+      </w:r>
+      <w:proofErr w:type="spellEnd"/>
+      <w:r>
+        <w:t>()</w:t>
       </w:r>
     </w:p>
     <w:p>
@@ -2614,8 +2658,13 @@
           <w:numId w:val="15"/>
         </w:numPr>
       </w:pPr>
-      <w:r>
-        <w:t>ResultBoard.recordRound()</w:t>
+      <w:proofErr w:type="spellStart"/>
+      <w:r>
+        <w:t>ResultBoard.recordRound</w:t>
+      </w:r>
+      <w:proofErr w:type="spellEnd"/>
+      <w:r>
+        <w:t>()</w:t>
       </w:r>
     </w:p>
     <w:p>
@@ -2626,8 +2675,13 @@
           <w:numId w:val="15"/>
         </w:numPr>
       </w:pPr>
-      <w:r>
-        <w:t>ScoreBoard.board()</w:t>
+      <w:proofErr w:type="spellStart"/>
+      <w:r>
+        <w:t>ScoreBoard.board</w:t>
+      </w:r>
+      <w:proofErr w:type="spellEnd"/>
+      <w:r>
+        <w:t>()</w:t>
       </w:r>
     </w:p>
     <w:p>
@@ -2638,13 +2692,26 @@
           <w:numId w:val="15"/>
         </w:numPr>
       </w:pPr>
-      <w:r>
-        <w:t>RoundRecorder.recordRound()</w:t>
-      </w:r>
-    </w:p>
-    <w:p>
-      <w:r>
-        <w:t xml:space="preserve">Apart from these mainly reusables, other methods from some classes, such as RewardCondition.applyPayout(), </w:t>
+      <w:proofErr w:type="spellStart"/>
+      <w:r>
+        <w:t>RoundRecorder.recordRound</w:t>
+      </w:r>
+      <w:proofErr w:type="spellEnd"/>
+      <w:r>
+        <w:t>()</w:t>
+      </w:r>
+    </w:p>
+    <w:p>
+      <w:r>
+        <w:t xml:space="preserve">Apart from these mainly reusables, other methods from some classes, such as </w:t>
+      </w:r>
+      <w:proofErr w:type="spellStart"/>
+      <w:r>
+        <w:t>RewardCondition.applyPayout</w:t>
+      </w:r>
+      <w:proofErr w:type="spellEnd"/>
+      <w:r>
+        <w:t xml:space="preserve">(), </w:t>
       </w:r>
       <w:r>
         <w:t>are</w:t>
@@ -2695,7 +2762,15 @@
         <w:t>rounds</w:t>
       </w:r>
       <w:r>
-        <w:t xml:space="preserve"> are passed into the betting program as a parameter so that when there is a need to modify the number of rounds, users can simply modify the variable parameter in the wrapper class dice game</w:t>
+        <w:t xml:space="preserve"> </w:t>
+      </w:r>
+      <w:proofErr w:type="gramStart"/>
+      <w:r>
+        <w:t>are</w:t>
+      </w:r>
+      <w:proofErr w:type="gramEnd"/>
+      <w:r>
+        <w:t xml:space="preserve"> passed into the betting program as a parameter so that when there is a need to modify the number of rounds, users can simply modify the variable parameter in the wrapper class dice game</w:t>
       </w:r>
       <w:r>
         <w:t xml:space="preserve"> and pass it into betting program.</w:t>
@@ -2855,7 +2930,15 @@
     <w:p>
       <w:r>
         <w:tab/>
-        <w:t>In the diceRolling.diceprogram(), the number of the die faces are not hard coded and is assigned to a variable. What problem does this solve? This gets rid of the hard coding, where if there is a need to change die face, it is possible to modify a single variable rather than changing 6 in every line of code.</w:t>
+        <w:t xml:space="preserve">In the </w:t>
+      </w:r>
+      <w:proofErr w:type="spellStart"/>
+      <w:r>
+        <w:t>diceRolling.diceprogram</w:t>
+      </w:r>
+      <w:proofErr w:type="spellEnd"/>
+      <w:r>
+        <w:t>(), the number of the die faces are not hard coded and is assigned to a variable. What problem does this solve? This gets rid of the hard coding, where if there is a need to change die face, it is possible to modify a single variable rather than changing 6 in every line of code.</w:t>
       </w:r>
     </w:p>
     <w:p>
@@ -3291,9 +3374,11 @@
       <w:r>
         <w:t xml:space="preserve"> First, after the game is over, the username and bank balance is added into the list, and the list is sorted using </w:t>
       </w:r>
+      <w:proofErr w:type="spellStart"/>
       <w:r>
         <w:t>Arrays.sort</w:t>
       </w:r>
+      <w:proofErr w:type="spellEnd"/>
       <w:r>
         <w:t xml:space="preserve">(). After the array is sorted, ranking numbers are added in </w:t>
       </w:r>
@@ -3486,13 +3571,277 @@
     <w:p>
       <w:r>
         <w:tab/>
-        <w:t xml:space="preserve">For the base game dice poker, the program will include an additional feature, where the user will be allowed to choose the currency, they want to bet on. The currency will include </w:t>
+        <w:t xml:space="preserve">For the base game dice poker, the program will include an additional feature, where the user will be allowed to </w:t>
+      </w:r>
+      <w:r>
+        <w:t>see their final remaining bank balance in other currencies</w:t>
+      </w:r>
+      <w:r>
+        <w:t xml:space="preserve">. The currency will include </w:t>
       </w:r>
       <w:r>
         <w:t>£</w:t>
       </w:r>
       <w:r>
-        <w:t xml:space="preserve"> (the base currency), $ (USD), mmk (Myanmar Kyat), and jpy (Japanese Yen). The implementation steps will be explained below.</w:t>
+        <w:t xml:space="preserve"> (the base currency), $ (USD), </w:t>
+      </w:r>
+      <w:proofErr w:type="spellStart"/>
+      <w:r>
+        <w:t>mmk</w:t>
+      </w:r>
+      <w:proofErr w:type="spellEnd"/>
+      <w:r>
+        <w:t xml:space="preserve"> (Myanmar Kyat), and </w:t>
+      </w:r>
+      <w:proofErr w:type="spellStart"/>
+      <w:r>
+        <w:t>jpy</w:t>
+      </w:r>
+      <w:proofErr w:type="spellEnd"/>
+      <w:r>
+        <w:t xml:space="preserve"> (Japanese Yen). The implementation steps will be explained below.</w:t>
+      </w:r>
+    </w:p>
+    <w:p>
+      <w:pPr>
+        <w:keepNext/>
+        <w:jc w:val="center"/>
+      </w:pPr>
+      <w:r>
+        <w:lastRenderedPageBreak/>
+        <w:drawing>
+          <wp:inline distT="0" distB="0" distL="0" distR="0" wp14:anchorId="5465BC9D" wp14:editId="592C06DC">
+            <wp:extent cx="4221480" cy="4253952"/>
+            <wp:effectExtent l="19050" t="19050" r="26670" b="13335"/>
+            <wp:docPr id="2058475088" name="Picture 1"/>
+            <wp:cNvGraphicFramePr>
+              <a:graphicFrameLocks xmlns:a="http://schemas.openxmlformats.org/drawingml/2006/main" noChangeAspect="1"/>
+            </wp:cNvGraphicFramePr>
+            <a:graphic xmlns:a="http://schemas.openxmlformats.org/drawingml/2006/main">
+              <a:graphicData uri="http://schemas.openxmlformats.org/drawingml/2006/picture">
+                <pic:pic xmlns:pic="http://schemas.openxmlformats.org/drawingml/2006/picture">
+                  <pic:nvPicPr>
+                    <pic:cNvPr id="2058475088" name=""/>
+                    <pic:cNvPicPr/>
+                  </pic:nvPicPr>
+                  <pic:blipFill>
+                    <a:blip r:embed="rId17"/>
+                    <a:stretch>
+                      <a:fillRect/>
+                    </a:stretch>
+                  </pic:blipFill>
+                  <pic:spPr>
+                    <a:xfrm>
+                      <a:off x="0" y="0"/>
+                      <a:ext cx="4227443" cy="4259961"/>
+                    </a:xfrm>
+                    <a:prstGeom prst="rect">
+                      <a:avLst/>
+                    </a:prstGeom>
+                    <a:ln>
+                      <a:solidFill>
+                        <a:schemeClr val="tx1"/>
+                      </a:solidFill>
+                    </a:ln>
+                  </pic:spPr>
+                </pic:pic>
+              </a:graphicData>
+            </a:graphic>
+          </wp:inline>
+        </w:drawing>
+      </w:r>
+    </w:p>
+    <w:p>
+      <w:pPr>
+        <w:jc w:val="center"/>
+      </w:pPr>
+      <w:r>
+        <w:t xml:space="preserve">Figure </w:t>
+      </w:r>
+      <w:fldSimple w:instr=" SEQ Figure \* ARABIC ">
+        <w:r>
+          <w:rPr>
+            <w:noProof/>
+          </w:rPr>
+          <w:t>10</w:t>
+        </w:r>
+      </w:fldSimple>
+      <w:r>
+        <w:t xml:space="preserve"> Currency Changer Class</w:t>
+      </w:r>
+    </w:p>
+    <w:p>
+      <w:r>
+        <w:t>This is the currency changer class with the additional currency calculations and the symbol method for displaying final bank balance in each symbol accordingly.</w:t>
+      </w:r>
+    </w:p>
+    <w:p>
+      <w:pPr>
+        <w:keepNext/>
+        <w:jc w:val="center"/>
+      </w:pPr>
+      <w:r>
+        <w:lastRenderedPageBreak/>
+        <w:drawing>
+          <wp:inline distT="0" distB="0" distL="0" distR="0" wp14:anchorId="261116A1" wp14:editId="0E9BE9DF">
+            <wp:extent cx="5943600" cy="2800985"/>
+            <wp:effectExtent l="19050" t="19050" r="19050" b="18415"/>
+            <wp:docPr id="28522356" name="Picture 1"/>
+            <wp:cNvGraphicFramePr>
+              <a:graphicFrameLocks xmlns:a="http://schemas.openxmlformats.org/drawingml/2006/main" noChangeAspect="1"/>
+            </wp:cNvGraphicFramePr>
+            <a:graphic xmlns:a="http://schemas.openxmlformats.org/drawingml/2006/main">
+              <a:graphicData uri="http://schemas.openxmlformats.org/drawingml/2006/picture">
+                <pic:pic xmlns:pic="http://schemas.openxmlformats.org/drawingml/2006/picture">
+                  <pic:nvPicPr>
+                    <pic:cNvPr id="28522356" name=""/>
+                    <pic:cNvPicPr/>
+                  </pic:nvPicPr>
+                  <pic:blipFill>
+                    <a:blip r:embed="rId18"/>
+                    <a:stretch>
+                      <a:fillRect/>
+                    </a:stretch>
+                  </pic:blipFill>
+                  <pic:spPr>
+                    <a:xfrm>
+                      <a:off x="0" y="0"/>
+                      <a:ext cx="5943600" cy="2800985"/>
+                    </a:xfrm>
+                    <a:prstGeom prst="rect">
+                      <a:avLst/>
+                    </a:prstGeom>
+                    <a:ln>
+                      <a:solidFill>
+                        <a:schemeClr val="tx1"/>
+                      </a:solidFill>
+                    </a:ln>
+                  </pic:spPr>
+                </pic:pic>
+              </a:graphicData>
+            </a:graphic>
+          </wp:inline>
+        </w:drawing>
+      </w:r>
+    </w:p>
+    <w:p>
+      <w:pPr>
+        <w:jc w:val="center"/>
+      </w:pPr>
+      <w:r>
+        <w:t xml:space="preserve">Figure </w:t>
+      </w:r>
+      <w:fldSimple w:instr=" SEQ Figure \* ARABIC ">
+        <w:r>
+          <w:rPr>
+            <w:noProof/>
+          </w:rPr>
+          <w:t>11</w:t>
+        </w:r>
+      </w:fldSimple>
+      <w:r>
+        <w:t xml:space="preserve"> Betting Program currency converter code block</w:t>
+      </w:r>
+    </w:p>
+    <w:p>
+      <w:r>
+        <w:t xml:space="preserve">The function is implemented at the end of the class, after the game is over to let users choose if they want to see their bank balance in other currencies. If the choice is yes, users will need to select the </w:t>
+      </w:r>
+      <w:r>
+        <w:t>currency,</w:t>
+      </w:r>
+      <w:r>
+        <w:t xml:space="preserve"> and the Currency</w:t>
+      </w:r>
+      <w:r>
+        <w:t xml:space="preserve"> </w:t>
+      </w:r>
+      <w:r>
+        <w:t>Changer class will do the calculations and display the result. Otherwise, the function will be skipped and result table and scoreboard will be displayed.</w:t>
+      </w:r>
+    </w:p>
+    <w:p>
+      <w:pPr>
+        <w:keepNext/>
+        <w:jc w:val="center"/>
+      </w:pPr>
+      <w:r>
+        <w:drawing>
+          <wp:inline distT="0" distB="0" distL="0" distR="0" wp14:anchorId="1A487D60" wp14:editId="03670000">
+            <wp:extent cx="3077004" cy="1381318"/>
+            <wp:effectExtent l="19050" t="19050" r="9525" b="28575"/>
+            <wp:docPr id="1528062377" name="Picture 1"/>
+            <wp:cNvGraphicFramePr>
+              <a:graphicFrameLocks xmlns:a="http://schemas.openxmlformats.org/drawingml/2006/main" noChangeAspect="1"/>
+            </wp:cNvGraphicFramePr>
+            <a:graphic xmlns:a="http://schemas.openxmlformats.org/drawingml/2006/main">
+              <a:graphicData uri="http://schemas.openxmlformats.org/drawingml/2006/picture">
+                <pic:pic xmlns:pic="http://schemas.openxmlformats.org/drawingml/2006/picture">
+                  <pic:nvPicPr>
+                    <pic:cNvPr id="1528062377" name=""/>
+                    <pic:cNvPicPr/>
+                  </pic:nvPicPr>
+                  <pic:blipFill>
+                    <a:blip r:embed="rId19"/>
+                    <a:stretch>
+                      <a:fillRect/>
+                    </a:stretch>
+                  </pic:blipFill>
+                  <pic:spPr>
+                    <a:xfrm>
+                      <a:off x="0" y="0"/>
+                      <a:ext cx="3077004" cy="1381318"/>
+                    </a:xfrm>
+                    <a:prstGeom prst="rect">
+                      <a:avLst/>
+                    </a:prstGeom>
+                    <a:ln>
+                      <a:solidFill>
+                        <a:schemeClr val="tx1"/>
+                      </a:solidFill>
+                    </a:ln>
+                  </pic:spPr>
+                </pic:pic>
+              </a:graphicData>
+            </a:graphic>
+          </wp:inline>
+        </w:drawing>
+      </w:r>
+    </w:p>
+    <w:p>
+      <w:pPr>
+        <w:jc w:val="center"/>
+      </w:pPr>
+      <w:r>
+        <w:t xml:space="preserve">Figure </w:t>
+      </w:r>
+      <w:fldSimple w:instr=" SEQ Figure \* ARABIC ">
+        <w:r>
+          <w:rPr>
+            <w:noProof/>
+          </w:rPr>
+          <w:t>12</w:t>
+        </w:r>
+      </w:fldSimple>
+      <w:r>
+        <w:t xml:space="preserve"> Currency Changer Test Result</w:t>
+      </w:r>
+    </w:p>
+    <w:p>
+      <w:r>
+        <w:t xml:space="preserve">In this test result the amount is shown in Myanmar currency (Kyat). After the game ended, the bank balance was </w:t>
+      </w:r>
+      <w:r>
+        <w:t>£</w:t>
+      </w:r>
+      <w:r>
+        <w:t xml:space="preserve">2, and it is calculated </w:t>
+      </w:r>
+      <w:r>
+        <w:t>to be</w:t>
+      </w:r>
+      <w:r>
+        <w:t xml:space="preserve"> MMK 5600, with Currency Changer class.</w:t>
       </w:r>
     </w:p>
     <w:sectPr>

</xml_diff>

<commit_message>
Java School Project complete
</commit_message>
<xml_diff>
--- a/Java School Projects/40841063_HLUM HTET AUNG Coursework 2/40841063_Part 2 - Software Development Report.docx
+++ b/Java School Projects/40841063_HLUM HTET AUNG Coursework 2/40841063_Part 2 - Software Development Report.docx
@@ -144,7 +144,7 @@
           <w:r>
             <w:fldChar w:fldCharType="separate"/>
           </w:r>
-          <w:hyperlink w:anchor="_Toc236953719" w:history="1">
+          <w:hyperlink w:anchor="_Toc237254353" w:history="1">
             <w:r>
               <w:rPr>
                 <w:rStyle w:val="Hyperlink"/>
@@ -171,7 +171,7 @@
                 <w:noProof/>
                 <w:webHidden/>
               </w:rPr>
-              <w:instrText xml:space="preserve"> PAGEREF _Toc236953719 \h </w:instrText>
+              <w:instrText xml:space="preserve"> PAGEREF _Toc237254353 \h </w:instrText>
             </w:r>
             <w:r>
               <w:rPr>
@@ -213,7 +213,7 @@
               <w:noProof/>
             </w:rPr>
           </w:pPr>
-          <w:hyperlink w:anchor="_Toc236953720" w:history="1">
+          <w:hyperlink w:anchor="_Toc237254354" w:history="1">
             <w:r>
               <w:rPr>
                 <w:rStyle w:val="Hyperlink"/>
@@ -240,7 +240,7 @@
                 <w:noProof/>
                 <w:webHidden/>
               </w:rPr>
-              <w:instrText xml:space="preserve"> PAGEREF _Toc236953720 \h </w:instrText>
+              <w:instrText xml:space="preserve"> PAGEREF _Toc237254354 \h </w:instrText>
             </w:r>
             <w:r>
               <w:rPr>
@@ -282,7 +282,7 @@
               <w:noProof/>
             </w:rPr>
           </w:pPr>
-          <w:hyperlink w:anchor="_Toc236953721" w:history="1">
+          <w:hyperlink w:anchor="_Toc237254355" w:history="1">
             <w:r>
               <w:rPr>
                 <w:rStyle w:val="Hyperlink"/>
@@ -309,7 +309,7 @@
                 <w:noProof/>
                 <w:webHidden/>
               </w:rPr>
-              <w:instrText xml:space="preserve"> PAGEREF _Toc236953721 \h </w:instrText>
+              <w:instrText xml:space="preserve"> PAGEREF _Toc237254355 \h </w:instrText>
             </w:r>
             <w:r>
               <w:rPr>
@@ -351,13 +351,13 @@
               <w:noProof/>
             </w:rPr>
           </w:pPr>
-          <w:hyperlink w:anchor="_Toc236953722" w:history="1">
+          <w:hyperlink w:anchor="_Toc237254356" w:history="1">
             <w:r>
               <w:rPr>
                 <w:rStyle w:val="Hyperlink"/>
                 <w:noProof/>
               </w:rPr>
-              <w:t>Class Descriptor</w:t>
+              <w:t>Class Descriptor (Main Features Only)</w:t>
             </w:r>
             <w:r>
               <w:rPr>
@@ -378,7 +378,7 @@
                 <w:noProof/>
                 <w:webHidden/>
               </w:rPr>
-              <w:instrText xml:space="preserve"> PAGEREF _Toc236953722 \h </w:instrText>
+              <w:instrText xml:space="preserve"> PAGEREF _Toc237254356 \h </w:instrText>
             </w:r>
             <w:r>
               <w:rPr>
@@ -420,7 +420,7 @@
               <w:noProof/>
             </w:rPr>
           </w:pPr>
-          <w:hyperlink w:anchor="_Toc236953723" w:history="1">
+          <w:hyperlink w:anchor="_Toc237254357" w:history="1">
             <w:r>
               <w:rPr>
                 <w:rStyle w:val="Hyperlink"/>
@@ -447,7 +447,7 @@
                 <w:noProof/>
                 <w:webHidden/>
               </w:rPr>
-              <w:instrText xml:space="preserve"> PAGEREF _Toc236953723 \h </w:instrText>
+              <w:instrText xml:space="preserve"> PAGEREF _Toc237254357 \h </w:instrText>
             </w:r>
             <w:r>
               <w:rPr>
@@ -489,7 +489,7 @@
               <w:noProof/>
             </w:rPr>
           </w:pPr>
-          <w:hyperlink w:anchor="_Toc236953724" w:history="1">
+          <w:hyperlink w:anchor="_Toc237254358" w:history="1">
             <w:r>
               <w:rPr>
                 <w:rStyle w:val="Hyperlink"/>
@@ -516,7 +516,7 @@
                 <w:noProof/>
                 <w:webHidden/>
               </w:rPr>
-              <w:instrText xml:space="preserve"> PAGEREF _Toc236953724 \h </w:instrText>
+              <w:instrText xml:space="preserve"> PAGEREF _Toc237254358 \h </w:instrText>
             </w:r>
             <w:r>
               <w:rPr>
@@ -558,7 +558,7 @@
               <w:noProof/>
             </w:rPr>
           </w:pPr>
-          <w:hyperlink w:anchor="_Toc236953725" w:history="1">
+          <w:hyperlink w:anchor="_Toc237254359" w:history="1">
             <w:r>
               <w:rPr>
                 <w:rStyle w:val="Hyperlink"/>
@@ -585,7 +585,7 @@
                 <w:noProof/>
                 <w:webHidden/>
               </w:rPr>
-              <w:instrText xml:space="preserve"> PAGEREF _Toc236953725 \h </w:instrText>
+              <w:instrText xml:space="preserve"> PAGEREF _Toc237254359 \h </w:instrText>
             </w:r>
             <w:r>
               <w:rPr>
@@ -627,7 +627,7 @@
               <w:noProof/>
             </w:rPr>
           </w:pPr>
-          <w:hyperlink w:anchor="_Toc236953726" w:history="1">
+          <w:hyperlink w:anchor="_Toc237254360" w:history="1">
             <w:r>
               <w:rPr>
                 <w:rStyle w:val="Hyperlink"/>
@@ -654,7 +654,7 @@
                 <w:noProof/>
                 <w:webHidden/>
               </w:rPr>
-              <w:instrText xml:space="preserve"> PAGEREF _Toc236953726 \h </w:instrText>
+              <w:instrText xml:space="preserve"> PAGEREF _Toc237254360 \h </w:instrText>
             </w:r>
             <w:r>
               <w:rPr>
@@ -696,7 +696,7 @@
               <w:noProof/>
             </w:rPr>
           </w:pPr>
-          <w:hyperlink w:anchor="_Toc236953727" w:history="1">
+          <w:hyperlink w:anchor="_Toc237254361" w:history="1">
             <w:r>
               <w:rPr>
                 <w:rStyle w:val="Hyperlink"/>
@@ -723,7 +723,7 @@
                 <w:noProof/>
                 <w:webHidden/>
               </w:rPr>
-              <w:instrText xml:space="preserve"> PAGEREF _Toc236953727 \h </w:instrText>
+              <w:instrText xml:space="preserve"> PAGEREF _Toc237254361 \h </w:instrText>
             </w:r>
             <w:r>
               <w:rPr>
@@ -765,7 +765,7 @@
               <w:noProof/>
             </w:rPr>
           </w:pPr>
-          <w:hyperlink w:anchor="_Toc236953728" w:history="1">
+          <w:hyperlink w:anchor="_Toc237254362" w:history="1">
             <w:r>
               <w:rPr>
                 <w:rStyle w:val="Hyperlink"/>
@@ -792,7 +792,7 @@
                 <w:noProof/>
                 <w:webHidden/>
               </w:rPr>
-              <w:instrText xml:space="preserve"> PAGEREF _Toc236953728 \h </w:instrText>
+              <w:instrText xml:space="preserve"> PAGEREF _Toc237254362 \h </w:instrText>
             </w:r>
             <w:r>
               <w:rPr>
@@ -834,7 +834,7 @@
               <w:noProof/>
             </w:rPr>
           </w:pPr>
-          <w:hyperlink w:anchor="_Toc236953729" w:history="1">
+          <w:hyperlink w:anchor="_Toc237254363" w:history="1">
             <w:r>
               <w:rPr>
                 <w:rStyle w:val="Hyperlink"/>
@@ -861,7 +861,7 @@
                 <w:noProof/>
                 <w:webHidden/>
               </w:rPr>
-              <w:instrText xml:space="preserve"> PAGEREF _Toc236953729 \h </w:instrText>
+              <w:instrText xml:space="preserve"> PAGEREF _Toc237254363 \h </w:instrText>
             </w:r>
             <w:r>
               <w:rPr>
@@ -903,7 +903,7 @@
               <w:noProof/>
             </w:rPr>
           </w:pPr>
-          <w:hyperlink w:anchor="_Toc236953730" w:history="1">
+          <w:hyperlink w:anchor="_Toc237254364" w:history="1">
             <w:r>
               <w:rPr>
                 <w:rStyle w:val="Hyperlink"/>
@@ -930,7 +930,7 @@
                 <w:noProof/>
                 <w:webHidden/>
               </w:rPr>
-              <w:instrText xml:space="preserve"> PAGEREF _Toc236953730 \h </w:instrText>
+              <w:instrText xml:space="preserve"> PAGEREF _Toc237254364 \h </w:instrText>
             </w:r>
             <w:r>
               <w:rPr>
@@ -972,7 +972,7 @@
               <w:noProof/>
             </w:rPr>
           </w:pPr>
-          <w:hyperlink w:anchor="_Toc236953731" w:history="1">
+          <w:hyperlink w:anchor="_Toc237254365" w:history="1">
             <w:r>
               <w:rPr>
                 <w:rStyle w:val="Hyperlink"/>
@@ -999,7 +999,7 @@
                 <w:noProof/>
                 <w:webHidden/>
               </w:rPr>
-              <w:instrText xml:space="preserve"> PAGEREF _Toc236953731 \h </w:instrText>
+              <w:instrText xml:space="preserve"> PAGEREF _Toc237254365 \h </w:instrText>
             </w:r>
             <w:r>
               <w:rPr>
@@ -1041,7 +1041,7 @@
               <w:noProof/>
             </w:rPr>
           </w:pPr>
-          <w:hyperlink w:anchor="_Toc236953732" w:history="1">
+          <w:hyperlink w:anchor="_Toc237254366" w:history="1">
             <w:r>
               <w:rPr>
                 <w:rStyle w:val="Hyperlink"/>
@@ -1068,7 +1068,7 @@
                 <w:noProof/>
                 <w:webHidden/>
               </w:rPr>
-              <w:instrText xml:space="preserve"> PAGEREF _Toc236953732 \h </w:instrText>
+              <w:instrText xml:space="preserve"> PAGEREF _Toc237254366 \h </w:instrText>
             </w:r>
             <w:r>
               <w:rPr>
@@ -1110,7 +1110,7 @@
               <w:noProof/>
             </w:rPr>
           </w:pPr>
-          <w:hyperlink w:anchor="_Toc236953733" w:history="1">
+          <w:hyperlink w:anchor="_Toc237254367" w:history="1">
             <w:r>
               <w:rPr>
                 <w:rStyle w:val="Hyperlink"/>
@@ -1137,7 +1137,7 @@
                 <w:noProof/>
                 <w:webHidden/>
               </w:rPr>
-              <w:instrText xml:space="preserve"> PAGEREF _Toc236953733 \h </w:instrText>
+              <w:instrText xml:space="preserve"> PAGEREF _Toc237254367 \h </w:instrText>
             </w:r>
             <w:r>
               <w:rPr>
@@ -1179,7 +1179,7 @@
               <w:noProof/>
             </w:rPr>
           </w:pPr>
-          <w:hyperlink w:anchor="_Toc236953734" w:history="1">
+          <w:hyperlink w:anchor="_Toc237254368" w:history="1">
             <w:r>
               <w:rPr>
                 <w:rStyle w:val="Hyperlink"/>
@@ -1206,7 +1206,7 @@
                 <w:noProof/>
                 <w:webHidden/>
               </w:rPr>
-              <w:instrText xml:space="preserve"> PAGEREF _Toc236953734 \h </w:instrText>
+              <w:instrText xml:space="preserve"> PAGEREF _Toc237254368 \h </w:instrText>
             </w:r>
             <w:r>
               <w:rPr>
@@ -1248,7 +1248,7 @@
               <w:noProof/>
             </w:rPr>
           </w:pPr>
-          <w:hyperlink w:anchor="_Toc236953735" w:history="1">
+          <w:hyperlink w:anchor="_Toc237254369" w:history="1">
             <w:r>
               <w:rPr>
                 <w:rStyle w:val="Hyperlink"/>
@@ -1275,7 +1275,7 @@
                 <w:noProof/>
                 <w:webHidden/>
               </w:rPr>
-              <w:instrText xml:space="preserve"> PAGEREF _Toc236953735 \h </w:instrText>
+              <w:instrText xml:space="preserve"> PAGEREF _Toc237254369 \h </w:instrText>
             </w:r>
             <w:r>
               <w:rPr>
@@ -1317,7 +1317,7 @@
               <w:noProof/>
             </w:rPr>
           </w:pPr>
-          <w:hyperlink w:anchor="_Toc236953736" w:history="1">
+          <w:hyperlink w:anchor="_Toc237254370" w:history="1">
             <w:r>
               <w:rPr>
                 <w:rStyle w:val="Hyperlink"/>
@@ -1344,7 +1344,7 @@
                 <w:noProof/>
                 <w:webHidden/>
               </w:rPr>
-              <w:instrText xml:space="preserve"> PAGEREF _Toc236953736 \h </w:instrText>
+              <w:instrText xml:space="preserve"> PAGEREF _Toc237254370 \h </w:instrText>
             </w:r>
             <w:r>
               <w:rPr>
@@ -1386,7 +1386,7 @@
               <w:noProof/>
             </w:rPr>
           </w:pPr>
-          <w:hyperlink w:anchor="_Toc236953737" w:history="1">
+          <w:hyperlink w:anchor="_Toc237254371" w:history="1">
             <w:r>
               <w:rPr>
                 <w:rStyle w:val="Hyperlink"/>
@@ -1413,7 +1413,7 @@
                 <w:noProof/>
                 <w:webHidden/>
               </w:rPr>
-              <w:instrText xml:space="preserve"> PAGEREF _Toc236953737 \h </w:instrText>
+              <w:instrText xml:space="preserve"> PAGEREF _Toc237254371 \h </w:instrText>
             </w:r>
             <w:r>
               <w:rPr>
@@ -1455,7 +1455,7 @@
               <w:noProof/>
             </w:rPr>
           </w:pPr>
-          <w:hyperlink w:anchor="_Toc236953738" w:history="1">
+          <w:hyperlink w:anchor="_Toc237254372" w:history="1">
             <w:r>
               <w:rPr>
                 <w:rStyle w:val="Hyperlink"/>
@@ -1482,7 +1482,7 @@
                 <w:noProof/>
                 <w:webHidden/>
               </w:rPr>
-              <w:instrText xml:space="preserve"> PAGEREF _Toc236953738 \h </w:instrText>
+              <w:instrText xml:space="preserve"> PAGEREF _Toc237254372 \h </w:instrText>
             </w:r>
             <w:r>
               <w:rPr>
@@ -1524,7 +1524,7 @@
               <w:noProof/>
             </w:rPr>
           </w:pPr>
-          <w:hyperlink w:anchor="_Toc236953739" w:history="1">
+          <w:hyperlink w:anchor="_Toc237254373" w:history="1">
             <w:r>
               <w:rPr>
                 <w:rStyle w:val="Hyperlink"/>
@@ -1551,7 +1551,7 @@
                 <w:noProof/>
                 <w:webHidden/>
               </w:rPr>
-              <w:instrText xml:space="preserve"> PAGEREF _Toc236953739 \h </w:instrText>
+              <w:instrText xml:space="preserve"> PAGEREF _Toc237254373 \h </w:instrText>
             </w:r>
             <w:r>
               <w:rPr>
@@ -1593,7 +1593,7 @@
               <w:noProof/>
             </w:rPr>
           </w:pPr>
-          <w:hyperlink w:anchor="_Toc236953740" w:history="1">
+          <w:hyperlink w:anchor="_Toc237254374" w:history="1">
             <w:r>
               <w:rPr>
                 <w:rStyle w:val="Hyperlink"/>
@@ -1620,7 +1620,7 @@
                 <w:noProof/>
                 <w:webHidden/>
               </w:rPr>
-              <w:instrText xml:space="preserve"> PAGEREF _Toc236953740 \h </w:instrText>
+              <w:instrText xml:space="preserve"> PAGEREF _Toc237254374 \h </w:instrText>
             </w:r>
             <w:r>
               <w:rPr>
@@ -1662,7 +1662,7 @@
               <w:noProof/>
             </w:rPr>
           </w:pPr>
-          <w:hyperlink w:anchor="_Toc236953741" w:history="1">
+          <w:hyperlink w:anchor="_Toc237254375" w:history="1">
             <w:r>
               <w:rPr>
                 <w:rStyle w:val="Hyperlink"/>
@@ -1689,7 +1689,7 @@
                 <w:noProof/>
                 <w:webHidden/>
               </w:rPr>
-              <w:instrText xml:space="preserve"> PAGEREF _Toc236953741 \h </w:instrText>
+              <w:instrText xml:space="preserve"> PAGEREF _Toc237254375 \h </w:instrText>
             </w:r>
             <w:r>
               <w:rPr>
@@ -1731,7 +1731,7 @@
               <w:noProof/>
             </w:rPr>
           </w:pPr>
-          <w:hyperlink w:anchor="_Toc236953742" w:history="1">
+          <w:hyperlink w:anchor="_Toc237254376" w:history="1">
             <w:r>
               <w:rPr>
                 <w:rStyle w:val="Hyperlink"/>
@@ -1758,7 +1758,7 @@
                 <w:noProof/>
                 <w:webHidden/>
               </w:rPr>
-              <w:instrText xml:space="preserve"> PAGEREF _Toc236953742 \h </w:instrText>
+              <w:instrText xml:space="preserve"> PAGEREF _Toc237254376 \h </w:instrText>
             </w:r>
             <w:r>
               <w:rPr>
@@ -1779,6 +1779,144 @@
                 <w:webHidden/>
               </w:rPr>
               <w:t>14</w:t>
+            </w:r>
+            <w:r>
+              <w:rPr>
+                <w:noProof/>
+                <w:webHidden/>
+              </w:rPr>
+              <w:fldChar w:fldCharType="end"/>
+            </w:r>
+          </w:hyperlink>
+        </w:p>
+        <w:p>
+          <w:pPr>
+            <w:pStyle w:val="TOC3"/>
+            <w:tabs>
+              <w:tab w:val="right" w:leader="dot" w:pos="9350"/>
+            </w:tabs>
+            <w:rPr>
+              <w:rFonts w:asciiTheme="minorHAnsi" w:eastAsiaTheme="minorEastAsia" w:hAnsiTheme="minorHAnsi"/>
+              <w:noProof/>
+            </w:rPr>
+          </w:pPr>
+          <w:hyperlink w:anchor="_Toc237254377" w:history="1">
+            <w:r>
+              <w:rPr>
+                <w:rStyle w:val="Hyperlink"/>
+                <w:noProof/>
+              </w:rPr>
+              <w:t>Dice Fighter</w:t>
+            </w:r>
+            <w:r>
+              <w:rPr>
+                <w:noProof/>
+                <w:webHidden/>
+              </w:rPr>
+              <w:tab/>
+            </w:r>
+            <w:r>
+              <w:rPr>
+                <w:noProof/>
+                <w:webHidden/>
+              </w:rPr>
+              <w:fldChar w:fldCharType="begin"/>
+            </w:r>
+            <w:r>
+              <w:rPr>
+                <w:noProof/>
+                <w:webHidden/>
+              </w:rPr>
+              <w:instrText xml:space="preserve"> PAGEREF _Toc237254377 \h </w:instrText>
+            </w:r>
+            <w:r>
+              <w:rPr>
+                <w:noProof/>
+                <w:webHidden/>
+              </w:rPr>
+            </w:r>
+            <w:r>
+              <w:rPr>
+                <w:noProof/>
+                <w:webHidden/>
+              </w:rPr>
+              <w:fldChar w:fldCharType="separate"/>
+            </w:r>
+            <w:r>
+              <w:rPr>
+                <w:noProof/>
+                <w:webHidden/>
+              </w:rPr>
+              <w:t>17</w:t>
+            </w:r>
+            <w:r>
+              <w:rPr>
+                <w:noProof/>
+                <w:webHidden/>
+              </w:rPr>
+              <w:fldChar w:fldCharType="end"/>
+            </w:r>
+          </w:hyperlink>
+        </w:p>
+        <w:p>
+          <w:pPr>
+            <w:pStyle w:val="TOC3"/>
+            <w:tabs>
+              <w:tab w:val="right" w:leader="dot" w:pos="9350"/>
+            </w:tabs>
+            <w:rPr>
+              <w:rFonts w:asciiTheme="minorHAnsi" w:eastAsiaTheme="minorEastAsia" w:hAnsiTheme="minorHAnsi"/>
+              <w:noProof/>
+            </w:rPr>
+          </w:pPr>
+          <w:hyperlink w:anchor="_Toc237254378" w:history="1">
+            <w:r>
+              <w:rPr>
+                <w:rStyle w:val="Hyperlink"/>
+                <w:noProof/>
+              </w:rPr>
+              <w:t>Updated Class Diagram</w:t>
+            </w:r>
+            <w:r>
+              <w:rPr>
+                <w:noProof/>
+                <w:webHidden/>
+              </w:rPr>
+              <w:tab/>
+            </w:r>
+            <w:r>
+              <w:rPr>
+                <w:noProof/>
+                <w:webHidden/>
+              </w:rPr>
+              <w:fldChar w:fldCharType="begin"/>
+            </w:r>
+            <w:r>
+              <w:rPr>
+                <w:noProof/>
+                <w:webHidden/>
+              </w:rPr>
+              <w:instrText xml:space="preserve"> PAGEREF _Toc237254378 \h </w:instrText>
+            </w:r>
+            <w:r>
+              <w:rPr>
+                <w:noProof/>
+                <w:webHidden/>
+              </w:rPr>
+            </w:r>
+            <w:r>
+              <w:rPr>
+                <w:noProof/>
+                <w:webHidden/>
+              </w:rPr>
+              <w:fldChar w:fldCharType="separate"/>
+            </w:r>
+            <w:r>
+              <w:rPr>
+                <w:noProof/>
+                <w:webHidden/>
+              </w:rPr>
+              <w:t>19</w:t>
             </w:r>
             <w:r>
               <w:rPr>
@@ -1796,7 +1934,6 @@
               <w:bCs/>
               <w:noProof/>
             </w:rPr>
-            <w:lastRenderedPageBreak/>
             <w:fldChar w:fldCharType="end"/>
           </w:r>
         </w:p>
@@ -1811,7 +1948,7 @@
       <w:pPr>
         <w:pStyle w:val="Heading1"/>
       </w:pPr>
-      <w:bookmarkStart w:id="0" w:name="_Toc236953719"/>
+      <w:bookmarkStart w:id="0" w:name="_Toc237254353"/>
       <w:r>
         <w:lastRenderedPageBreak/>
         <w:t>Dice Game Program</w:t>
@@ -1822,7 +1959,7 @@
       <w:pPr>
         <w:pStyle w:val="Heading2"/>
       </w:pPr>
-      <w:bookmarkStart w:id="1" w:name="_Toc236953720"/>
+      <w:bookmarkStart w:id="1" w:name="_Toc237254354"/>
       <w:r>
         <w:t>Program introduction</w:t>
       </w:r>
@@ -1858,7 +1995,7 @@
       <w:pPr>
         <w:pStyle w:val="Heading2"/>
       </w:pPr>
-      <w:bookmarkStart w:id="2" w:name="_Toc236953721"/>
+      <w:bookmarkStart w:id="2" w:name="_Toc237254355"/>
       <w:r>
         <w:t>Class Diagram</w:t>
       </w:r>
@@ -2128,14 +2265,14 @@
       <w:pPr>
         <w:pStyle w:val="Heading2"/>
       </w:pPr>
-      <w:bookmarkStart w:id="3" w:name="_Toc236953722"/>
+      <w:bookmarkStart w:id="3" w:name="_Toc237254356"/>
       <w:r>
         <w:t>Class Descriptor</w:t>
       </w:r>
+      <w:r>
+        <w:t xml:space="preserve"> (Main Features Only)</w:t>
+      </w:r>
       <w:bookmarkEnd w:id="3"/>
-      <w:r>
-        <w:t xml:space="preserve"> (Main Features Only)</w:t>
-      </w:r>
     </w:p>
     <w:p>
       <w:r>
@@ -2153,7 +2290,7 @@
       <w:pPr>
         <w:pStyle w:val="Heading3"/>
       </w:pPr>
-      <w:bookmarkStart w:id="4" w:name="_Toc236953723"/>
+      <w:bookmarkStart w:id="4" w:name="_Toc237254357"/>
       <w:r>
         <w:t>Main Class</w:t>
       </w:r>
@@ -2169,7 +2306,7 @@
       <w:pPr>
         <w:pStyle w:val="Heading3"/>
       </w:pPr>
-      <w:bookmarkStart w:id="5" w:name="_Toc236953724"/>
+      <w:bookmarkStart w:id="5" w:name="_Toc237254358"/>
       <w:r>
         <w:t>Dice Game Class</w:t>
       </w:r>
@@ -2187,7 +2324,7 @@
       <w:pPr>
         <w:pStyle w:val="Heading3"/>
       </w:pPr>
-      <w:bookmarkStart w:id="6" w:name="_Toc236953725"/>
+      <w:bookmarkStart w:id="6" w:name="_Toc237254359"/>
       <w:r>
         <w:t>Betting</w:t>
       </w:r>
@@ -2353,7 +2490,7 @@
       <w:pPr>
         <w:pStyle w:val="Heading3"/>
       </w:pPr>
-      <w:bookmarkStart w:id="7" w:name="_Toc236953726"/>
+      <w:bookmarkStart w:id="7" w:name="_Toc237254360"/>
       <w:r>
         <w:lastRenderedPageBreak/>
         <w:t>Dice Rolling Class</w:t>
@@ -2378,7 +2515,7 @@
       <w:pPr>
         <w:pStyle w:val="Heading3"/>
       </w:pPr>
-      <w:bookmarkStart w:id="8" w:name="_Toc236953727"/>
+      <w:bookmarkStart w:id="8" w:name="_Toc237254361"/>
       <w:r>
         <w:t>Reward Conditions</w:t>
       </w:r>
@@ -2408,7 +2545,7 @@
       <w:pPr>
         <w:pStyle w:val="Heading3"/>
       </w:pPr>
-      <w:bookmarkStart w:id="9" w:name="_Toc236953728"/>
+      <w:bookmarkStart w:id="9" w:name="_Toc237254362"/>
       <w:r>
         <w:t>Round Recorder</w:t>
       </w:r>
@@ -2459,7 +2596,7 @@
       <w:pPr>
         <w:pStyle w:val="Heading3"/>
       </w:pPr>
-      <w:bookmarkStart w:id="10" w:name="_Toc236953729"/>
+      <w:bookmarkStart w:id="10" w:name="_Toc237254363"/>
       <w:r>
         <w:t>Scoreboard Class</w:t>
       </w:r>
@@ -2500,7 +2637,7 @@
       <w:pPr>
         <w:pStyle w:val="Heading3"/>
       </w:pPr>
-      <w:bookmarkStart w:id="11" w:name="_Toc236953730"/>
+      <w:bookmarkStart w:id="11" w:name="_Toc237254364"/>
       <w:r>
         <w:t xml:space="preserve">Result </w:t>
       </w:r>
@@ -2533,7 +2670,7 @@
       <w:pPr>
         <w:pStyle w:val="Heading2"/>
       </w:pPr>
-      <w:bookmarkStart w:id="12" w:name="_Toc236953731"/>
+      <w:bookmarkStart w:id="12" w:name="_Toc237254365"/>
       <w:r>
         <w:lastRenderedPageBreak/>
         <w:t>Extensibility Code</w:t>
@@ -2567,7 +2704,7 @@
       <w:pPr>
         <w:pStyle w:val="Heading3"/>
       </w:pPr>
-      <w:bookmarkStart w:id="13" w:name="_Toc236953732"/>
+      <w:bookmarkStart w:id="13" w:name="_Toc237254366"/>
       <w:r>
         <w:t>Separation of Methods</w:t>
       </w:r>
@@ -2595,7 +2732,7 @@
       <w:pPr>
         <w:pStyle w:val="Heading3"/>
       </w:pPr>
-      <w:bookmarkStart w:id="14" w:name="_Toc236953733"/>
+      <w:bookmarkStart w:id="14" w:name="_Toc237254367"/>
       <w:r>
         <w:t>Method Reusability</w:t>
       </w:r>
@@ -2725,7 +2862,7 @@
       <w:pPr>
         <w:pStyle w:val="Heading3"/>
       </w:pPr>
-      <w:bookmarkStart w:id="15" w:name="_Toc236953734"/>
+      <w:bookmarkStart w:id="15" w:name="_Toc237254368"/>
       <w:r>
         <w:lastRenderedPageBreak/>
         <w:t>Reward Condition Class</w:t>
@@ -2742,7 +2879,7 @@
       <w:pPr>
         <w:pStyle w:val="Heading3"/>
       </w:pPr>
-      <w:bookmarkStart w:id="16" w:name="_Toc236953735"/>
+      <w:bookmarkStart w:id="16" w:name="_Toc237254369"/>
       <w:r>
         <w:t>Number of rounds</w:t>
       </w:r>
@@ -2921,7 +3058,7 @@
       <w:pPr>
         <w:pStyle w:val="Heading3"/>
       </w:pPr>
-      <w:bookmarkStart w:id="17" w:name="_Toc236953736"/>
+      <w:bookmarkStart w:id="17" w:name="_Toc237254370"/>
       <w:r>
         <w:t>Sides of die</w:t>
       </w:r>
@@ -3021,7 +3158,7 @@
       <w:pPr>
         <w:pStyle w:val="Heading3"/>
       </w:pPr>
-      <w:bookmarkStart w:id="18" w:name="_Toc236953737"/>
+      <w:bookmarkStart w:id="18" w:name="_Toc237254371"/>
       <w:r>
         <w:t>Number of dice</w:t>
       </w:r>
@@ -3213,7 +3350,7 @@
       <w:pPr>
         <w:pStyle w:val="Heading2"/>
       </w:pPr>
-      <w:bookmarkStart w:id="19" w:name="_Toc236953738"/>
+      <w:bookmarkStart w:id="19" w:name="_Toc237254372"/>
       <w:r>
         <w:lastRenderedPageBreak/>
         <w:t>Advanced Features</w:t>
@@ -3256,7 +3393,7 @@
       <w:pPr>
         <w:pStyle w:val="Heading3"/>
       </w:pPr>
-      <w:bookmarkStart w:id="20" w:name="_Toc236953739"/>
+      <w:bookmarkStart w:id="20" w:name="_Toc237254373"/>
       <w:r>
         <w:t>Variable bet amount</w:t>
       </w:r>
@@ -3351,7 +3488,7 @@
       <w:pPr>
         <w:pStyle w:val="Heading3"/>
       </w:pPr>
-      <w:bookmarkStart w:id="21" w:name="_Toc236953740"/>
+      <w:bookmarkStart w:id="21" w:name="_Toc237254374"/>
       <w:r>
         <w:lastRenderedPageBreak/>
         <w:t>High Score Table</w:t>
@@ -3537,7 +3674,7 @@
       <w:pPr>
         <w:pStyle w:val="Heading2"/>
       </w:pPr>
-      <w:bookmarkStart w:id="22" w:name="_Toc236953741"/>
+      <w:bookmarkStart w:id="22" w:name="_Toc237254375"/>
       <w:r>
         <w:t>Additional Features</w:t>
       </w:r>
@@ -3562,7 +3699,7 @@
       <w:pPr>
         <w:pStyle w:val="Heading3"/>
       </w:pPr>
-      <w:bookmarkStart w:id="23" w:name="_Toc236953742"/>
+      <w:bookmarkStart w:id="23" w:name="_Toc237254376"/>
       <w:r>
         <w:t>Currency Changer</w:t>
       </w:r>
@@ -3858,10 +3995,12 @@
       <w:pPr>
         <w:pStyle w:val="Heading3"/>
       </w:pPr>
+      <w:bookmarkStart w:id="24" w:name="_Toc237254377"/>
       <w:r>
         <w:lastRenderedPageBreak/>
         <w:t>Dice Fighter</w:t>
       </w:r>
+      <w:bookmarkEnd w:id="24"/>
     </w:p>
     <w:p>
       <w:r>
@@ -3877,7 +4016,320 @@
         <w:t xml:space="preserve"> reusability.</w:t>
       </w:r>
     </w:p>
-    <w:p/>
+    <w:p>
+      <w:pPr>
+        <w:keepNext/>
+        <w:jc w:val="center"/>
+      </w:pPr>
+      <w:r>
+        <w:drawing>
+          <wp:inline distT="0" distB="0" distL="0" distR="0" wp14:anchorId="668A1B18" wp14:editId="22B163B5">
+            <wp:extent cx="5943600" cy="5660390"/>
+            <wp:effectExtent l="19050" t="19050" r="19050" b="16510"/>
+            <wp:docPr id="868493861" name="Picture 1"/>
+            <wp:cNvGraphicFramePr>
+              <a:graphicFrameLocks xmlns:a="http://schemas.openxmlformats.org/drawingml/2006/main" noChangeAspect="1"/>
+            </wp:cNvGraphicFramePr>
+            <a:graphic xmlns:a="http://schemas.openxmlformats.org/drawingml/2006/main">
+              <a:graphicData uri="http://schemas.openxmlformats.org/drawingml/2006/picture">
+                <pic:pic xmlns:pic="http://schemas.openxmlformats.org/drawingml/2006/picture">
+                  <pic:nvPicPr>
+                    <pic:cNvPr id="868493861" name=""/>
+                    <pic:cNvPicPr/>
+                  </pic:nvPicPr>
+                  <pic:blipFill>
+                    <a:blip r:embed="rId20"/>
+                    <a:stretch>
+                      <a:fillRect/>
+                    </a:stretch>
+                  </pic:blipFill>
+                  <pic:spPr>
+                    <a:xfrm>
+                      <a:off x="0" y="0"/>
+                      <a:ext cx="5943600" cy="5660390"/>
+                    </a:xfrm>
+                    <a:prstGeom prst="rect">
+                      <a:avLst/>
+                    </a:prstGeom>
+                    <a:ln>
+                      <a:solidFill>
+                        <a:schemeClr val="tx1"/>
+                      </a:solidFill>
+                    </a:ln>
+                  </pic:spPr>
+                </pic:pic>
+              </a:graphicData>
+            </a:graphic>
+          </wp:inline>
+        </w:drawing>
+      </w:r>
+    </w:p>
+    <w:p>
+      <w:pPr>
+        <w:jc w:val="center"/>
+      </w:pPr>
+      <w:r>
+        <w:t xml:space="preserve">Figure </w:t>
+      </w:r>
+      <w:fldSimple w:instr=" SEQ Figure \* ARABIC ">
+        <w:r>
+          <w:rPr>
+            <w:noProof/>
+          </w:rPr>
+          <w:t>13</w:t>
+        </w:r>
+      </w:fldSimple>
+      <w:r>
+        <w:t xml:space="preserve"> Dice Fighter game code</w:t>
+      </w:r>
+    </w:p>
+    <w:p>
+      <w:r>
+        <w:t xml:space="preserve">Every code was written in a single class and like dice poker, the user is expected to play a specific number of rounds. The game is called from dice game text, where initially had only dice poker </w:t>
+      </w:r>
+      <w:r>
+        <w:lastRenderedPageBreak/>
+        <w:t xml:space="preserve">call. Now after adding dice fighter, there is a conditional statement in dice game where it </w:t>
+      </w:r>
+      <w:proofErr w:type="gramStart"/>
+      <w:r>
+        <w:t>ask</w:t>
+      </w:r>
+      <w:proofErr w:type="gramEnd"/>
+      <w:r>
+        <w:t xml:space="preserve"> users if they want to play dice fighter or dice poker.</w:t>
+      </w:r>
+    </w:p>
+    <w:p>
+      <w:pPr>
+        <w:keepNext/>
+        <w:jc w:val="center"/>
+      </w:pPr>
+      <w:r>
+        <w:drawing>
+          <wp:inline distT="0" distB="0" distL="0" distR="0" wp14:anchorId="50ABA2D4" wp14:editId="40B5142B">
+            <wp:extent cx="3067478" cy="1362265"/>
+            <wp:effectExtent l="19050" t="19050" r="19050" b="28575"/>
+            <wp:docPr id="14797279" name="Picture 1"/>
+            <wp:cNvGraphicFramePr>
+              <a:graphicFrameLocks xmlns:a="http://schemas.openxmlformats.org/drawingml/2006/main" noChangeAspect="1"/>
+            </wp:cNvGraphicFramePr>
+            <a:graphic xmlns:a="http://schemas.openxmlformats.org/drawingml/2006/main">
+              <a:graphicData uri="http://schemas.openxmlformats.org/drawingml/2006/picture">
+                <pic:pic xmlns:pic="http://schemas.openxmlformats.org/drawingml/2006/picture">
+                  <pic:nvPicPr>
+                    <pic:cNvPr id="14797279" name=""/>
+                    <pic:cNvPicPr/>
+                  </pic:nvPicPr>
+                  <pic:blipFill>
+                    <a:blip r:embed="rId21"/>
+                    <a:stretch>
+                      <a:fillRect/>
+                    </a:stretch>
+                  </pic:blipFill>
+                  <pic:spPr>
+                    <a:xfrm>
+                      <a:off x="0" y="0"/>
+                      <a:ext cx="3067478" cy="1362265"/>
+                    </a:xfrm>
+                    <a:prstGeom prst="rect">
+                      <a:avLst/>
+                    </a:prstGeom>
+                    <a:ln>
+                      <a:solidFill>
+                        <a:schemeClr val="tx1"/>
+                      </a:solidFill>
+                    </a:ln>
+                  </pic:spPr>
+                </pic:pic>
+              </a:graphicData>
+            </a:graphic>
+          </wp:inline>
+        </w:drawing>
+      </w:r>
+    </w:p>
+    <w:p>
+      <w:pPr>
+        <w:jc w:val="center"/>
+      </w:pPr>
+      <w:r>
+        <w:t xml:space="preserve">Figure </w:t>
+      </w:r>
+      <w:fldSimple w:instr=" SEQ Figure \* ARABIC ">
+        <w:r>
+          <w:rPr>
+            <w:noProof/>
+          </w:rPr>
+          <w:t>14</w:t>
+        </w:r>
+      </w:fldSimple>
+      <w:r>
+        <w:t xml:space="preserve"> Game selection</w:t>
+      </w:r>
+    </w:p>
+    <w:p>
+      <w:pPr>
+        <w:keepNext/>
+        <w:jc w:val="center"/>
+      </w:pPr>
+      <w:r>
+        <w:drawing>
+          <wp:inline distT="0" distB="0" distL="0" distR="0" wp14:anchorId="66A75883" wp14:editId="7C7772DF">
+            <wp:extent cx="5943600" cy="4530725"/>
+            <wp:effectExtent l="19050" t="19050" r="19050" b="22225"/>
+            <wp:docPr id="699261670" name="Picture 1"/>
+            <wp:cNvGraphicFramePr>
+              <a:graphicFrameLocks xmlns:a="http://schemas.openxmlformats.org/drawingml/2006/main" noChangeAspect="1"/>
+            </wp:cNvGraphicFramePr>
+            <a:graphic xmlns:a="http://schemas.openxmlformats.org/drawingml/2006/main">
+              <a:graphicData uri="http://schemas.openxmlformats.org/drawingml/2006/picture">
+                <pic:pic xmlns:pic="http://schemas.openxmlformats.org/drawingml/2006/picture">
+                  <pic:nvPicPr>
+                    <pic:cNvPr id="699261670" name=""/>
+                    <pic:cNvPicPr/>
+                  </pic:nvPicPr>
+                  <pic:blipFill>
+                    <a:blip r:embed="rId22"/>
+                    <a:stretch>
+                      <a:fillRect/>
+                    </a:stretch>
+                  </pic:blipFill>
+                  <pic:spPr>
+                    <a:xfrm>
+                      <a:off x="0" y="0"/>
+                      <a:ext cx="5943600" cy="4530725"/>
+                    </a:xfrm>
+                    <a:prstGeom prst="rect">
+                      <a:avLst/>
+                    </a:prstGeom>
+                    <a:ln>
+                      <a:solidFill>
+                        <a:schemeClr val="tx1"/>
+                      </a:solidFill>
+                    </a:ln>
+                  </pic:spPr>
+                </pic:pic>
+              </a:graphicData>
+            </a:graphic>
+          </wp:inline>
+        </w:drawing>
+      </w:r>
+    </w:p>
+    <w:p>
+      <w:pPr>
+        <w:jc w:val="center"/>
+      </w:pPr>
+      <w:r>
+        <w:t xml:space="preserve">Figure </w:t>
+      </w:r>
+      <w:fldSimple w:instr=" SEQ Figure \* ARABIC ">
+        <w:r>
+          <w:rPr>
+            <w:noProof/>
+          </w:rPr>
+          <w:t>15</w:t>
+        </w:r>
+      </w:fldSimple>
+      <w:r>
+        <w:t xml:space="preserve"> Dice game class modification</w:t>
+      </w:r>
+    </w:p>
+    <w:p>
+      <w:r>
+        <w:t>This additional feature is added to ensure that code blocks are reusable.</w:t>
+      </w:r>
+    </w:p>
+    <w:p>
+      <w:pPr>
+        <w:pStyle w:val="Heading3"/>
+      </w:pPr>
+      <w:bookmarkStart w:id="25" w:name="_Toc237254378"/>
+      <w:r>
+        <w:lastRenderedPageBreak/>
+        <w:t>Updated Class Diagram</w:t>
+      </w:r>
+      <w:bookmarkEnd w:id="25"/>
+    </w:p>
+    <w:p>
+      <w:pPr>
+        <w:keepNext/>
+        <w:jc w:val="center"/>
+      </w:pPr>
+      <w:r>
+        <w:rPr>
+          <w:noProof/>
+        </w:rPr>
+        <w:drawing>
+          <wp:inline distT="0" distB="0" distL="0" distR="0" wp14:anchorId="6D26F8E4" wp14:editId="7F3DF882">
+            <wp:extent cx="5943600" cy="3190875"/>
+            <wp:effectExtent l="19050" t="19050" r="19050" b="28575"/>
+            <wp:docPr id="1200630549" name="Picture 1"/>
+            <wp:cNvGraphicFramePr>
+              <a:graphicFrameLocks xmlns:a="http://schemas.openxmlformats.org/drawingml/2006/main" noChangeAspect="1"/>
+            </wp:cNvGraphicFramePr>
+            <a:graphic xmlns:a="http://schemas.openxmlformats.org/drawingml/2006/main">
+              <a:graphicData uri="http://schemas.openxmlformats.org/drawingml/2006/picture">
+                <pic:pic xmlns:pic="http://schemas.openxmlformats.org/drawingml/2006/picture">
+                  <pic:nvPicPr>
+                    <pic:cNvPr id="0" name="Picture 1"/>
+                    <pic:cNvPicPr>
+                      <a:picLocks noChangeAspect="1" noChangeArrowheads="1"/>
+                    </pic:cNvPicPr>
+                  </pic:nvPicPr>
+                  <pic:blipFill>
+                    <a:blip r:embed="rId23">
+                      <a:extLst>
+                        <a:ext uri="{28A0092B-C50C-407E-A947-70E740481C1C}">
+                          <a14:useLocalDpi xmlns:a14="http://schemas.microsoft.com/office/drawing/2010/main" val="0"/>
+                        </a:ext>
+                      </a:extLst>
+                    </a:blip>
+                    <a:srcRect/>
+                    <a:stretch>
+                      <a:fillRect/>
+                    </a:stretch>
+                  </pic:blipFill>
+                  <pic:spPr bwMode="auto">
+                    <a:xfrm>
+                      <a:off x="0" y="0"/>
+                      <a:ext cx="5943600" cy="3190875"/>
+                    </a:xfrm>
+                    <a:prstGeom prst="rect">
+                      <a:avLst/>
+                    </a:prstGeom>
+                    <a:noFill/>
+                    <a:ln>
+                      <a:solidFill>
+                        <a:schemeClr val="tx1"/>
+                      </a:solidFill>
+                    </a:ln>
+                  </pic:spPr>
+                </pic:pic>
+              </a:graphicData>
+            </a:graphic>
+          </wp:inline>
+        </w:drawing>
+      </w:r>
+    </w:p>
+    <w:p>
+      <w:pPr>
+        <w:jc w:val="center"/>
+      </w:pPr>
+      <w:r>
+        <w:t xml:space="preserve">Figure </w:t>
+      </w:r>
+      <w:fldSimple w:instr=" SEQ Figure \* ARABIC ">
+        <w:r>
+          <w:rPr>
+            <w:noProof/>
+          </w:rPr>
+          <w:t>16</w:t>
+        </w:r>
+      </w:fldSimple>
+      <w:r>
+        <w:t xml:space="preserve"> Updated Class Diagram</w:t>
+      </w:r>
+    </w:p>
     <w:sectPr>
       <w:pgSz w:w="12240" w:h="15840"/>
       <w:pgMar w:top="1440" w:right="1440" w:bottom="1440" w:left="1440" w:header="720" w:footer="720" w:gutter="0"/>

</xml_diff>

<commit_message>
Final Java Project update
</commit_message>
<xml_diff>
--- a/Java School Projects/40841063_HLUM HTET AUNG Coursework 2/40841063_Part 2 - Software Development Report.docx
+++ b/Java School Projects/40841063_HLUM HTET AUNG Coursework 2/40841063_Part 2 - Software Development Report.docx
@@ -4,91 +4,2331 @@
   <w:body>
     <w:p>
       <w:pPr>
-        <w:jc w:val="center"/>
-      </w:pPr>
+        <w:pStyle w:val="BodyText"/>
+        <w:rPr>
+          <w:rFonts w:ascii="Times New Roman"/>
+          <w:sz w:val="36"/>
+        </w:rPr>
+      </w:pPr>
+    </w:p>
+    <w:p>
+      <w:pPr>
+        <w:pStyle w:val="BodyText"/>
+        <w:rPr>
+          <w:rFonts w:ascii="Times New Roman"/>
+          <w:sz w:val="36"/>
+        </w:rPr>
+      </w:pPr>
+    </w:p>
+    <w:p>
+      <w:pPr>
+        <w:pStyle w:val="BodyText"/>
+        <w:spacing w:before="132"/>
+        <w:rPr>
+          <w:rFonts w:ascii="Times New Roman"/>
+          <w:sz w:val="36"/>
+        </w:rPr>
+      </w:pPr>
+    </w:p>
+    <w:p>
+      <w:pPr>
+        <w:pStyle w:val="Heading1"/>
+      </w:pPr>
+      <w:bookmarkStart w:id="0" w:name="_Toc237343941"/>
+      <w:r>
+        <w:rPr>
+          <w:noProof/>
+        </w:rPr>
+        <w:drawing>
+          <wp:anchor distT="0" distB="0" distL="0" distR="0" simplePos="0" relativeHeight="251659264" behindDoc="0" locked="0" layoutInCell="1" allowOverlap="1" wp14:anchorId="0AC2EBC1" wp14:editId="72DB149D">
+            <wp:simplePos x="0" y="0"/>
+            <wp:positionH relativeFrom="page">
+              <wp:posOffset>4147184</wp:posOffset>
+            </wp:positionH>
+            <wp:positionV relativeFrom="paragraph">
+              <wp:posOffset>-874581</wp:posOffset>
+            </wp:positionV>
+            <wp:extent cx="2863215" cy="813986"/>
+            <wp:effectExtent l="0" t="0" r="0" b="0"/>
+            <wp:wrapNone/>
+            <wp:docPr id="1" name="Image 1" descr="A black background with a black square  Description automatically generated with medium confidence"/>
+            <wp:cNvGraphicFramePr>
+              <a:graphicFrameLocks xmlns:a="http://schemas.openxmlformats.org/drawingml/2006/main"/>
+            </wp:cNvGraphicFramePr>
+            <a:graphic xmlns:a="http://schemas.openxmlformats.org/drawingml/2006/main">
+              <a:graphicData uri="http://schemas.openxmlformats.org/drawingml/2006/picture">
+                <pic:pic xmlns:pic="http://schemas.openxmlformats.org/drawingml/2006/picture">
+                  <pic:nvPicPr>
+                    <pic:cNvPr id="1" name="Image 1" descr="A black background with a black square  Description automatically generated with medium confidence"/>
+                    <pic:cNvPicPr/>
+                  </pic:nvPicPr>
+                  <pic:blipFill>
+                    <a:blip r:embed="rId8" cstate="print"/>
+                    <a:stretch>
+                      <a:fillRect/>
+                    </a:stretch>
+                  </pic:blipFill>
+                  <pic:spPr>
+                    <a:xfrm>
+                      <a:off x="0" y="0"/>
+                      <a:ext cx="2863215" cy="813986"/>
+                    </a:xfrm>
+                    <a:prstGeom prst="rect">
+                      <a:avLst/>
+                    </a:prstGeom>
+                  </pic:spPr>
+                </pic:pic>
+              </a:graphicData>
+            </a:graphic>
+          </wp:anchor>
+        </w:drawing>
+      </w:r>
+      <w:r>
+        <w:t>ASSESSMENT</w:t>
+      </w:r>
+      <w:r>
+        <w:rPr>
+          <w:spacing w:val="-10"/>
+        </w:rPr>
+        <w:t xml:space="preserve"> </w:t>
+      </w:r>
+      <w:r>
+        <w:t>COVER</w:t>
+      </w:r>
+      <w:r>
+        <w:rPr>
+          <w:spacing w:val="-12"/>
+        </w:rPr>
+        <w:t xml:space="preserve"> </w:t>
+      </w:r>
+      <w:r>
+        <w:rPr>
+          <w:spacing w:val="-4"/>
+        </w:rPr>
+        <w:t>SHEET</w:t>
+      </w:r>
+      <w:bookmarkEnd w:id="0"/>
+    </w:p>
+    <w:p>
+      <w:pPr>
+        <w:rPr>
+          <w:rFonts w:ascii="Arial"/>
+          <w:b/>
+          <w:sz w:val="36"/>
+        </w:rPr>
+      </w:pPr>
+      <w:r>
+        <w:rPr>
+          <w:rFonts w:ascii="Arial"/>
+          <w:b/>
+          <w:color w:val="FF0000"/>
+          <w:sz w:val="36"/>
+        </w:rPr>
+        <w:t>(To</w:t>
+      </w:r>
+      <w:r>
+        <w:rPr>
+          <w:rFonts w:ascii="Arial"/>
+          <w:b/>
+          <w:color w:val="FF0000"/>
+          <w:spacing w:val="-5"/>
+          <w:sz w:val="36"/>
+        </w:rPr>
+        <w:t xml:space="preserve"> </w:t>
+      </w:r>
+      <w:r>
+        <w:rPr>
+          <w:rFonts w:ascii="Arial"/>
+          <w:b/>
+          <w:color w:val="FF0000"/>
+          <w:sz w:val="36"/>
+        </w:rPr>
+        <w:t>be</w:t>
+      </w:r>
+      <w:r>
+        <w:rPr>
+          <w:rFonts w:ascii="Arial"/>
+          <w:b/>
+          <w:color w:val="FF0000"/>
+          <w:spacing w:val="-3"/>
+          <w:sz w:val="36"/>
+        </w:rPr>
+        <w:t xml:space="preserve"> </w:t>
+      </w:r>
+      <w:r>
+        <w:rPr>
+          <w:rFonts w:ascii="Arial"/>
+          <w:b/>
+          <w:color w:val="FF0000"/>
+          <w:sz w:val="36"/>
+        </w:rPr>
+        <w:t>adapted</w:t>
+      </w:r>
+      <w:r>
+        <w:rPr>
+          <w:rFonts w:ascii="Arial"/>
+          <w:b/>
+          <w:color w:val="FF0000"/>
+          <w:spacing w:val="-2"/>
+          <w:sz w:val="36"/>
+        </w:rPr>
+        <w:t xml:space="preserve"> </w:t>
+      </w:r>
+      <w:r>
+        <w:rPr>
+          <w:rFonts w:ascii="Arial"/>
+          <w:b/>
+          <w:color w:val="FF0000"/>
+          <w:sz w:val="36"/>
+        </w:rPr>
+        <w:t>as</w:t>
+      </w:r>
+      <w:r>
+        <w:rPr>
+          <w:rFonts w:ascii="Arial"/>
+          <w:b/>
+          <w:color w:val="FF0000"/>
+          <w:spacing w:val="-4"/>
+          <w:sz w:val="36"/>
+        </w:rPr>
+        <w:t xml:space="preserve"> </w:t>
+      </w:r>
+      <w:r>
+        <w:rPr>
+          <w:rFonts w:ascii="Arial"/>
+          <w:b/>
+          <w:color w:val="FF0000"/>
+          <w:sz w:val="36"/>
+        </w:rPr>
+        <w:t>needed</w:t>
+      </w:r>
+      <w:r>
+        <w:rPr>
+          <w:rFonts w:ascii="Arial"/>
+          <w:b/>
+          <w:color w:val="FF0000"/>
+          <w:spacing w:val="-2"/>
+          <w:sz w:val="36"/>
+        </w:rPr>
+        <w:t xml:space="preserve"> </w:t>
+      </w:r>
+      <w:r>
+        <w:rPr>
+          <w:rFonts w:ascii="Arial"/>
+          <w:b/>
+          <w:color w:val="FF0000"/>
+          <w:sz w:val="36"/>
+        </w:rPr>
+        <w:t>on</w:t>
+      </w:r>
+      <w:r>
+        <w:rPr>
+          <w:rFonts w:ascii="Arial"/>
+          <w:b/>
+          <w:color w:val="FF0000"/>
+          <w:spacing w:val="-2"/>
+          <w:sz w:val="36"/>
+        </w:rPr>
+        <w:t xml:space="preserve"> </w:t>
+      </w:r>
+      <w:r>
+        <w:rPr>
+          <w:rFonts w:ascii="Arial"/>
+          <w:b/>
+          <w:color w:val="FF0000"/>
+          <w:sz w:val="36"/>
+        </w:rPr>
+        <w:t>module/school</w:t>
+      </w:r>
+      <w:r>
+        <w:rPr>
+          <w:rFonts w:ascii="Arial"/>
+          <w:b/>
+          <w:color w:val="FF0000"/>
+          <w:spacing w:val="-3"/>
+          <w:sz w:val="36"/>
+        </w:rPr>
+        <w:t xml:space="preserve"> </w:t>
+      </w:r>
+      <w:r>
+        <w:rPr>
+          <w:rFonts w:ascii="Arial"/>
+          <w:b/>
+          <w:color w:val="FF0000"/>
+          <w:spacing w:val="-2"/>
+          <w:sz w:val="36"/>
+        </w:rPr>
+        <w:t>basis)</w:t>
+      </w:r>
+    </w:p>
+    <w:p>
+      <w:pPr>
+        <w:rPr>
+          <w:rFonts w:ascii="Arial"/>
+          <w:i/>
+        </w:rPr>
+      </w:pPr>
+      <w:r>
+        <w:rPr>
+          <w:rFonts w:ascii="Arial"/>
+          <w:i/>
+          <w:sz w:val="22"/>
+        </w:rPr>
+        <w:t>Please complete this cover sheet for each assessment submission. For group assessments, please</w:t>
+      </w:r>
+      <w:r>
+        <w:rPr>
+          <w:rFonts w:ascii="Arial"/>
+          <w:i/>
+          <w:spacing w:val="-3"/>
+          <w:sz w:val="22"/>
+        </w:rPr>
+        <w:t xml:space="preserve"> </w:t>
+      </w:r>
+      <w:r>
+        <w:rPr>
+          <w:rFonts w:ascii="Arial"/>
+          <w:i/>
+          <w:sz w:val="22"/>
+        </w:rPr>
+        <w:t>ensure</w:t>
+      </w:r>
+      <w:r>
+        <w:rPr>
+          <w:rFonts w:ascii="Arial"/>
+          <w:i/>
+          <w:spacing w:val="-5"/>
+          <w:sz w:val="22"/>
+        </w:rPr>
+        <w:t xml:space="preserve"> </w:t>
+      </w:r>
+      <w:r>
+        <w:rPr>
+          <w:rFonts w:ascii="Arial"/>
+          <w:i/>
+          <w:sz w:val="22"/>
+        </w:rPr>
+        <w:t>each</w:t>
+      </w:r>
+      <w:r>
+        <w:rPr>
+          <w:rFonts w:ascii="Arial"/>
+          <w:i/>
+          <w:spacing w:val="-3"/>
+          <w:sz w:val="22"/>
+        </w:rPr>
+        <w:t xml:space="preserve"> </w:t>
+      </w:r>
+      <w:r>
+        <w:rPr>
+          <w:rFonts w:ascii="Arial"/>
+          <w:i/>
+          <w:sz w:val="22"/>
+        </w:rPr>
+        <w:t>group</w:t>
+      </w:r>
+      <w:r>
+        <w:rPr>
+          <w:rFonts w:ascii="Arial"/>
+          <w:i/>
+          <w:spacing w:val="-3"/>
+          <w:sz w:val="22"/>
+        </w:rPr>
+        <w:t xml:space="preserve"> </w:t>
+      </w:r>
+      <w:r>
+        <w:rPr>
+          <w:rFonts w:ascii="Arial"/>
+          <w:i/>
+          <w:sz w:val="22"/>
+        </w:rPr>
+        <w:t>member</w:t>
+      </w:r>
+      <w:r>
+        <w:rPr>
+          <w:rFonts w:ascii="Arial"/>
+          <w:i/>
+          <w:spacing w:val="-4"/>
+          <w:sz w:val="22"/>
+        </w:rPr>
+        <w:t xml:space="preserve"> </w:t>
+      </w:r>
+      <w:r>
+        <w:rPr>
+          <w:rFonts w:ascii="Arial"/>
+          <w:i/>
+          <w:sz w:val="22"/>
+        </w:rPr>
+        <w:t>completes</w:t>
+      </w:r>
+      <w:r>
+        <w:rPr>
+          <w:rFonts w:ascii="Arial"/>
+          <w:i/>
+          <w:spacing w:val="-5"/>
+          <w:sz w:val="22"/>
+        </w:rPr>
+        <w:t xml:space="preserve"> </w:t>
+      </w:r>
+      <w:r>
+        <w:rPr>
+          <w:rFonts w:ascii="Arial"/>
+          <w:i/>
+          <w:sz w:val="22"/>
+        </w:rPr>
+        <w:t>and</w:t>
+      </w:r>
+      <w:r>
+        <w:rPr>
+          <w:rFonts w:ascii="Arial"/>
+          <w:i/>
+          <w:spacing w:val="-1"/>
+          <w:sz w:val="22"/>
+        </w:rPr>
+        <w:t xml:space="preserve"> </w:t>
+      </w:r>
+      <w:r>
+        <w:rPr>
+          <w:rFonts w:ascii="Arial"/>
+          <w:i/>
+          <w:sz w:val="22"/>
+        </w:rPr>
+        <w:t>submits</w:t>
+      </w:r>
+      <w:r>
+        <w:rPr>
+          <w:rFonts w:ascii="Arial"/>
+          <w:i/>
+          <w:spacing w:val="-2"/>
+          <w:sz w:val="22"/>
+        </w:rPr>
+        <w:t xml:space="preserve"> </w:t>
+      </w:r>
+      <w:r>
+        <w:rPr>
+          <w:rFonts w:ascii="Arial"/>
+          <w:i/>
+          <w:sz w:val="22"/>
+        </w:rPr>
+        <w:t>a</w:t>
+      </w:r>
+      <w:r>
+        <w:rPr>
+          <w:rFonts w:ascii="Arial"/>
+          <w:i/>
+          <w:spacing w:val="-5"/>
+          <w:sz w:val="22"/>
+        </w:rPr>
+        <w:t xml:space="preserve"> </w:t>
+      </w:r>
+      <w:r>
+        <w:rPr>
+          <w:rFonts w:ascii="Arial"/>
+          <w:i/>
+          <w:sz w:val="22"/>
+        </w:rPr>
+        <w:t>completed</w:t>
+      </w:r>
+      <w:r>
+        <w:rPr>
+          <w:rFonts w:ascii="Arial"/>
+          <w:i/>
+          <w:spacing w:val="-3"/>
+          <w:sz w:val="22"/>
+        </w:rPr>
+        <w:t xml:space="preserve"> </w:t>
+      </w:r>
+      <w:r>
+        <w:rPr>
+          <w:rFonts w:ascii="Arial"/>
+          <w:i/>
+          <w:sz w:val="22"/>
+        </w:rPr>
+        <w:t>individual</w:t>
+      </w:r>
+      <w:r>
+        <w:rPr>
+          <w:rFonts w:ascii="Arial"/>
+          <w:i/>
+          <w:spacing w:val="-4"/>
+          <w:sz w:val="22"/>
+        </w:rPr>
+        <w:t xml:space="preserve"> </w:t>
+      </w:r>
+      <w:r>
+        <w:rPr>
+          <w:rFonts w:ascii="Arial"/>
+          <w:i/>
+          <w:sz w:val="22"/>
+        </w:rPr>
+        <w:t>cover</w:t>
+      </w:r>
+      <w:r>
+        <w:rPr>
+          <w:rFonts w:ascii="Arial"/>
+          <w:i/>
+          <w:spacing w:val="-2"/>
+          <w:sz w:val="22"/>
+        </w:rPr>
+        <w:t xml:space="preserve"> </w:t>
+      </w:r>
+      <w:r>
+        <w:rPr>
+          <w:rFonts w:ascii="Arial"/>
+          <w:i/>
+          <w:sz w:val="22"/>
+        </w:rPr>
+        <w:t>sheet.</w:t>
+      </w:r>
+    </w:p>
+    <w:p>
+      <w:r>
+        <w:rPr>
+          <w:rFonts w:ascii="Arial"/>
+          <w:b/>
+        </w:rPr>
+        <w:t>STUDENT</w:t>
+      </w:r>
+      <w:r>
+        <w:rPr>
+          <w:rFonts w:ascii="Arial"/>
+          <w:b/>
+          <w:spacing w:val="-5"/>
+        </w:rPr>
+        <w:t xml:space="preserve"> </w:t>
+      </w:r>
+      <w:r>
+        <w:rPr>
+          <w:rFonts w:ascii="Arial"/>
+          <w:b/>
+        </w:rPr>
+        <w:t>(REGISTRATION)</w:t>
+      </w:r>
+      <w:r>
+        <w:rPr>
+          <w:rFonts w:ascii="Arial"/>
+          <w:b/>
+          <w:spacing w:val="-7"/>
+        </w:rPr>
+        <w:t xml:space="preserve"> </w:t>
+      </w:r>
+      <w:r>
+        <w:rPr>
+          <w:rFonts w:ascii="Arial"/>
+          <w:b/>
+        </w:rPr>
+        <w:t>NUMBER:</w:t>
+      </w:r>
+      <w:r>
+        <w:rPr>
+          <w:rFonts w:ascii="Arial"/>
+          <w:b/>
+          <w:spacing w:val="-4"/>
+        </w:rPr>
+        <w:t xml:space="preserve"> </w:t>
+      </w:r>
+      <w:r>
+        <w:rPr>
+          <w:b/>
+          <w:bCs/>
+        </w:rPr>
+        <w:t>40841063</w:t>
+      </w:r>
+    </w:p>
+    <w:p>
+      <w:pPr>
+        <w:rPr>
+          <w:sz w:val="14"/>
+        </w:rPr>
+      </w:pPr>
+      <w:r>
+        <w:rPr>
+          <w:noProof/>
+          <w:sz w:val="14"/>
+        </w:rPr>
+        <mc:AlternateContent>
+          <mc:Choice Requires="wps">
+            <w:drawing>
+              <wp:anchor distT="0" distB="0" distL="0" distR="0" simplePos="0" relativeHeight="251660288" behindDoc="1" locked="0" layoutInCell="1" allowOverlap="1" wp14:anchorId="59B2D281" wp14:editId="5877A168">
+                <wp:simplePos x="0" y="0"/>
+                <wp:positionH relativeFrom="page">
+                  <wp:posOffset>711200</wp:posOffset>
+                </wp:positionH>
+                <wp:positionV relativeFrom="paragraph">
+                  <wp:posOffset>121285</wp:posOffset>
+                </wp:positionV>
+                <wp:extent cx="6197600" cy="499110"/>
+                <wp:effectExtent l="0" t="0" r="12700" b="15240"/>
+                <wp:wrapTopAndBottom/>
+                <wp:docPr id="2" name="Textbox 2"/>
+                <wp:cNvGraphicFramePr>
+                  <a:graphicFrameLocks xmlns:a="http://schemas.openxmlformats.org/drawingml/2006/main"/>
+                </wp:cNvGraphicFramePr>
+                <a:graphic xmlns:a="http://schemas.openxmlformats.org/drawingml/2006/main">
+                  <a:graphicData uri="http://schemas.microsoft.com/office/word/2010/wordprocessingShape">
+                    <wps:wsp>
+                      <wps:cNvSpPr txBox="1">
+                        <a:spLocks/>
+                      </wps:cNvSpPr>
+                      <wps:spPr>
+                        <a:xfrm>
+                          <a:off x="0" y="0"/>
+                          <a:ext cx="6197600" cy="499110"/>
+                        </a:xfrm>
+                        <a:prstGeom prst="rect">
+                          <a:avLst/>
+                        </a:prstGeom>
+                        <a:ln w="6096">
+                          <a:solidFill>
+                            <a:srgbClr val="808080"/>
+                          </a:solidFill>
+                          <a:prstDash val="solid"/>
+                        </a:ln>
+                      </wps:spPr>
+                      <wps:txbx>
+                        <w:txbxContent>
+                          <w:p>
+                            <w:pPr>
+                              <w:spacing w:before="20"/>
+                              <w:ind w:left="972" w:right="198" w:hanging="771"/>
+                              <w:rPr>
+                                <w:rFonts w:ascii="Arial" w:hAnsi="Arial"/>
+                                <w:i/>
+                              </w:rPr>
+                            </w:pPr>
+                            <w:r>
+                              <w:rPr>
+                                <w:rFonts w:ascii="Arial" w:hAnsi="Arial"/>
+                                <w:i/>
+                                <w:sz w:val="22"/>
+                              </w:rPr>
+                              <w:t>Please</w:t>
+                            </w:r>
+                            <w:r>
+                              <w:rPr>
+                                <w:rFonts w:ascii="Arial" w:hAnsi="Arial"/>
+                                <w:i/>
+                                <w:spacing w:val="-2"/>
+                                <w:sz w:val="22"/>
+                              </w:rPr>
+                              <w:t xml:space="preserve"> </w:t>
+                            </w:r>
+                            <w:r>
+                              <w:rPr>
+                                <w:rFonts w:ascii="Arial" w:hAnsi="Arial"/>
+                                <w:i/>
+                                <w:sz w:val="22"/>
+                              </w:rPr>
+                              <w:t>ensure</w:t>
+                            </w:r>
+                            <w:r>
+                              <w:rPr>
+                                <w:rFonts w:ascii="Arial" w:hAnsi="Arial"/>
+                                <w:i/>
+                                <w:spacing w:val="-4"/>
+                                <w:sz w:val="22"/>
+                              </w:rPr>
+                              <w:t xml:space="preserve"> </w:t>
+                            </w:r>
+                            <w:r>
+                              <w:rPr>
+                                <w:rFonts w:ascii="Arial" w:hAnsi="Arial"/>
+                                <w:i/>
+                                <w:sz w:val="22"/>
+                              </w:rPr>
+                              <w:t>that you</w:t>
+                            </w:r>
+                            <w:r>
+                              <w:rPr>
+                                <w:rFonts w:ascii="Arial" w:hAnsi="Arial"/>
+                                <w:i/>
+                                <w:spacing w:val="-4"/>
+                                <w:sz w:val="22"/>
+                              </w:rPr>
+                              <w:t xml:space="preserve"> </w:t>
+                            </w:r>
+                            <w:r>
+                              <w:rPr>
+                                <w:rFonts w:ascii="Arial" w:hAnsi="Arial"/>
+                                <w:i/>
+                                <w:sz w:val="22"/>
+                              </w:rPr>
+                              <w:t>have</w:t>
+                            </w:r>
+                            <w:r>
+                              <w:rPr>
+                                <w:rFonts w:ascii="Arial" w:hAnsi="Arial"/>
+                                <w:i/>
+                                <w:spacing w:val="-2"/>
+                                <w:sz w:val="22"/>
+                              </w:rPr>
+                              <w:t xml:space="preserve"> </w:t>
+                            </w:r>
+                            <w:r>
+                              <w:rPr>
+                                <w:rFonts w:ascii="Arial" w:hAnsi="Arial"/>
+                                <w:i/>
+                                <w:sz w:val="22"/>
+                              </w:rPr>
+                              <w:t>removed</w:t>
+                            </w:r>
+                            <w:r>
+                              <w:rPr>
+                                <w:rFonts w:ascii="Arial" w:hAnsi="Arial"/>
+                                <w:i/>
+                                <w:spacing w:val="-4"/>
+                                <w:sz w:val="22"/>
+                              </w:rPr>
+                              <w:t xml:space="preserve"> </w:t>
+                            </w:r>
+                            <w:r>
+                              <w:rPr>
+                                <w:rFonts w:ascii="Arial" w:hAnsi="Arial"/>
+                                <w:i/>
+                                <w:sz w:val="22"/>
+                              </w:rPr>
+                              <w:t>your</w:t>
+                            </w:r>
+                            <w:r>
+                              <w:rPr>
+                                <w:rFonts w:ascii="Arial" w:hAnsi="Arial"/>
+                                <w:i/>
+                                <w:spacing w:val="-3"/>
+                                <w:sz w:val="22"/>
+                              </w:rPr>
+                              <w:t xml:space="preserve"> </w:t>
+                            </w:r>
+                            <w:r>
+                              <w:rPr>
+                                <w:rFonts w:ascii="Arial" w:hAnsi="Arial"/>
+                                <w:i/>
+                                <w:sz w:val="22"/>
+                              </w:rPr>
+                              <w:t>name</w:t>
+                            </w:r>
+                            <w:r>
+                              <w:rPr>
+                                <w:rFonts w:ascii="Arial" w:hAnsi="Arial"/>
+                                <w:i/>
+                                <w:spacing w:val="-6"/>
+                                <w:sz w:val="22"/>
+                              </w:rPr>
+                              <w:t xml:space="preserve"> </w:t>
+                            </w:r>
+                            <w:r>
+                              <w:rPr>
+                                <w:rFonts w:ascii="Arial" w:hAnsi="Arial"/>
+                                <w:i/>
+                                <w:sz w:val="22"/>
+                              </w:rPr>
+                              <w:t>from</w:t>
+                            </w:r>
+                            <w:r>
+                              <w:rPr>
+                                <w:rFonts w:ascii="Arial" w:hAnsi="Arial"/>
+                                <w:i/>
+                                <w:spacing w:val="-1"/>
+                                <w:sz w:val="22"/>
+                              </w:rPr>
+                              <w:t xml:space="preserve"> </w:t>
+                            </w:r>
+                            <w:r>
+                              <w:rPr>
+                                <w:rFonts w:ascii="Arial" w:hAnsi="Arial"/>
+                                <w:i/>
+                                <w:sz w:val="22"/>
+                              </w:rPr>
+                              <w:t>your assessment</w:t>
+                            </w:r>
+                            <w:r>
+                              <w:rPr>
+                                <w:rFonts w:ascii="Arial" w:hAnsi="Arial"/>
+                                <w:i/>
+                                <w:spacing w:val="-2"/>
+                                <w:sz w:val="22"/>
+                              </w:rPr>
+                              <w:t xml:space="preserve"> </w:t>
+                            </w:r>
+                            <w:r>
+                              <w:rPr>
+                                <w:rFonts w:ascii="Arial" w:hAnsi="Arial"/>
+                                <w:i/>
+                                <w:sz w:val="22"/>
+                              </w:rPr>
+                              <w:t>–</w:t>
+                            </w:r>
+                            <w:r>
+                              <w:rPr>
+                                <w:rFonts w:ascii="Arial" w:hAnsi="Arial"/>
+                                <w:i/>
+                                <w:spacing w:val="-4"/>
+                                <w:sz w:val="22"/>
+                              </w:rPr>
+                              <w:t xml:space="preserve"> </w:t>
+                            </w:r>
+                            <w:r>
+                              <w:rPr>
+                                <w:rFonts w:ascii="Arial" w:hAnsi="Arial"/>
+                                <w:i/>
+                                <w:sz w:val="22"/>
+                              </w:rPr>
+                              <w:t>don’t forget</w:t>
+                            </w:r>
+                            <w:r>
+                              <w:rPr>
+                                <w:rFonts w:ascii="Arial" w:hAnsi="Arial"/>
+                                <w:i/>
+                                <w:spacing w:val="-3"/>
+                                <w:sz w:val="22"/>
+                              </w:rPr>
+                              <w:t xml:space="preserve"> </w:t>
+                            </w:r>
+                            <w:r>
+                              <w:rPr>
+                                <w:rFonts w:ascii="Arial" w:hAnsi="Arial"/>
+                                <w:i/>
+                                <w:sz w:val="22"/>
+                              </w:rPr>
+                              <w:t>to</w:t>
+                            </w:r>
+                            <w:r>
+                              <w:rPr>
+                                <w:rFonts w:ascii="Arial" w:hAnsi="Arial"/>
+                                <w:i/>
+                                <w:spacing w:val="-4"/>
+                                <w:sz w:val="22"/>
+                              </w:rPr>
+                              <w:t xml:space="preserve"> </w:t>
+                            </w:r>
+                            <w:r>
+                              <w:rPr>
+                                <w:rFonts w:ascii="Arial" w:hAnsi="Arial"/>
+                                <w:i/>
+                                <w:sz w:val="22"/>
+                              </w:rPr>
+                              <w:t xml:space="preserve">check both the header and the footer. Please </w:t>
+                            </w:r>
+                            <w:r>
+                              <w:rPr>
+                                <w:rFonts w:ascii="Arial" w:hAnsi="Arial"/>
+                                <w:b/>
+                                <w:i/>
+                                <w:sz w:val="22"/>
+                              </w:rPr>
+                              <w:t xml:space="preserve">do </w:t>
+                            </w:r>
+                            <w:r>
+                              <w:rPr>
+                                <w:rFonts w:ascii="Arial" w:hAnsi="Arial"/>
+                                <w:i/>
+                                <w:sz w:val="22"/>
+                              </w:rPr>
+                              <w:t>include your student number though.</w:t>
+                            </w:r>
+                          </w:p>
+                        </w:txbxContent>
+                      </wps:txbx>
+                      <wps:bodyPr wrap="square" lIns="0" tIns="0" rIns="0" bIns="0" rtlCol="0">
+                        <a:noAutofit/>
+                      </wps:bodyPr>
+                    </wps:wsp>
+                  </a:graphicData>
+                </a:graphic>
+                <wp14:sizeRelH relativeFrom="margin">
+                  <wp14:pctWidth>0</wp14:pctWidth>
+                </wp14:sizeRelH>
+                <wp14:sizeRelV relativeFrom="margin">
+                  <wp14:pctHeight>0</wp14:pctHeight>
+                </wp14:sizeRelV>
+              </wp:anchor>
+            </w:drawing>
+          </mc:Choice>
+          <mc:Fallback>
+            <w:pict>
+              <v:shapetype w14:anchorId="59B2D281" id="_x0000_t202" coordsize="21600,21600" o:spt="202" path="m,l,21600r21600,l21600,xe">
+                <v:stroke joinstyle="miter"/>
+                <v:path gradientshapeok="t" o:connecttype="rect"/>
+              </v:shapetype>
+              <v:shape id="Textbox 2" o:spid="_x0000_s1026" type="#_x0000_t202" style="position:absolute;left:0;text-align:left;margin-left:56pt;margin-top:9.55pt;width:488pt;height:39.3pt;z-index:-251656192;visibility:visible;mso-wrap-style:square;mso-width-percent:0;mso-height-percent:0;mso-wrap-distance-left:0;mso-wrap-distance-top:0;mso-wrap-distance-right:0;mso-wrap-distance-bottom:0;mso-position-horizontal:absolute;mso-position-horizontal-relative:page;mso-position-vertical:absolute;mso-position-vertical-relative:text;mso-width-percent:0;mso-height-percent:0;mso-width-relative:margin;mso-height-relative:margin;v-text-anchor:top" o:gfxdata="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" filled="f" strokecolor="gray" strokeweight=".48pt">
+                <v:path arrowok="t"/>
+                <v:textbox inset="0,0,0,0">
+                  <w:txbxContent>
+                    <w:p>
+                      <w:pPr>
+                        <w:spacing w:before="20"/>
+                        <w:ind w:left="972" w:right="198" w:hanging="771"/>
+                        <w:rPr>
+                          <w:rFonts w:ascii="Arial" w:hAnsi="Arial"/>
+                          <w:i/>
+                        </w:rPr>
+                      </w:pPr>
+                      <w:r>
+                        <w:rPr>
+                          <w:rFonts w:ascii="Arial" w:hAnsi="Arial"/>
+                          <w:i/>
+                          <w:sz w:val="22"/>
+                        </w:rPr>
+                        <w:t>Please</w:t>
+                      </w:r>
+                      <w:r>
+                        <w:rPr>
+                          <w:rFonts w:ascii="Arial" w:hAnsi="Arial"/>
+                          <w:i/>
+                          <w:spacing w:val="-2"/>
+                          <w:sz w:val="22"/>
+                        </w:rPr>
+                        <w:t xml:space="preserve"> </w:t>
+                      </w:r>
+                      <w:r>
+                        <w:rPr>
+                          <w:rFonts w:ascii="Arial" w:hAnsi="Arial"/>
+                          <w:i/>
+                          <w:sz w:val="22"/>
+                        </w:rPr>
+                        <w:t>ensure</w:t>
+                      </w:r>
+                      <w:r>
+                        <w:rPr>
+                          <w:rFonts w:ascii="Arial" w:hAnsi="Arial"/>
+                          <w:i/>
+                          <w:spacing w:val="-4"/>
+                          <w:sz w:val="22"/>
+                        </w:rPr>
+                        <w:t xml:space="preserve"> </w:t>
+                      </w:r>
+                      <w:r>
+                        <w:rPr>
+                          <w:rFonts w:ascii="Arial" w:hAnsi="Arial"/>
+                          <w:i/>
+                          <w:sz w:val="22"/>
+                        </w:rPr>
+                        <w:t>that you</w:t>
+                      </w:r>
+                      <w:r>
+                        <w:rPr>
+                          <w:rFonts w:ascii="Arial" w:hAnsi="Arial"/>
+                          <w:i/>
+                          <w:spacing w:val="-4"/>
+                          <w:sz w:val="22"/>
+                        </w:rPr>
+                        <w:t xml:space="preserve"> </w:t>
+                      </w:r>
+                      <w:r>
+                        <w:rPr>
+                          <w:rFonts w:ascii="Arial" w:hAnsi="Arial"/>
+                          <w:i/>
+                          <w:sz w:val="22"/>
+                        </w:rPr>
+                        <w:t>have</w:t>
+                      </w:r>
+                      <w:r>
+                        <w:rPr>
+                          <w:rFonts w:ascii="Arial" w:hAnsi="Arial"/>
+                          <w:i/>
+                          <w:spacing w:val="-2"/>
+                          <w:sz w:val="22"/>
+                        </w:rPr>
+                        <w:t xml:space="preserve"> </w:t>
+                      </w:r>
+                      <w:r>
+                        <w:rPr>
+                          <w:rFonts w:ascii="Arial" w:hAnsi="Arial"/>
+                          <w:i/>
+                          <w:sz w:val="22"/>
+                        </w:rPr>
+                        <w:t>removed</w:t>
+                      </w:r>
+                      <w:r>
+                        <w:rPr>
+                          <w:rFonts w:ascii="Arial" w:hAnsi="Arial"/>
+                          <w:i/>
+                          <w:spacing w:val="-4"/>
+                          <w:sz w:val="22"/>
+                        </w:rPr>
+                        <w:t xml:space="preserve"> </w:t>
+                      </w:r>
+                      <w:r>
+                        <w:rPr>
+                          <w:rFonts w:ascii="Arial" w:hAnsi="Arial"/>
+                          <w:i/>
+                          <w:sz w:val="22"/>
+                        </w:rPr>
+                        <w:t>your</w:t>
+                      </w:r>
+                      <w:r>
+                        <w:rPr>
+                          <w:rFonts w:ascii="Arial" w:hAnsi="Arial"/>
+                          <w:i/>
+                          <w:spacing w:val="-3"/>
+                          <w:sz w:val="22"/>
+                        </w:rPr>
+                        <w:t xml:space="preserve"> </w:t>
+                      </w:r>
+                      <w:r>
+                        <w:rPr>
+                          <w:rFonts w:ascii="Arial" w:hAnsi="Arial"/>
+                          <w:i/>
+                          <w:sz w:val="22"/>
+                        </w:rPr>
+                        <w:t>name</w:t>
+                      </w:r>
+                      <w:r>
+                        <w:rPr>
+                          <w:rFonts w:ascii="Arial" w:hAnsi="Arial"/>
+                          <w:i/>
+                          <w:spacing w:val="-6"/>
+                          <w:sz w:val="22"/>
+                        </w:rPr>
+                        <w:t xml:space="preserve"> </w:t>
+                      </w:r>
+                      <w:r>
+                        <w:rPr>
+                          <w:rFonts w:ascii="Arial" w:hAnsi="Arial"/>
+                          <w:i/>
+                          <w:sz w:val="22"/>
+                        </w:rPr>
+                        <w:t>from</w:t>
+                      </w:r>
+                      <w:r>
+                        <w:rPr>
+                          <w:rFonts w:ascii="Arial" w:hAnsi="Arial"/>
+                          <w:i/>
+                          <w:spacing w:val="-1"/>
+                          <w:sz w:val="22"/>
+                        </w:rPr>
+                        <w:t xml:space="preserve"> </w:t>
+                      </w:r>
+                      <w:r>
+                        <w:rPr>
+                          <w:rFonts w:ascii="Arial" w:hAnsi="Arial"/>
+                          <w:i/>
+                          <w:sz w:val="22"/>
+                        </w:rPr>
+                        <w:t>your assessment</w:t>
+                      </w:r>
+                      <w:r>
+                        <w:rPr>
+                          <w:rFonts w:ascii="Arial" w:hAnsi="Arial"/>
+                          <w:i/>
+                          <w:spacing w:val="-2"/>
+                          <w:sz w:val="22"/>
+                        </w:rPr>
+                        <w:t xml:space="preserve"> </w:t>
+                      </w:r>
+                      <w:r>
+                        <w:rPr>
+                          <w:rFonts w:ascii="Arial" w:hAnsi="Arial"/>
+                          <w:i/>
+                          <w:sz w:val="22"/>
+                        </w:rPr>
+                        <w:t>–</w:t>
+                      </w:r>
+                      <w:r>
+                        <w:rPr>
+                          <w:rFonts w:ascii="Arial" w:hAnsi="Arial"/>
+                          <w:i/>
+                          <w:spacing w:val="-4"/>
+                          <w:sz w:val="22"/>
+                        </w:rPr>
+                        <w:t xml:space="preserve"> </w:t>
+                      </w:r>
+                      <w:r>
+                        <w:rPr>
+                          <w:rFonts w:ascii="Arial" w:hAnsi="Arial"/>
+                          <w:i/>
+                          <w:sz w:val="22"/>
+                        </w:rPr>
+                        <w:t>don’t forget</w:t>
+                      </w:r>
+                      <w:r>
+                        <w:rPr>
+                          <w:rFonts w:ascii="Arial" w:hAnsi="Arial"/>
+                          <w:i/>
+                          <w:spacing w:val="-3"/>
+                          <w:sz w:val="22"/>
+                        </w:rPr>
+                        <w:t xml:space="preserve"> </w:t>
+                      </w:r>
+                      <w:r>
+                        <w:rPr>
+                          <w:rFonts w:ascii="Arial" w:hAnsi="Arial"/>
+                          <w:i/>
+                          <w:sz w:val="22"/>
+                        </w:rPr>
+                        <w:t>to</w:t>
+                      </w:r>
+                      <w:r>
+                        <w:rPr>
+                          <w:rFonts w:ascii="Arial" w:hAnsi="Arial"/>
+                          <w:i/>
+                          <w:spacing w:val="-4"/>
+                          <w:sz w:val="22"/>
+                        </w:rPr>
+                        <w:t xml:space="preserve"> </w:t>
+                      </w:r>
+                      <w:r>
+                        <w:rPr>
+                          <w:rFonts w:ascii="Arial" w:hAnsi="Arial"/>
+                          <w:i/>
+                          <w:sz w:val="22"/>
+                        </w:rPr>
+                        <w:t xml:space="preserve">check both the header and the footer. Please </w:t>
+                      </w:r>
+                      <w:r>
+                        <w:rPr>
+                          <w:rFonts w:ascii="Arial" w:hAnsi="Arial"/>
+                          <w:b/>
+                          <w:i/>
+                          <w:sz w:val="22"/>
+                        </w:rPr>
+                        <w:t xml:space="preserve">do </w:t>
+                      </w:r>
+                      <w:r>
+                        <w:rPr>
+                          <w:rFonts w:ascii="Arial" w:hAnsi="Arial"/>
+                          <w:i/>
+                          <w:sz w:val="22"/>
+                        </w:rPr>
+                        <w:t>include your student number though.</w:t>
+                      </w:r>
+                    </w:p>
+                  </w:txbxContent>
+                </v:textbox>
+                <w10:wrap type="topAndBottom" anchorx="page"/>
+              </v:shape>
+            </w:pict>
+          </mc:Fallback>
+        </mc:AlternateContent>
+      </w:r>
+    </w:p>
+    <w:p>
+      <w:pPr>
+        <w:rPr>
+          <w:rFonts w:ascii="Arial"/>
+          <w:b/>
+        </w:rPr>
+      </w:pPr>
+    </w:p>
+    <w:p>
+      <w:pPr>
+        <w:rPr>
+          <w:rFonts w:ascii="Arial"/>
+          <w:b/>
+          <w:bCs/>
+          <w:spacing w:val="-3"/>
+        </w:rPr>
+      </w:pPr>
+      <w:r>
+        <w:rPr>
+          <w:rFonts w:ascii="Arial"/>
+          <w:b/>
+        </w:rPr>
+        <w:t>MODULE</w:t>
+      </w:r>
+      <w:r>
+        <w:rPr>
+          <w:rFonts w:ascii="Arial"/>
+          <w:b/>
+          <w:spacing w:val="-7"/>
+        </w:rPr>
+        <w:t xml:space="preserve"> </w:t>
+      </w:r>
+      <w:r>
+        <w:rPr>
+          <w:rFonts w:ascii="Arial"/>
+          <w:b/>
+        </w:rPr>
+        <w:t>NUMBER:</w:t>
+      </w:r>
+      <w:r>
+        <w:rPr>
+          <w:rFonts w:ascii="Arial"/>
+          <w:b/>
+          <w:spacing w:val="-3"/>
+        </w:rPr>
+        <w:t xml:space="preserve"> </w:t>
+      </w:r>
+      <w:r>
+        <w:rPr>
+          <w:rFonts w:ascii="Arial"/>
+          <w:b/>
+          <w:bCs/>
+          <w:spacing w:val="-3"/>
+        </w:rPr>
+        <w:t>SET09802 2025-6 TR3 001</w:t>
+      </w:r>
+    </w:p>
+    <w:p>
+      <w:r>
+        <w:rPr>
+          <w:rFonts w:ascii="Arial"/>
+          <w:b/>
+        </w:rPr>
+        <w:t>MODULE</w:t>
+      </w:r>
+      <w:r>
+        <w:rPr>
+          <w:rFonts w:ascii="Arial"/>
+          <w:b/>
+          <w:spacing w:val="-5"/>
+        </w:rPr>
+        <w:t xml:space="preserve"> </w:t>
+      </w:r>
+      <w:r>
+        <w:rPr>
+          <w:rFonts w:ascii="Arial"/>
+          <w:b/>
+        </w:rPr>
+        <w:t>TITLE:</w:t>
+      </w:r>
+      <w:r>
+        <w:rPr>
+          <w:rFonts w:ascii="Arial"/>
+          <w:b/>
+          <w:spacing w:val="-3"/>
+        </w:rPr>
+        <w:t xml:space="preserve"> </w:t>
+      </w:r>
+      <w:r>
+        <w:rPr>
+          <w:rFonts w:ascii="Arial"/>
+          <w:b/>
+          <w:spacing w:val="-3"/>
+        </w:rPr>
+        <w:t>Software Development 1</w:t>
+      </w:r>
+    </w:p>
+    <w:p>
+      <w:r>
+        <w:rPr>
+          <w:rFonts w:ascii="Arial"/>
+          <w:b/>
+        </w:rPr>
+        <w:t>ASSESSMENT</w:t>
+      </w:r>
+      <w:r>
+        <w:rPr>
+          <w:rFonts w:ascii="Arial"/>
+          <w:b/>
+          <w:spacing w:val="-5"/>
+        </w:rPr>
+        <w:t xml:space="preserve"> </w:t>
+      </w:r>
+      <w:r>
+        <w:rPr>
+          <w:rFonts w:ascii="Arial"/>
+          <w:b/>
+        </w:rPr>
+        <w:t>TITLE:</w:t>
+      </w:r>
+      <w:r>
+        <w:rPr>
+          <w:rFonts w:ascii="Arial"/>
+          <w:b/>
+          <w:spacing w:val="-4"/>
+        </w:rPr>
+        <w:t xml:space="preserve"> </w:t>
+      </w:r>
+      <w:r>
+        <w:rPr>
+          <w:rFonts w:ascii="Arial"/>
+          <w:b/>
+          <w:spacing w:val="-4"/>
+        </w:rPr>
+        <w:t>Dice Poker Coursework 2</w:t>
+      </w:r>
+    </w:p>
+    <w:p>
+      <w:r>
+        <w:rPr>
+          <w:rFonts w:ascii="Arial"/>
+          <w:b/>
+        </w:rPr>
+        <w:t>NAME</w:t>
+      </w:r>
+      <w:r>
+        <w:rPr>
+          <w:rFonts w:ascii="Arial"/>
+          <w:b/>
+          <w:spacing w:val="-4"/>
+        </w:rPr>
+        <w:t xml:space="preserve"> </w:t>
+      </w:r>
+      <w:r>
+        <w:rPr>
+          <w:rFonts w:ascii="Arial"/>
+          <w:b/>
+        </w:rPr>
+        <w:t>OF</w:t>
+      </w:r>
+      <w:r>
+        <w:rPr>
+          <w:rFonts w:ascii="Arial"/>
+          <w:b/>
+          <w:spacing w:val="-3"/>
+        </w:rPr>
+        <w:t xml:space="preserve"> </w:t>
+      </w:r>
+      <w:r>
+        <w:rPr>
+          <w:rFonts w:ascii="Arial"/>
+          <w:b/>
+        </w:rPr>
+        <w:t>MODULE</w:t>
+      </w:r>
+      <w:r>
+        <w:rPr>
+          <w:rFonts w:ascii="Arial"/>
+          <w:b/>
+          <w:spacing w:val="-2"/>
+        </w:rPr>
+        <w:t xml:space="preserve"> </w:t>
+      </w:r>
+      <w:r>
+        <w:rPr>
+          <w:rFonts w:ascii="Arial"/>
+          <w:b/>
+        </w:rPr>
+        <w:t>LEADER:</w:t>
+      </w:r>
+      <w:r>
+        <w:rPr>
+          <w:rFonts w:ascii="Arial"/>
+          <w:b/>
+          <w:spacing w:val="-3"/>
+        </w:rPr>
+        <w:t xml:space="preserve"> </w:t>
+      </w:r>
+      <w:r>
+        <w:rPr>
+          <w:rFonts w:ascii="Arial"/>
+          <w:b/>
+          <w:bCs/>
+          <w:spacing w:val="-3"/>
+        </w:rPr>
+        <w:t xml:space="preserve">Divya </w:t>
+      </w:r>
+      <w:proofErr w:type="spellStart"/>
+      <w:r>
+        <w:rPr>
+          <w:rFonts w:ascii="Arial"/>
+          <w:b/>
+          <w:bCs/>
+          <w:spacing w:val="-3"/>
+        </w:rPr>
+        <w:t>Achhodawala</w:t>
+      </w:r>
+      <w:proofErr w:type="spellEnd"/>
+    </w:p>
+    <w:p>
+      <w:r>
+        <w:rPr>
+          <w:rFonts w:ascii="Arial"/>
+          <w:b/>
+        </w:rPr>
+        <w:t>DATE</w:t>
+      </w:r>
+      <w:r>
+        <w:rPr>
+          <w:rFonts w:ascii="Arial"/>
+          <w:b/>
+          <w:spacing w:val="-3"/>
+        </w:rPr>
+        <w:t xml:space="preserve"> </w:t>
+      </w:r>
+      <w:r>
+        <w:rPr>
+          <w:rFonts w:ascii="Arial"/>
+          <w:b/>
+        </w:rPr>
+        <w:t>OF</w:t>
+      </w:r>
+      <w:r>
+        <w:rPr>
+          <w:rFonts w:ascii="Arial"/>
+          <w:b/>
+          <w:spacing w:val="-6"/>
+        </w:rPr>
+        <w:t xml:space="preserve"> </w:t>
+      </w:r>
+      <w:r>
+        <w:rPr>
+          <w:rFonts w:ascii="Arial"/>
+          <w:b/>
+        </w:rPr>
+        <w:t>SUBMISSION:</w:t>
+      </w:r>
+      <w:r>
+        <w:rPr>
+          <w:rFonts w:ascii="Arial"/>
+          <w:b/>
+          <w:spacing w:val="-2"/>
+        </w:rPr>
+        <w:t xml:space="preserve"> </w:t>
+      </w:r>
+      <w:r>
+        <w:rPr>
+          <w:rFonts w:ascii="Arial"/>
+          <w:b/>
+          <w:bCs/>
+          <w:spacing w:val="-2"/>
+        </w:rPr>
+        <w:t>Friday August 21st</w:t>
+      </w:r>
+    </w:p>
+    <w:p>
+      <w:r>
+        <w:t>I declare, except where explicit acknowledgement is made of contributions from other sources*,</w:t>
+      </w:r>
+      <w:r>
+        <w:rPr>
+          <w:spacing w:val="-4"/>
+        </w:rPr>
+        <w:t xml:space="preserve"> </w:t>
+      </w:r>
+      <w:r>
+        <w:t>that</w:t>
+      </w:r>
+      <w:r>
+        <w:rPr>
+          <w:spacing w:val="-2"/>
+        </w:rPr>
+        <w:t xml:space="preserve"> </w:t>
+      </w:r>
+      <w:r>
+        <w:t>this</w:t>
+      </w:r>
+      <w:r>
+        <w:rPr>
+          <w:spacing w:val="-3"/>
+        </w:rPr>
+        <w:t xml:space="preserve"> </w:t>
+      </w:r>
+      <w:r>
+        <w:t>assessment is</w:t>
+      </w:r>
+      <w:r>
+        <w:rPr>
+          <w:spacing w:val="-2"/>
+        </w:rPr>
+        <w:t xml:space="preserve"> </w:t>
+      </w:r>
+      <w:r>
+        <w:t>the</w:t>
+      </w:r>
+      <w:r>
+        <w:rPr>
+          <w:spacing w:val="-2"/>
+        </w:rPr>
+        <w:t xml:space="preserve"> </w:t>
+      </w:r>
+      <w:r>
+        <w:t>result</w:t>
+      </w:r>
+      <w:r>
+        <w:rPr>
+          <w:spacing w:val="-2"/>
+        </w:rPr>
+        <w:t xml:space="preserve"> </w:t>
+      </w:r>
+      <w:r>
+        <w:t>of</w:t>
+      </w:r>
+      <w:r>
+        <w:rPr>
+          <w:spacing w:val="-1"/>
+        </w:rPr>
+        <w:t xml:space="preserve"> </w:t>
+      </w:r>
+      <w:r>
+        <w:rPr>
+          <w:u w:val="single"/>
+        </w:rPr>
+        <w:t>my</w:t>
+      </w:r>
+      <w:r>
+        <w:rPr>
+          <w:spacing w:val="-4"/>
+          <w:u w:val="single"/>
+        </w:rPr>
+        <w:t xml:space="preserve"> </w:t>
+      </w:r>
+      <w:r>
+        <w:rPr>
+          <w:u w:val="single"/>
+        </w:rPr>
+        <w:t>own</w:t>
+      </w:r>
+      <w:r>
+        <w:rPr>
+          <w:spacing w:val="-2"/>
+          <w:u w:val="single"/>
+        </w:rPr>
+        <w:t xml:space="preserve"> </w:t>
+      </w:r>
+      <w:r>
+        <w:rPr>
+          <w:u w:val="single"/>
+        </w:rPr>
+        <w:t>work</w:t>
+      </w:r>
+      <w:r>
+        <w:rPr>
+          <w:spacing w:val="-4"/>
+        </w:rPr>
+        <w:t xml:space="preserve"> </w:t>
+      </w:r>
+      <w:r>
+        <w:t>and</w:t>
+      </w:r>
+      <w:r>
+        <w:rPr>
+          <w:spacing w:val="-4"/>
+        </w:rPr>
+        <w:t xml:space="preserve"> </w:t>
+      </w:r>
+      <w:r>
+        <w:t>has</w:t>
+      </w:r>
+      <w:r>
+        <w:rPr>
+          <w:spacing w:val="-5"/>
+        </w:rPr>
+        <w:t xml:space="preserve"> </w:t>
+      </w:r>
+      <w:r>
+        <w:t>not</w:t>
+      </w:r>
+      <w:r>
+        <w:rPr>
+          <w:spacing w:val="-2"/>
+        </w:rPr>
+        <w:t xml:space="preserve"> </w:t>
+      </w:r>
+      <w:r>
+        <w:t>been</w:t>
+      </w:r>
+      <w:r>
+        <w:rPr>
+          <w:spacing w:val="-2"/>
+        </w:rPr>
+        <w:t xml:space="preserve"> </w:t>
+      </w:r>
+      <w:r>
+        <w:t xml:space="preserve">submitted for any module or degree </w:t>
+      </w:r>
+      <w:r>
+        <w:t>programmed</w:t>
+      </w:r>
+      <w:r>
+        <w:t xml:space="preserve"> at Edinburgh Napier University or any other institution.</w:t>
+      </w:r>
+      <w:r>
+        <w:rPr>
+          <w:spacing w:val="-4"/>
+        </w:rPr>
+        <w:t xml:space="preserve"> </w:t>
+      </w:r>
+      <w:r>
+        <w:t>This</w:t>
+      </w:r>
+      <w:r>
+        <w:rPr>
+          <w:spacing w:val="-4"/>
+        </w:rPr>
+        <w:t xml:space="preserve"> </w:t>
+      </w:r>
+      <w:r>
+        <w:t>is</w:t>
+      </w:r>
+      <w:r>
+        <w:rPr>
+          <w:spacing w:val="-4"/>
+        </w:rPr>
+        <w:t xml:space="preserve"> </w:t>
+      </w:r>
+      <w:r>
+        <w:t>in</w:t>
+      </w:r>
+      <w:r>
+        <w:rPr>
+          <w:spacing w:val="-6"/>
+        </w:rPr>
+        <w:t xml:space="preserve"> </w:t>
+      </w:r>
+      <w:r>
+        <w:t>accordance</w:t>
+      </w:r>
+      <w:r>
+        <w:rPr>
+          <w:spacing w:val="-4"/>
+        </w:rPr>
+        <w:t xml:space="preserve"> </w:t>
+      </w:r>
+      <w:r>
+        <w:t>with</w:t>
+      </w:r>
+      <w:r>
+        <w:rPr>
+          <w:spacing w:val="-4"/>
+        </w:rPr>
+        <w:t xml:space="preserve"> </w:t>
+      </w:r>
+      <w:r>
+        <w:t>Edinburgh</w:t>
+      </w:r>
+      <w:r>
+        <w:rPr>
+          <w:spacing w:val="-4"/>
+        </w:rPr>
+        <w:t xml:space="preserve"> </w:t>
+      </w:r>
+      <w:r>
+        <w:t>Napier</w:t>
+      </w:r>
+      <w:r>
+        <w:rPr>
+          <w:spacing w:val="-4"/>
+        </w:rPr>
+        <w:t xml:space="preserve"> </w:t>
+      </w:r>
+      <w:r>
+        <w:t>University’s</w:t>
+      </w:r>
+      <w:r>
+        <w:rPr>
+          <w:spacing w:val="-1"/>
+        </w:rPr>
+        <w:t xml:space="preserve"> </w:t>
+      </w:r>
+      <w:hyperlink r:id="rId9">
+        <w:r>
+          <w:rPr>
+            <w:color w:val="0462C1"/>
+            <w:u w:val="single" w:color="0462C1"/>
+          </w:rPr>
+          <w:t>Academic</w:t>
+        </w:r>
+        <w:r>
+          <w:rPr>
+            <w:color w:val="0462C1"/>
+            <w:spacing w:val="-4"/>
+            <w:u w:val="single" w:color="0462C1"/>
+          </w:rPr>
+          <w:t xml:space="preserve"> </w:t>
+        </w:r>
+        <w:r>
+          <w:rPr>
+            <w:color w:val="0462C1"/>
+            <w:u w:val="single" w:color="0462C1"/>
+          </w:rPr>
+          <w:t>Integrity</w:t>
+        </w:r>
+      </w:hyperlink>
+      <w:r>
+        <w:rPr>
+          <w:color w:val="0462C1"/>
+        </w:rPr>
+        <w:t xml:space="preserve"> </w:t>
+      </w:r>
+      <w:hyperlink r:id="rId10">
+        <w:r>
+          <w:rPr>
+            <w:color w:val="0462C1"/>
+            <w:spacing w:val="-2"/>
+            <w:u w:val="single" w:color="0462C1"/>
+          </w:rPr>
+          <w:t>Regulations</w:t>
+        </w:r>
+        <w:r>
+          <w:rPr>
+            <w:spacing w:val="-2"/>
+          </w:rPr>
+          <w:t>.</w:t>
+        </w:r>
+      </w:hyperlink>
+    </w:p>
+    <w:p>
+      <w:r>
+        <w:t>*</w:t>
+      </w:r>
+      <w:r>
+        <w:rPr>
+          <w:rFonts w:ascii="Arial"/>
+          <w:b/>
+        </w:rPr>
+        <w:t>IMPORTANT</w:t>
+      </w:r>
+      <w:r>
+        <w:t>:</w:t>
+      </w:r>
+      <w:r>
+        <w:rPr>
+          <w:spacing w:val="-3"/>
+        </w:rPr>
+        <w:t xml:space="preserve"> </w:t>
+      </w:r>
+      <w:r>
+        <w:t>Contributions</w:t>
+      </w:r>
+      <w:r>
+        <w:rPr>
+          <w:spacing w:val="-6"/>
+        </w:rPr>
+        <w:t xml:space="preserve"> </w:t>
+      </w:r>
+      <w:r>
+        <w:t>from</w:t>
+      </w:r>
+      <w:r>
+        <w:rPr>
+          <w:spacing w:val="-5"/>
+        </w:rPr>
+        <w:t xml:space="preserve"> </w:t>
+      </w:r>
+      <w:r>
+        <w:t>other</w:t>
+      </w:r>
+      <w:r>
+        <w:rPr>
+          <w:spacing w:val="-4"/>
+        </w:rPr>
+        <w:t xml:space="preserve"> </w:t>
+      </w:r>
+      <w:proofErr w:type="gramStart"/>
+      <w:r>
+        <w:t>sources'</w:t>
+      </w:r>
+      <w:proofErr w:type="gramEnd"/>
+      <w:r>
+        <w:rPr>
+          <w:spacing w:val="-4"/>
+        </w:rPr>
+        <w:t xml:space="preserve"> </w:t>
+      </w:r>
+      <w:r>
+        <w:t>may</w:t>
+      </w:r>
+      <w:r>
+        <w:rPr>
+          <w:spacing w:val="-4"/>
+        </w:rPr>
+        <w:t xml:space="preserve"> </w:t>
+      </w:r>
+      <w:r>
+        <w:t>include</w:t>
+      </w:r>
+      <w:r>
+        <w:rPr>
+          <w:spacing w:val="-4"/>
+        </w:rPr>
+        <w:t xml:space="preserve"> </w:t>
+      </w:r>
+      <w:r>
+        <w:t>incorrectly</w:t>
+      </w:r>
+      <w:r>
+        <w:rPr>
+          <w:spacing w:val="-4"/>
+        </w:rPr>
+        <w:t xml:space="preserve"> </w:t>
+      </w:r>
+      <w:r>
+        <w:t>cited</w:t>
+      </w:r>
+      <w:r>
+        <w:rPr>
+          <w:spacing w:val="-6"/>
+        </w:rPr>
+        <w:t xml:space="preserve"> </w:t>
+      </w:r>
+      <w:r>
+        <w:t xml:space="preserve">quotations or Artificial Intelligence (AI) tools, such as ChatGPT or Bard (details of which can be found in the </w:t>
+      </w:r>
+      <w:hyperlink r:id="rId11">
+        <w:r>
+          <w:rPr>
+            <w:color w:val="0462C1"/>
+            <w:u w:val="single" w:color="0462C1"/>
+          </w:rPr>
+          <w:t>Guidelines for Students on AI &amp; Writing Assistant Tools</w:t>
+        </w:r>
+        <w:r>
+          <w:t>)</w:t>
+        </w:r>
+      </w:hyperlink>
+      <w:r>
+        <w:t xml:space="preserve">. </w:t>
+      </w:r>
+      <w:r>
+        <w:rPr>
+          <w:rFonts w:ascii="Arial"/>
+          <w:b/>
+          <w:i/>
+        </w:rPr>
+        <w:t>Please declare here whether you have used such tools in this assessment submission, and to what extent</w:t>
+      </w:r>
+      <w:r>
+        <w:t>:</w:t>
+      </w:r>
     </w:p>
     <w:p/>
+    <w:p>
+      <w:r>
+        <w:rPr>
+          <w:sz w:val="22"/>
+        </w:rPr>
+        <w:t>(Select</w:t>
+      </w:r>
+      <w:r>
+        <w:rPr>
+          <w:spacing w:val="-2"/>
+          <w:sz w:val="22"/>
+        </w:rPr>
+        <w:t xml:space="preserve"> </w:t>
+      </w:r>
+      <w:r>
+        <w:rPr>
+          <w:sz w:val="22"/>
+          <w:u w:val="single"/>
+        </w:rPr>
+        <w:t>one</w:t>
+      </w:r>
+      <w:r>
+        <w:rPr>
+          <w:spacing w:val="-5"/>
+          <w:sz w:val="22"/>
+        </w:rPr>
+        <w:t xml:space="preserve"> </w:t>
+      </w:r>
+      <w:r>
+        <w:rPr>
+          <w:sz w:val="22"/>
+        </w:rPr>
+        <w:t>of</w:t>
+      </w:r>
+      <w:r>
+        <w:rPr>
+          <w:spacing w:val="-4"/>
+          <w:sz w:val="22"/>
+        </w:rPr>
+        <w:t xml:space="preserve"> </w:t>
+      </w:r>
+      <w:r>
+        <w:rPr>
+          <w:sz w:val="22"/>
+        </w:rPr>
+        <w:t>the</w:t>
+      </w:r>
+      <w:r>
+        <w:rPr>
+          <w:spacing w:val="-4"/>
+          <w:sz w:val="22"/>
+        </w:rPr>
+        <w:t xml:space="preserve"> </w:t>
+      </w:r>
+      <w:r>
+        <w:rPr>
+          <w:sz w:val="22"/>
+        </w:rPr>
+        <w:t>two</w:t>
+      </w:r>
+      <w:r>
+        <w:rPr>
+          <w:spacing w:val="-5"/>
+          <w:sz w:val="22"/>
+        </w:rPr>
+        <w:t xml:space="preserve"> </w:t>
+      </w:r>
+      <w:r>
+        <w:rPr>
+          <w:sz w:val="22"/>
+        </w:rPr>
+        <w:t>options</w:t>
+      </w:r>
+      <w:r>
+        <w:rPr>
+          <w:spacing w:val="-2"/>
+          <w:sz w:val="22"/>
+        </w:rPr>
+        <w:t xml:space="preserve"> below)</w:t>
+      </w:r>
+    </w:p>
+    <w:tbl>
+      <w:tblPr>
+        <w:tblW w:w="0" w:type="auto"/>
+        <w:tblInd w:w="530" w:type="dxa"/>
+        <w:tblLayout w:type="fixed"/>
+        <w:tblCellMar>
+          <w:left w:w="0" w:type="dxa"/>
+          <w:right w:w="0" w:type="dxa"/>
+        </w:tblCellMar>
+        <w:tblLook w:val="01E0" w:firstRow="1" w:lastRow="1" w:firstColumn="1" w:lastColumn="1" w:noHBand="0" w:noVBand="0"/>
+      </w:tblPr>
+      <w:tblGrid>
+        <w:gridCol w:w="785"/>
+        <w:gridCol w:w="8469"/>
+      </w:tblGrid>
+      <w:tr>
+        <w:trPr>
+          <w:trHeight w:val="440"/>
+        </w:trPr>
+        <w:tc>
+          <w:tcPr>
+            <w:tcW w:w="785" w:type="dxa"/>
+            <w:tcBorders>
+              <w:bottom w:val="single" w:sz="4" w:space="0" w:color="000000"/>
+            </w:tcBorders>
+          </w:tcPr>
+          <w:p>
+            <w:pPr>
+              <w:rPr>
+                <w:rFonts w:ascii="MS Gothic" w:hAnsi="MS Gothic"/>
+                <w:sz w:val="28"/>
+              </w:rPr>
+            </w:pPr>
+            <w:r>
+              <w:rPr>
+                <w:rFonts w:ascii="MS Gothic" w:hAnsi="MS Gothic"/>
+                <w:spacing w:val="-10"/>
+                <w:sz w:val="28"/>
+              </w:rPr>
+              <w:t>☐</w:t>
+            </w:r>
+          </w:p>
+        </w:tc>
+        <w:tc>
+          <w:tcPr>
+            <w:tcW w:w="8469" w:type="dxa"/>
+            <w:tcBorders>
+              <w:bottom w:val="single" w:sz="4" w:space="0" w:color="000000"/>
+            </w:tcBorders>
+          </w:tcPr>
+          <w:p>
+            <w:r>
+              <w:t>No,</w:t>
+            </w:r>
+            <w:r>
+              <w:rPr>
+                <w:spacing w:val="-1"/>
+              </w:rPr>
+              <w:t xml:space="preserve"> </w:t>
+            </w:r>
+            <w:r>
+              <w:t>I</w:t>
+            </w:r>
+            <w:r>
+              <w:rPr>
+                <w:spacing w:val="-1"/>
+              </w:rPr>
+              <w:t xml:space="preserve"> </w:t>
+            </w:r>
+            <w:r>
+              <w:t>have</w:t>
+            </w:r>
+            <w:r>
+              <w:rPr>
+                <w:spacing w:val="-2"/>
+              </w:rPr>
+              <w:t xml:space="preserve"> </w:t>
+            </w:r>
+            <w:r>
+              <w:t>not</w:t>
+            </w:r>
+            <w:r>
+              <w:rPr>
+                <w:spacing w:val="-2"/>
+              </w:rPr>
+              <w:t xml:space="preserve"> </w:t>
+            </w:r>
+            <w:r>
+              <w:t>used</w:t>
+            </w:r>
+            <w:r>
+              <w:rPr>
+                <w:spacing w:val="-1"/>
+              </w:rPr>
+              <w:t xml:space="preserve"> </w:t>
+            </w:r>
+            <w:r>
+              <w:t>AI</w:t>
+            </w:r>
+            <w:r>
+              <w:rPr>
+                <w:spacing w:val="-2"/>
+              </w:rPr>
+              <w:t xml:space="preserve"> </w:t>
+            </w:r>
+            <w:r>
+              <w:t>for</w:t>
+            </w:r>
+            <w:r>
+              <w:rPr>
+                <w:spacing w:val="-1"/>
+              </w:rPr>
+              <w:t xml:space="preserve"> </w:t>
+            </w:r>
+            <w:r>
+              <w:t xml:space="preserve">this </w:t>
+            </w:r>
+            <w:r>
+              <w:rPr>
+                <w:spacing w:val="-2"/>
+              </w:rPr>
+              <w:t>submission.</w:t>
+            </w:r>
+          </w:p>
+        </w:tc>
+      </w:tr>
+      <w:tr>
+        <w:trPr>
+          <w:trHeight w:val="923"/>
+        </w:trPr>
+        <w:tc>
+          <w:tcPr>
+            <w:tcW w:w="785" w:type="dxa"/>
+            <w:tcBorders>
+              <w:top w:val="single" w:sz="4" w:space="0" w:color="000000"/>
+              <w:bottom w:val="single" w:sz="4" w:space="0" w:color="000000"/>
+            </w:tcBorders>
+          </w:tcPr>
+          <w:p>
+            <w:pPr>
+              <w:rPr>
+                <w:rFonts w:ascii="MS Gothic" w:hAnsi="MS Gothic"/>
+                <w:sz w:val="28"/>
+              </w:rPr>
+            </w:pPr>
+            <w:r>
+              <w:rPr>
+                <w:rFonts w:ascii="MS Gothic" w:hAnsi="MS Gothic"/>
+                <w:spacing w:val="-10"/>
+                <w:sz w:val="28"/>
+              </w:rPr>
+              <w:t>☑</w:t>
+            </w:r>
+          </w:p>
+        </w:tc>
+        <w:tc>
+          <w:tcPr>
+            <w:tcW w:w="8469" w:type="dxa"/>
+            <w:tcBorders>
+              <w:top w:val="single" w:sz="4" w:space="0" w:color="000000"/>
+              <w:bottom w:val="single" w:sz="4" w:space="0" w:color="000000"/>
+            </w:tcBorders>
+          </w:tcPr>
+          <w:p>
+            <w:r>
+              <w:t>Y</w:t>
+            </w:r>
+            <w:r>
+              <w:t>es,</w:t>
+            </w:r>
+            <w:r>
+              <w:rPr>
+                <w:spacing w:val="-1"/>
+              </w:rPr>
+              <w:t xml:space="preserve"> </w:t>
+            </w:r>
+            <w:r>
+              <w:t>I</w:t>
+            </w:r>
+            <w:r>
+              <w:rPr>
+                <w:spacing w:val="-3"/>
+              </w:rPr>
+              <w:t xml:space="preserve"> </w:t>
+            </w:r>
+            <w:r>
+              <w:t>have</w:t>
+            </w:r>
+            <w:r>
+              <w:rPr>
+                <w:spacing w:val="-1"/>
+              </w:rPr>
+              <w:t xml:space="preserve"> </w:t>
+            </w:r>
+            <w:r>
+              <w:t>used</w:t>
+            </w:r>
+            <w:r>
+              <w:rPr>
+                <w:spacing w:val="-3"/>
+              </w:rPr>
+              <w:t xml:space="preserve"> </w:t>
+            </w:r>
+            <w:r>
+              <w:t>AI</w:t>
+            </w:r>
+            <w:r>
+              <w:rPr>
+                <w:spacing w:val="-1"/>
+              </w:rPr>
+              <w:t xml:space="preserve"> </w:t>
+            </w:r>
+            <w:r>
+              <w:t>for</w:t>
+            </w:r>
+            <w:r>
+              <w:rPr>
+                <w:spacing w:val="-1"/>
+              </w:rPr>
+              <w:t xml:space="preserve"> </w:t>
+            </w:r>
+            <w:r>
+              <w:t>this</w:t>
+            </w:r>
+            <w:r>
+              <w:rPr>
+                <w:spacing w:val="2"/>
+              </w:rPr>
+              <w:t xml:space="preserve"> </w:t>
+            </w:r>
+            <w:r>
+              <w:rPr>
+                <w:spacing w:val="-2"/>
+              </w:rPr>
+              <w:t>submission.</w:t>
+            </w:r>
+          </w:p>
+        </w:tc>
+      </w:tr>
+    </w:tbl>
     <w:p/>
+    <w:p>
+      <w:r>
+        <w:t>If</w:t>
+      </w:r>
+      <w:r>
+        <w:rPr>
+          <w:spacing w:val="-3"/>
+        </w:rPr>
+        <w:t xml:space="preserve"> </w:t>
+      </w:r>
+      <w:r>
+        <w:t>you</w:t>
+      </w:r>
+      <w:r>
+        <w:rPr>
+          <w:spacing w:val="-3"/>
+        </w:rPr>
+        <w:t xml:space="preserve"> </w:t>
+      </w:r>
+      <w:r>
+        <w:t>have</w:t>
+      </w:r>
+      <w:r>
+        <w:rPr>
+          <w:spacing w:val="-3"/>
+        </w:rPr>
+        <w:t xml:space="preserve"> </w:t>
+      </w:r>
+      <w:r>
+        <w:t>used</w:t>
+      </w:r>
+      <w:r>
+        <w:rPr>
+          <w:spacing w:val="-6"/>
+        </w:rPr>
+        <w:t xml:space="preserve"> </w:t>
+      </w:r>
+      <w:r>
+        <w:t>AI</w:t>
+      </w:r>
+      <w:r>
+        <w:rPr>
+          <w:spacing w:val="-3"/>
+        </w:rPr>
+        <w:t xml:space="preserve"> </w:t>
+      </w:r>
+      <w:r>
+        <w:t>tools</w:t>
+      </w:r>
+      <w:r>
+        <w:rPr>
+          <w:spacing w:val="-3"/>
+        </w:rPr>
+        <w:t xml:space="preserve"> </w:t>
+      </w:r>
+      <w:r>
+        <w:t>in</w:t>
+      </w:r>
+      <w:r>
+        <w:rPr>
+          <w:spacing w:val="-3"/>
+        </w:rPr>
+        <w:t xml:space="preserve"> </w:t>
+      </w:r>
+      <w:r>
+        <w:t>completing</w:t>
+      </w:r>
+      <w:r>
+        <w:rPr>
+          <w:spacing w:val="-3"/>
+        </w:rPr>
+        <w:t xml:space="preserve"> </w:t>
+      </w:r>
+      <w:r>
+        <w:t>this</w:t>
+      </w:r>
+      <w:r>
+        <w:rPr>
+          <w:spacing w:val="-3"/>
+        </w:rPr>
+        <w:t xml:space="preserve"> </w:t>
+      </w:r>
+      <w:r>
+        <w:t>submission,</w:t>
+      </w:r>
+      <w:r>
+        <w:rPr>
+          <w:spacing w:val="-3"/>
+        </w:rPr>
+        <w:t xml:space="preserve"> </w:t>
+      </w:r>
+      <w:r>
+        <w:t>please</w:t>
+      </w:r>
+      <w:r>
+        <w:rPr>
+          <w:spacing w:val="-5"/>
+        </w:rPr>
+        <w:t xml:space="preserve"> </w:t>
+      </w:r>
+      <w:r>
+        <w:t>briefly</w:t>
+      </w:r>
+      <w:r>
+        <w:rPr>
+          <w:spacing w:val="-3"/>
+        </w:rPr>
+        <w:t xml:space="preserve"> </w:t>
+      </w:r>
+      <w:r>
+        <w:t>describe</w:t>
+      </w:r>
+      <w:r>
+        <w:rPr>
+          <w:spacing w:val="-3"/>
+        </w:rPr>
+        <w:t xml:space="preserve"> </w:t>
+      </w:r>
+      <w:r>
+        <w:t>in approximately 100 words how you have used these tools:</w:t>
+      </w:r>
+    </w:p>
+    <w:p>
+      <w:pPr>
+        <w:rPr>
+          <w:rFonts w:ascii="Arial"/>
+          <w:b/>
+          <w:sz w:val="20"/>
+        </w:rPr>
+      </w:pPr>
+      <w:r>
+        <w:rPr>
+          <w:rFonts w:ascii="Arial"/>
+          <w:b/>
+          <w:noProof/>
+          <w:sz w:val="20"/>
+        </w:rPr>
+        <mc:AlternateContent>
+          <mc:Choice Requires="wps">
+            <w:drawing>
+              <wp:anchor distT="0" distB="0" distL="0" distR="0" simplePos="0" relativeHeight="251661312" behindDoc="1" locked="0" layoutInCell="1" allowOverlap="1" wp14:anchorId="5F734829" wp14:editId="50CA51F6">
+                <wp:simplePos x="0" y="0"/>
+                <wp:positionH relativeFrom="page">
+                  <wp:posOffset>711200</wp:posOffset>
+                </wp:positionH>
+                <wp:positionV relativeFrom="paragraph">
+                  <wp:posOffset>167005</wp:posOffset>
+                </wp:positionV>
+                <wp:extent cx="6169025" cy="1252855"/>
+                <wp:effectExtent l="0" t="0" r="22225" b="23495"/>
+                <wp:wrapTopAndBottom/>
+                <wp:docPr id="3" name="Textbox 3"/>
+                <wp:cNvGraphicFramePr>
+                  <a:graphicFrameLocks xmlns:a="http://schemas.openxmlformats.org/drawingml/2006/main"/>
+                </wp:cNvGraphicFramePr>
+                <a:graphic xmlns:a="http://schemas.openxmlformats.org/drawingml/2006/main">
+                  <a:graphicData uri="http://schemas.microsoft.com/office/word/2010/wordprocessingShape">
+                    <wps:wsp>
+                      <wps:cNvSpPr txBox="1">
+                        <a:spLocks/>
+                      </wps:cNvSpPr>
+                      <wps:spPr>
+                        <a:xfrm>
+                          <a:off x="0" y="0"/>
+                          <a:ext cx="6169025" cy="1252855"/>
+                        </a:xfrm>
+                        <a:prstGeom prst="rect">
+                          <a:avLst/>
+                        </a:prstGeom>
+                        <a:ln w="6095">
+                          <a:solidFill>
+                            <a:srgbClr val="808080"/>
+                          </a:solidFill>
+                          <a:prstDash val="solid"/>
+                        </a:ln>
+                      </wps:spPr>
+                      <wps:txbx>
+                        <w:txbxContent>
+                          <w:p>
+                            <w:r>
+                              <w:t>I have used AI tools to check grammar for my paragraphs, with careful practices not to change any original meaning or context of my text. As English is not my first language, there are some minor grammar mistakes in my report. To fix these, AI tools Grammarly and Quill bot are used in order to improve my writing and make it more academic.</w:t>
+                            </w:r>
+                          </w:p>
+                          <w:p>
+                            <w:pPr>
+                              <w:pStyle w:val="BodyText"/>
+                              <w:spacing w:before="19"/>
+                              <w:ind w:left="108"/>
+                            </w:pPr>
+                          </w:p>
+                        </w:txbxContent>
+                      </wps:txbx>
+                      <wps:bodyPr wrap="square" lIns="0" tIns="0" rIns="0" bIns="0" rtlCol="0">
+                        <a:noAutofit/>
+                      </wps:bodyPr>
+                    </wps:wsp>
+                  </a:graphicData>
+                </a:graphic>
+                <wp14:sizeRelV relativeFrom="margin">
+                  <wp14:pctHeight>0</wp14:pctHeight>
+                </wp14:sizeRelV>
+              </wp:anchor>
+            </w:drawing>
+          </mc:Choice>
+          <mc:Fallback>
+            <w:pict>
+              <v:shape w14:anchorId="5F734829" id="Textbox 3" o:spid="_x0000_s1027" type="#_x0000_t202" style="position:absolute;left:0;text-align:left;margin-left:56pt;margin-top:13.15pt;width:485.75pt;height:98.65pt;z-index:-251655168;visibility:visible;mso-wrap-style:square;mso-height-percent:0;mso-wrap-distance-left:0;mso-wrap-distance-top:0;mso-wrap-distance-right:0;mso-wrap-distance-bottom:0;mso-position-horizontal:absolute;mso-position-horizontal-relative:page;mso-position-vertical:absolute;mso-position-vertical-relative:text;mso-height-percent:0;mso-height-relative:margin;v-text-anchor:top" o:gfxdata="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" filled="f" strokecolor="gray" strokeweight=".16931mm">
+                <v:path arrowok="t"/>
+                <v:textbox inset="0,0,0,0">
+                  <w:txbxContent>
+                    <w:p>
+                      <w:r>
+                        <w:t>I have used AI tools to check grammar for my paragraphs, with careful practices not to change any original meaning or context of my text. As English is not my first language, there are some minor grammar mistakes in my report. To fix these, AI tools Grammarly and Quill bot are used in order to improve my writing and make it more academic.</w:t>
+                      </w:r>
+                    </w:p>
+                    <w:p>
+                      <w:pPr>
+                        <w:pStyle w:val="BodyText"/>
+                        <w:spacing w:before="19"/>
+                        <w:ind w:left="108"/>
+                      </w:pPr>
+                    </w:p>
+                  </w:txbxContent>
+                </v:textbox>
+                <w10:wrap type="topAndBottom" anchorx="page"/>
+              </v:shape>
+            </w:pict>
+          </mc:Fallback>
+        </mc:AlternateContent>
+      </w:r>
+    </w:p>
     <w:p/>
-    <w:p/>
-    <w:p/>
-    <w:p/>
-    <w:p>
-      <w:pPr>
-        <w:jc w:val="center"/>
-        <w:rPr>
-          <w:sz w:val="72"/>
-          <w:szCs w:val="72"/>
-        </w:rPr>
-      </w:pPr>
-      <w:r>
-        <w:rPr>
-          <w:sz w:val="72"/>
-          <w:szCs w:val="72"/>
-        </w:rPr>
-        <w:t>Software Development</w:t>
-      </w:r>
-      <w:r>
-        <w:rPr>
-          <w:sz w:val="72"/>
-          <w:szCs w:val="72"/>
-        </w:rPr>
-        <w:t xml:space="preserve"> Coursework Part </w:t>
-      </w:r>
-      <w:r>
-        <w:rPr>
-          <w:sz w:val="72"/>
-          <w:szCs w:val="72"/>
-        </w:rPr>
-        <w:t>2</w:t>
-      </w:r>
-    </w:p>
-    <w:p>
-      <w:pPr>
-        <w:jc w:val="center"/>
-        <w:rPr>
-          <w:sz w:val="56"/>
-          <w:szCs w:val="56"/>
-        </w:rPr>
-      </w:pPr>
-      <w:r>
-        <w:rPr>
-          <w:sz w:val="56"/>
-          <w:szCs w:val="56"/>
-        </w:rPr>
-        <w:t>HLUM HTET AUNG</w:t>
-      </w:r>
-    </w:p>
-    <w:p>
-      <w:pPr>
-        <w:jc w:val="center"/>
-        <w:rPr>
-          <w:sz w:val="56"/>
-          <w:szCs w:val="56"/>
-        </w:rPr>
-      </w:pPr>
-      <w:r>
-        <w:rPr>
-          <w:sz w:val="56"/>
-          <w:szCs w:val="56"/>
-        </w:rPr>
-        <w:t>40841063</w:t>
-      </w:r>
-    </w:p>
-    <w:p>
-      <w:pPr>
-        <w:spacing w:line="278" w:lineRule="auto"/>
-        <w:jc w:val="left"/>
-        <w:rPr>
-          <w:sz w:val="56"/>
-          <w:szCs w:val="56"/>
-        </w:rPr>
-      </w:pPr>
-      <w:r>
-        <w:rPr>
-          <w:sz w:val="56"/>
-          <w:szCs w:val="56"/>
-        </w:rPr>
+    <w:p>
+      <w:r>
         <w:br w:type="page"/>
       </w:r>
     </w:p>
@@ -144,12 +2384,112 @@
           <w:r>
             <w:fldChar w:fldCharType="separate"/>
           </w:r>
-          <w:hyperlink w:anchor="_Toc237254353" w:history="1">
+          <w:hyperlink w:anchor="_Toc237343941" w:history="1">
             <w:r>
               <w:rPr>
                 <w:rStyle w:val="Hyperlink"/>
                 <w:noProof/>
               </w:rPr>
+              <w:t>ASSESSMENT</w:t>
+            </w:r>
+            <w:r>
+              <w:rPr>
+                <w:rStyle w:val="Hyperlink"/>
+                <w:noProof/>
+                <w:spacing w:val="-10"/>
+              </w:rPr>
+              <w:t xml:space="preserve"> </w:t>
+            </w:r>
+            <w:r>
+              <w:rPr>
+                <w:rStyle w:val="Hyperlink"/>
+                <w:noProof/>
+              </w:rPr>
+              <w:t>COVER</w:t>
+            </w:r>
+            <w:r>
+              <w:rPr>
+                <w:rStyle w:val="Hyperlink"/>
+                <w:noProof/>
+                <w:spacing w:val="-12"/>
+              </w:rPr>
+              <w:t xml:space="preserve"> </w:t>
+            </w:r>
+            <w:r>
+              <w:rPr>
+                <w:rStyle w:val="Hyperlink"/>
+                <w:noProof/>
+                <w:spacing w:val="-4"/>
+              </w:rPr>
+              <w:t>SHEET</w:t>
+            </w:r>
+            <w:r>
+              <w:rPr>
+                <w:noProof/>
+                <w:webHidden/>
+              </w:rPr>
+              <w:tab/>
+            </w:r>
+            <w:r>
+              <w:rPr>
+                <w:noProof/>
+                <w:webHidden/>
+              </w:rPr>
+              <w:fldChar w:fldCharType="begin"/>
+            </w:r>
+            <w:r>
+              <w:rPr>
+                <w:noProof/>
+                <w:webHidden/>
+              </w:rPr>
+              <w:instrText xml:space="preserve"> PAGEREF _Toc237343941 \h </w:instrText>
+            </w:r>
+            <w:r>
+              <w:rPr>
+                <w:noProof/>
+                <w:webHidden/>
+              </w:rPr>
+            </w:r>
+            <w:r>
+              <w:rPr>
+                <w:noProof/>
+                <w:webHidden/>
+              </w:rPr>
+              <w:fldChar w:fldCharType="separate"/>
+            </w:r>
+            <w:r>
+              <w:rPr>
+                <w:noProof/>
+                <w:webHidden/>
+              </w:rPr>
+              <w:t>1</w:t>
+            </w:r>
+            <w:r>
+              <w:rPr>
+                <w:noProof/>
+                <w:webHidden/>
+              </w:rPr>
+              <w:fldChar w:fldCharType="end"/>
+            </w:r>
+          </w:hyperlink>
+        </w:p>
+        <w:p>
+          <w:pPr>
+            <w:pStyle w:val="TOC1"/>
+            <w:tabs>
+              <w:tab w:val="right" w:leader="dot" w:pos="9350"/>
+            </w:tabs>
+            <w:rPr>
+              <w:rFonts w:asciiTheme="minorHAnsi" w:eastAsiaTheme="minorEastAsia" w:hAnsiTheme="minorHAnsi"/>
+              <w:noProof/>
+            </w:rPr>
+          </w:pPr>
+          <w:hyperlink w:anchor="_Toc237343942" w:history="1">
+            <w:r>
+              <w:rPr>
+                <w:rStyle w:val="Hyperlink"/>
+                <w:noProof/>
+              </w:rPr>
               <w:t>Dice Game Program</w:t>
             </w:r>
             <w:r>
@@ -171,7 +2511,7 @@
                 <w:noProof/>
                 <w:webHidden/>
               </w:rPr>
-              <w:instrText xml:space="preserve"> PAGEREF _Toc237254353 \h </w:instrText>
+              <w:instrText xml:space="preserve"> PAGEREF _Toc237343942 \h </w:instrText>
             </w:r>
             <w:r>
               <w:rPr>
@@ -191,7 +2531,7 @@
                 <w:noProof/>
                 <w:webHidden/>
               </w:rPr>
-              <w:t>4</w:t>
+              <w:t>5</w:t>
             </w:r>
             <w:r>
               <w:rPr>
@@ -213,7 +2553,7 @@
               <w:noProof/>
             </w:rPr>
           </w:pPr>
-          <w:hyperlink w:anchor="_Toc237254354" w:history="1">
+          <w:hyperlink w:anchor="_Toc237343943" w:history="1">
             <w:r>
               <w:rPr>
                 <w:rStyle w:val="Hyperlink"/>
@@ -240,7 +2580,7 @@
                 <w:noProof/>
                 <w:webHidden/>
               </w:rPr>
-              <w:instrText xml:space="preserve"> PAGEREF _Toc237254354 \h </w:instrText>
+              <w:instrText xml:space="preserve"> PAGEREF _Toc237343943 \h </w:instrText>
             </w:r>
             <w:r>
               <w:rPr>
@@ -260,7 +2600,7 @@
                 <w:noProof/>
                 <w:webHidden/>
               </w:rPr>
-              <w:t>4</w:t>
+              <w:t>5</w:t>
             </w:r>
             <w:r>
               <w:rPr>
@@ -282,7 +2622,7 @@
               <w:noProof/>
             </w:rPr>
           </w:pPr>
-          <w:hyperlink w:anchor="_Toc237254355" w:history="1">
+          <w:hyperlink w:anchor="_Toc237343944" w:history="1">
             <w:r>
               <w:rPr>
                 <w:rStyle w:val="Hyperlink"/>
@@ -309,7 +2649,7 @@
                 <w:noProof/>
                 <w:webHidden/>
               </w:rPr>
-              <w:instrText xml:space="preserve"> PAGEREF _Toc237254355 \h </w:instrText>
+              <w:instrText xml:space="preserve"> PAGEREF _Toc237343944 \h </w:instrText>
             </w:r>
             <w:r>
               <w:rPr>
@@ -329,7 +2669,7 @@
                 <w:noProof/>
                 <w:webHidden/>
               </w:rPr>
-              <w:t>4</w:t>
+              <w:t>5</w:t>
             </w:r>
             <w:r>
               <w:rPr>
@@ -351,7 +2691,7 @@
               <w:noProof/>
             </w:rPr>
           </w:pPr>
-          <w:hyperlink w:anchor="_Toc237254356" w:history="1">
+          <w:hyperlink w:anchor="_Toc237343945" w:history="1">
             <w:r>
               <w:rPr>
                 <w:rStyle w:val="Hyperlink"/>
@@ -378,7 +2718,7 @@
                 <w:noProof/>
                 <w:webHidden/>
               </w:rPr>
-              <w:instrText xml:space="preserve"> PAGEREF _Toc237254356 \h </w:instrText>
+              <w:instrText xml:space="preserve"> PAGEREF _Toc237343945 \h </w:instrText>
             </w:r>
             <w:r>
               <w:rPr>
@@ -398,7 +2738,7 @@
                 <w:noProof/>
                 <w:webHidden/>
               </w:rPr>
-              <w:t>5</w:t>
+              <w:t>6</w:t>
             </w:r>
             <w:r>
               <w:rPr>
@@ -420,7 +2760,7 @@
               <w:noProof/>
             </w:rPr>
           </w:pPr>
-          <w:hyperlink w:anchor="_Toc237254357" w:history="1">
+          <w:hyperlink w:anchor="_Toc237343946" w:history="1">
             <w:r>
               <w:rPr>
                 <w:rStyle w:val="Hyperlink"/>
@@ -447,7 +2787,7 @@
                 <w:noProof/>
                 <w:webHidden/>
               </w:rPr>
-              <w:instrText xml:space="preserve"> PAGEREF _Toc237254357 \h </w:instrText>
+              <w:instrText xml:space="preserve"> PAGEREF _Toc237343946 \h </w:instrText>
             </w:r>
             <w:r>
               <w:rPr>
@@ -467,7 +2807,7 @@
                 <w:noProof/>
                 <w:webHidden/>
               </w:rPr>
-              <w:t>5</w:t>
+              <w:t>6</w:t>
             </w:r>
             <w:r>
               <w:rPr>
@@ -489,7 +2829,7 @@
               <w:noProof/>
             </w:rPr>
           </w:pPr>
-          <w:hyperlink w:anchor="_Toc237254358" w:history="1">
+          <w:hyperlink w:anchor="_Toc237343947" w:history="1">
             <w:r>
               <w:rPr>
                 <w:rStyle w:val="Hyperlink"/>
@@ -516,7 +2856,7 @@
                 <w:noProof/>
                 <w:webHidden/>
               </w:rPr>
-              <w:instrText xml:space="preserve"> PAGEREF _Toc237254358 \h </w:instrText>
+              <w:instrText xml:space="preserve"> PAGEREF _Toc237343947 \h </w:instrText>
             </w:r>
             <w:r>
               <w:rPr>
@@ -536,7 +2876,7 @@
                 <w:noProof/>
                 <w:webHidden/>
               </w:rPr>
-              <w:t>5</w:t>
+              <w:t>6</w:t>
             </w:r>
             <w:r>
               <w:rPr>
@@ -558,7 +2898,7 @@
               <w:noProof/>
             </w:rPr>
           </w:pPr>
-          <w:hyperlink w:anchor="_Toc237254359" w:history="1">
+          <w:hyperlink w:anchor="_Toc237343948" w:history="1">
             <w:r>
               <w:rPr>
                 <w:rStyle w:val="Hyperlink"/>
@@ -585,7 +2925,7 @@
                 <w:noProof/>
                 <w:webHidden/>
               </w:rPr>
-              <w:instrText xml:space="preserve"> PAGEREF _Toc237254359 \h </w:instrText>
+              <w:instrText xml:space="preserve"> PAGEREF _Toc237343948 \h </w:instrText>
             </w:r>
             <w:r>
               <w:rPr>
@@ -605,7 +2945,7 @@
                 <w:noProof/>
                 <w:webHidden/>
               </w:rPr>
-              <w:t>5</w:t>
+              <w:t>6</w:t>
             </w:r>
             <w:r>
               <w:rPr>
@@ -627,7 +2967,7 @@
               <w:noProof/>
             </w:rPr>
           </w:pPr>
-          <w:hyperlink w:anchor="_Toc237254360" w:history="1">
+          <w:hyperlink w:anchor="_Toc237343949" w:history="1">
             <w:r>
               <w:rPr>
                 <w:rStyle w:val="Hyperlink"/>
@@ -654,7 +2994,7 @@
                 <w:noProof/>
                 <w:webHidden/>
               </w:rPr>
-              <w:instrText xml:space="preserve"> PAGEREF _Toc237254360 \h </w:instrText>
+              <w:instrText xml:space="preserve"> PAGEREF _Toc237343949 \h </w:instrText>
             </w:r>
             <w:r>
               <w:rPr>
@@ -674,7 +3014,7 @@
                 <w:noProof/>
                 <w:webHidden/>
               </w:rPr>
-              <w:t>6</w:t>
+              <w:t>7</w:t>
             </w:r>
             <w:r>
               <w:rPr>
@@ -696,7 +3036,7 @@
               <w:noProof/>
             </w:rPr>
           </w:pPr>
-          <w:hyperlink w:anchor="_Toc237254361" w:history="1">
+          <w:hyperlink w:anchor="_Toc237343950" w:history="1">
             <w:r>
               <w:rPr>
                 <w:rStyle w:val="Hyperlink"/>
@@ -723,7 +3063,7 @@
                 <w:noProof/>
                 <w:webHidden/>
               </w:rPr>
-              <w:instrText xml:space="preserve"> PAGEREF _Toc237254361 \h </w:instrText>
+              <w:instrText xml:space="preserve"> PAGEREF _Toc237343950 \h </w:instrText>
             </w:r>
             <w:r>
               <w:rPr>
@@ -743,7 +3083,7 @@
                 <w:noProof/>
                 <w:webHidden/>
               </w:rPr>
-              <w:t>6</w:t>
+              <w:t>7</w:t>
             </w:r>
             <w:r>
               <w:rPr>
@@ -765,7 +3105,7 @@
               <w:noProof/>
             </w:rPr>
           </w:pPr>
-          <w:hyperlink w:anchor="_Toc237254362" w:history="1">
+          <w:hyperlink w:anchor="_Toc237343951" w:history="1">
             <w:r>
               <w:rPr>
                 <w:rStyle w:val="Hyperlink"/>
@@ -792,7 +3132,7 @@
                 <w:noProof/>
                 <w:webHidden/>
               </w:rPr>
-              <w:instrText xml:space="preserve"> PAGEREF _Toc237254362 \h </w:instrText>
+              <w:instrText xml:space="preserve"> PAGEREF _Toc237343951 \h </w:instrText>
             </w:r>
             <w:r>
               <w:rPr>
@@ -812,7 +3152,7 @@
                 <w:noProof/>
                 <w:webHidden/>
               </w:rPr>
-              <w:t>6</w:t>
+              <w:t>8</w:t>
             </w:r>
             <w:r>
               <w:rPr>
@@ -834,7 +3174,7 @@
               <w:noProof/>
             </w:rPr>
           </w:pPr>
-          <w:hyperlink w:anchor="_Toc237254363" w:history="1">
+          <w:hyperlink w:anchor="_Toc237343952" w:history="1">
             <w:r>
               <w:rPr>
                 <w:rStyle w:val="Hyperlink"/>
@@ -861,7 +3201,7 @@
                 <w:noProof/>
                 <w:webHidden/>
               </w:rPr>
-              <w:instrText xml:space="preserve"> PAGEREF _Toc237254363 \h </w:instrText>
+              <w:instrText xml:space="preserve"> PAGEREF _Toc237343952 \h </w:instrText>
             </w:r>
             <w:r>
               <w:rPr>
@@ -881,7 +3221,7 @@
                 <w:noProof/>
                 <w:webHidden/>
               </w:rPr>
-              <w:t>6</w:t>
+              <w:t>8</w:t>
             </w:r>
             <w:r>
               <w:rPr>
@@ -903,7 +3243,7 @@
               <w:noProof/>
             </w:rPr>
           </w:pPr>
-          <w:hyperlink w:anchor="_Toc237254364" w:history="1">
+          <w:hyperlink w:anchor="_Toc237343953" w:history="1">
             <w:r>
               <w:rPr>
                 <w:rStyle w:val="Hyperlink"/>
@@ -930,7 +3270,7 @@
                 <w:noProof/>
                 <w:webHidden/>
               </w:rPr>
-              <w:instrText xml:space="preserve"> PAGEREF _Toc237254364 \h </w:instrText>
+              <w:instrText xml:space="preserve"> PAGEREF _Toc237343953 \h </w:instrText>
             </w:r>
             <w:r>
               <w:rPr>
@@ -950,7 +3290,7 @@
                 <w:noProof/>
                 <w:webHidden/>
               </w:rPr>
-              <w:t>6</w:t>
+              <w:t>8</w:t>
             </w:r>
             <w:r>
               <w:rPr>
@@ -972,7 +3312,7 @@
               <w:noProof/>
             </w:rPr>
           </w:pPr>
-          <w:hyperlink w:anchor="_Toc237254365" w:history="1">
+          <w:hyperlink w:anchor="_Toc237343954" w:history="1">
             <w:r>
               <w:rPr>
                 <w:rStyle w:val="Hyperlink"/>
@@ -999,7 +3339,7 @@
                 <w:noProof/>
                 <w:webHidden/>
               </w:rPr>
-              <w:instrText xml:space="preserve"> PAGEREF _Toc237254365 \h </w:instrText>
+              <w:instrText xml:space="preserve"> PAGEREF _Toc237343954 \h </w:instrText>
             </w:r>
             <w:r>
               <w:rPr>
@@ -1019,7 +3359,7 @@
                 <w:noProof/>
                 <w:webHidden/>
               </w:rPr>
-              <w:t>7</w:t>
+              <w:t>8</w:t>
             </w:r>
             <w:r>
               <w:rPr>
@@ -1041,7 +3381,7 @@
               <w:noProof/>
             </w:rPr>
           </w:pPr>
-          <w:hyperlink w:anchor="_Toc237254366" w:history="1">
+          <w:hyperlink w:anchor="_Toc237343955" w:history="1">
             <w:r>
               <w:rPr>
                 <w:rStyle w:val="Hyperlink"/>
@@ -1068,7 +3408,7 @@
                 <w:noProof/>
                 <w:webHidden/>
               </w:rPr>
-              <w:instrText xml:space="preserve"> PAGEREF _Toc237254366 \h </w:instrText>
+              <w:instrText xml:space="preserve"> PAGEREF _Toc237343955 \h </w:instrText>
             </w:r>
             <w:r>
               <w:rPr>
@@ -1088,7 +3428,7 @@
                 <w:noProof/>
                 <w:webHidden/>
               </w:rPr>
-              <w:t>7</w:t>
+              <w:t>8</w:t>
             </w:r>
             <w:r>
               <w:rPr>
@@ -1110,7 +3450,7 @@
               <w:noProof/>
             </w:rPr>
           </w:pPr>
-          <w:hyperlink w:anchor="_Toc237254367" w:history="1">
+          <w:hyperlink w:anchor="_Toc237343956" w:history="1">
             <w:r>
               <w:rPr>
                 <w:rStyle w:val="Hyperlink"/>
@@ -1137,7 +3477,7 @@
                 <w:noProof/>
                 <w:webHidden/>
               </w:rPr>
-              <w:instrText xml:space="preserve"> PAGEREF _Toc237254367 \h </w:instrText>
+              <w:instrText xml:space="preserve"> PAGEREF _Toc237343956 \h </w:instrText>
             </w:r>
             <w:r>
               <w:rPr>
@@ -1157,7 +3497,7 @@
                 <w:noProof/>
                 <w:webHidden/>
               </w:rPr>
-              <w:t>7</w:t>
+              <w:t>9</w:t>
             </w:r>
             <w:r>
               <w:rPr>
@@ -1179,7 +3519,7 @@
               <w:noProof/>
             </w:rPr>
           </w:pPr>
-          <w:hyperlink w:anchor="_Toc237254368" w:history="1">
+          <w:hyperlink w:anchor="_Toc237343957" w:history="1">
             <w:r>
               <w:rPr>
                 <w:rStyle w:val="Hyperlink"/>
@@ -1206,7 +3546,7 @@
                 <w:noProof/>
                 <w:webHidden/>
               </w:rPr>
-              <w:instrText xml:space="preserve"> PAGEREF _Toc237254368 \h </w:instrText>
+              <w:instrText xml:space="preserve"> PAGEREF _Toc237343957 \h </w:instrText>
             </w:r>
             <w:r>
               <w:rPr>
@@ -1226,7 +3566,7 @@
                 <w:noProof/>
                 <w:webHidden/>
               </w:rPr>
-              <w:t>8</w:t>
+              <w:t>9</w:t>
             </w:r>
             <w:r>
               <w:rPr>
@@ -1248,7 +3588,7 @@
               <w:noProof/>
             </w:rPr>
           </w:pPr>
-          <w:hyperlink w:anchor="_Toc237254369" w:history="1">
+          <w:hyperlink w:anchor="_Toc237343958" w:history="1">
             <w:r>
               <w:rPr>
                 <w:rStyle w:val="Hyperlink"/>
@@ -1275,7 +3615,7 @@
                 <w:noProof/>
                 <w:webHidden/>
               </w:rPr>
-              <w:instrText xml:space="preserve"> PAGEREF _Toc237254369 \h </w:instrText>
+              <w:instrText xml:space="preserve"> PAGEREF _Toc237343958 \h </w:instrText>
             </w:r>
             <w:r>
               <w:rPr>
@@ -1295,7 +3635,7 @@
                 <w:noProof/>
                 <w:webHidden/>
               </w:rPr>
-              <w:t>8</w:t>
+              <w:t>9</w:t>
             </w:r>
             <w:r>
               <w:rPr>
@@ -1317,7 +3657,7 @@
               <w:noProof/>
             </w:rPr>
           </w:pPr>
-          <w:hyperlink w:anchor="_Toc237254370" w:history="1">
+          <w:hyperlink w:anchor="_Toc237343959" w:history="1">
             <w:r>
               <w:rPr>
                 <w:rStyle w:val="Hyperlink"/>
@@ -1344,7 +3684,7 @@
                 <w:noProof/>
                 <w:webHidden/>
               </w:rPr>
-              <w:instrText xml:space="preserve"> PAGEREF _Toc237254370 \h </w:instrText>
+              <w:instrText xml:space="preserve"> PAGEREF _Toc237343959 \h </w:instrText>
             </w:r>
             <w:r>
               <w:rPr>
@@ -1364,7 +3704,7 @@
                 <w:noProof/>
                 <w:webHidden/>
               </w:rPr>
-              <w:t>9</w:t>
+              <w:t>11</w:t>
             </w:r>
             <w:r>
               <w:rPr>
@@ -1386,7 +3726,7 @@
               <w:noProof/>
             </w:rPr>
           </w:pPr>
-          <w:hyperlink w:anchor="_Toc237254371" w:history="1">
+          <w:hyperlink w:anchor="_Toc237343960" w:history="1">
             <w:r>
               <w:rPr>
                 <w:rStyle w:val="Hyperlink"/>
@@ -1413,7 +3753,7 @@
                 <w:noProof/>
                 <w:webHidden/>
               </w:rPr>
-              <w:instrText xml:space="preserve"> PAGEREF _Toc237254371 \h </w:instrText>
+              <w:instrText xml:space="preserve"> PAGEREF _Toc237343960 \h </w:instrText>
             </w:r>
             <w:r>
               <w:rPr>
@@ -1433,7 +3773,7 @@
                 <w:noProof/>
                 <w:webHidden/>
               </w:rPr>
-              <w:t>10</w:t>
+              <w:t>11</w:t>
             </w:r>
             <w:r>
               <w:rPr>
@@ -1455,7 +3795,7 @@
               <w:noProof/>
             </w:rPr>
           </w:pPr>
-          <w:hyperlink w:anchor="_Toc237254372" w:history="1">
+          <w:hyperlink w:anchor="_Toc237343961" w:history="1">
             <w:r>
               <w:rPr>
                 <w:rStyle w:val="Hyperlink"/>
@@ -1482,7 +3822,7 @@
                 <w:noProof/>
                 <w:webHidden/>
               </w:rPr>
-              <w:instrText xml:space="preserve"> PAGEREF _Toc237254372 \h </w:instrText>
+              <w:instrText xml:space="preserve"> PAGEREF _Toc237343961 \h </w:instrText>
             </w:r>
             <w:r>
               <w:rPr>
@@ -1502,7 +3842,7 @@
                 <w:noProof/>
                 <w:webHidden/>
               </w:rPr>
-              <w:t>12</w:t>
+              <w:t>13</w:t>
             </w:r>
             <w:r>
               <w:rPr>
@@ -1524,7 +3864,7 @@
               <w:noProof/>
             </w:rPr>
           </w:pPr>
-          <w:hyperlink w:anchor="_Toc237254373" w:history="1">
+          <w:hyperlink w:anchor="_Toc237343962" w:history="1">
             <w:r>
               <w:rPr>
                 <w:rStyle w:val="Hyperlink"/>
@@ -1551,7 +3891,7 @@
                 <w:noProof/>
                 <w:webHidden/>
               </w:rPr>
-              <w:instrText xml:space="preserve"> PAGEREF _Toc237254373 \h </w:instrText>
+              <w:instrText xml:space="preserve"> PAGEREF _Toc237343962 \h </w:instrText>
             </w:r>
             <w:r>
               <w:rPr>
@@ -1571,7 +3911,7 @@
                 <w:noProof/>
                 <w:webHidden/>
               </w:rPr>
-              <w:t>12</w:t>
+              <w:t>13</w:t>
             </w:r>
             <w:r>
               <w:rPr>
@@ -1593,7 +3933,7 @@
               <w:noProof/>
             </w:rPr>
           </w:pPr>
-          <w:hyperlink w:anchor="_Toc237254374" w:history="1">
+          <w:hyperlink w:anchor="_Toc237343963" w:history="1">
             <w:r>
               <w:rPr>
                 <w:rStyle w:val="Hyperlink"/>
@@ -1620,7 +3960,7 @@
                 <w:noProof/>
                 <w:webHidden/>
               </w:rPr>
-              <w:instrText xml:space="preserve"> PAGEREF _Toc237254374 \h </w:instrText>
+              <w:instrText xml:space="preserve"> PAGEREF _Toc237343963 \h </w:instrText>
             </w:r>
             <w:r>
               <w:rPr>
@@ -1640,7 +3980,7 @@
                 <w:noProof/>
                 <w:webHidden/>
               </w:rPr>
-              <w:t>13</w:t>
+              <w:t>14</w:t>
             </w:r>
             <w:r>
               <w:rPr>
@@ -1662,7 +4002,7 @@
               <w:noProof/>
             </w:rPr>
           </w:pPr>
-          <w:hyperlink w:anchor="_Toc237254375" w:history="1">
+          <w:hyperlink w:anchor="_Toc237343964" w:history="1">
             <w:r>
               <w:rPr>
                 <w:rStyle w:val="Hyperlink"/>
@@ -1689,7 +4029,7 @@
                 <w:noProof/>
                 <w:webHidden/>
               </w:rPr>
-              <w:instrText xml:space="preserve"> PAGEREF _Toc237254375 \h </w:instrText>
+              <w:instrText xml:space="preserve"> PAGEREF _Toc237343964 \h </w:instrText>
             </w:r>
             <w:r>
               <w:rPr>
@@ -1709,7 +4049,7 @@
                 <w:noProof/>
                 <w:webHidden/>
               </w:rPr>
-              <w:t>14</w:t>
+              <w:t>15</w:t>
             </w:r>
             <w:r>
               <w:rPr>
@@ -1731,7 +4071,7 @@
               <w:noProof/>
             </w:rPr>
           </w:pPr>
-          <w:hyperlink w:anchor="_Toc237254376" w:history="1">
+          <w:hyperlink w:anchor="_Toc237343965" w:history="1">
             <w:r>
               <w:rPr>
                 <w:rStyle w:val="Hyperlink"/>
@@ -1758,7 +4098,7 @@
                 <w:noProof/>
                 <w:webHidden/>
               </w:rPr>
-              <w:instrText xml:space="preserve"> PAGEREF _Toc237254376 \h </w:instrText>
+              <w:instrText xml:space="preserve"> PAGEREF _Toc237343965 \h </w:instrText>
             </w:r>
             <w:r>
               <w:rPr>
@@ -1778,7 +4118,7 @@
                 <w:noProof/>
                 <w:webHidden/>
               </w:rPr>
-              <w:t>14</w:t>
+              <w:t>15</w:t>
             </w:r>
             <w:r>
               <w:rPr>
@@ -1800,7 +4140,7 @@
               <w:noProof/>
             </w:rPr>
           </w:pPr>
-          <w:hyperlink w:anchor="_Toc237254377" w:history="1">
+          <w:hyperlink w:anchor="_Toc237343966" w:history="1">
             <w:r>
               <w:rPr>
                 <w:rStyle w:val="Hyperlink"/>
@@ -1827,7 +4167,7 @@
                 <w:noProof/>
                 <w:webHidden/>
               </w:rPr>
-              <w:instrText xml:space="preserve"> PAGEREF _Toc237254377 \h </w:instrText>
+              <w:instrText xml:space="preserve"> PAGEREF _Toc237343966 \h </w:instrText>
             </w:r>
             <w:r>
               <w:rPr>
@@ -1847,7 +4187,7 @@
                 <w:noProof/>
                 <w:webHidden/>
               </w:rPr>
-              <w:t>17</w:t>
+              <w:t>18</w:t>
             </w:r>
             <w:r>
               <w:rPr>
@@ -1869,7 +4209,7 @@
               <w:noProof/>
             </w:rPr>
           </w:pPr>
-          <w:hyperlink w:anchor="_Toc237254378" w:history="1">
+          <w:hyperlink w:anchor="_Toc237343967" w:history="1">
             <w:r>
               <w:rPr>
                 <w:rStyle w:val="Hyperlink"/>
@@ -1896,7 +4236,7 @@
                 <w:noProof/>
                 <w:webHidden/>
               </w:rPr>
-              <w:instrText xml:space="preserve"> PAGEREF _Toc237254378 \h </w:instrText>
+              <w:instrText xml:space="preserve"> PAGEREF _Toc237343967 \h </w:instrText>
             </w:r>
             <w:r>
               <w:rPr>
@@ -1916,7 +4256,7 @@
                 <w:noProof/>
                 <w:webHidden/>
               </w:rPr>
-              <w:t>19</w:t>
+              <w:t>20</w:t>
             </w:r>
             <w:r>
               <w:rPr>
@@ -1948,22 +4288,22 @@
       <w:pPr>
         <w:pStyle w:val="Heading1"/>
       </w:pPr>
-      <w:bookmarkStart w:id="0" w:name="_Toc237254353"/>
+      <w:bookmarkStart w:id="1" w:name="_Toc237343942"/>
       <w:r>
         <w:lastRenderedPageBreak/>
         <w:t>Dice Game Program</w:t>
       </w:r>
-      <w:bookmarkEnd w:id="0"/>
+      <w:bookmarkEnd w:id="1"/>
     </w:p>
     <w:p>
       <w:pPr>
         <w:pStyle w:val="Heading2"/>
       </w:pPr>
-      <w:bookmarkStart w:id="1" w:name="_Toc237254354"/>
+      <w:bookmarkStart w:id="2" w:name="_Toc237343943"/>
       <w:r>
         <w:t>Program introduction</w:t>
       </w:r>
-      <w:bookmarkEnd w:id="1"/>
+      <w:bookmarkEnd w:id="2"/>
     </w:p>
     <w:p>
       <w:r>
@@ -1995,11 +4335,11 @@
       <w:pPr>
         <w:pStyle w:val="Heading2"/>
       </w:pPr>
-      <w:bookmarkStart w:id="2" w:name="_Toc237254355"/>
+      <w:bookmarkStart w:id="3" w:name="_Toc237343944"/>
       <w:r>
         <w:t>Class Diagram</w:t>
       </w:r>
-      <w:bookmarkEnd w:id="2"/>
+      <w:bookmarkEnd w:id="3"/>
     </w:p>
     <w:p>
       <w:pPr>
@@ -2028,7 +4368,7 @@
                     </pic:cNvPicPr>
                   </pic:nvPicPr>
                   <pic:blipFill>
-                    <a:blip r:embed="rId8">
+                    <a:blip r:embed="rId12">
                       <a:extLst>
                         <a:ext uri="{28A0092B-C50C-407E-A947-70E740481C1C}">
                           <a14:useLocalDpi xmlns:a14="http://schemas.microsoft.com/office/drawing/2010/main" val="0"/>
@@ -2265,14 +4605,14 @@
       <w:pPr>
         <w:pStyle w:val="Heading2"/>
       </w:pPr>
-      <w:bookmarkStart w:id="3" w:name="_Toc237254356"/>
+      <w:bookmarkStart w:id="4" w:name="_Toc237343945"/>
       <w:r>
         <w:t>Class Descriptor</w:t>
       </w:r>
       <w:r>
         <w:t xml:space="preserve"> (Main Features Only)</w:t>
       </w:r>
-      <w:bookmarkEnd w:id="3"/>
+      <w:bookmarkEnd w:id="4"/>
     </w:p>
     <w:p>
       <w:r>
@@ -2290,11 +4630,11 @@
       <w:pPr>
         <w:pStyle w:val="Heading3"/>
       </w:pPr>
-      <w:bookmarkStart w:id="4" w:name="_Toc237254357"/>
+      <w:bookmarkStart w:id="5" w:name="_Toc237343946"/>
       <w:r>
         <w:t>Main Class</w:t>
       </w:r>
-      <w:bookmarkEnd w:id="4"/>
+      <w:bookmarkEnd w:id="5"/>
     </w:p>
     <w:p>
       <w:r>
@@ -2306,11 +4646,11 @@
       <w:pPr>
         <w:pStyle w:val="Heading3"/>
       </w:pPr>
-      <w:bookmarkStart w:id="5" w:name="_Toc237254358"/>
+      <w:bookmarkStart w:id="6" w:name="_Toc237343947"/>
       <w:r>
         <w:t>Dice Game Class</w:t>
       </w:r>
-      <w:bookmarkEnd w:id="5"/>
+      <w:bookmarkEnd w:id="6"/>
     </w:p>
     <w:p>
       <w:r>
@@ -2324,7 +4664,7 @@
       <w:pPr>
         <w:pStyle w:val="Heading3"/>
       </w:pPr>
-      <w:bookmarkStart w:id="6" w:name="_Toc237254359"/>
+      <w:bookmarkStart w:id="7" w:name="_Toc237343948"/>
       <w:r>
         <w:t>Betting</w:t>
       </w:r>
@@ -2334,7 +4674,7 @@
       <w:r>
         <w:t xml:space="preserve"> Class</w:t>
       </w:r>
-      <w:bookmarkEnd w:id="6"/>
+      <w:bookmarkEnd w:id="7"/>
     </w:p>
     <w:p>
       <w:r>
@@ -2369,7 +4709,7 @@
         </w:numPr>
       </w:pPr>
       <w:r>
-        <w:t>Ask users to enter a bet amount (Until valid amount is entered)</w:t>
+        <w:t>Shows username and starting bank balance</w:t>
       </w:r>
     </w:p>
     <w:p>
@@ -2381,7 +4721,7 @@
         </w:numPr>
       </w:pPr>
       <w:r>
-        <w:t>Deduct bet amount from the bank account</w:t>
+        <w:t>Ask users to enter a bet amount (Until valid amount is entered)</w:t>
       </w:r>
     </w:p>
     <w:p>
@@ -2393,7 +4733,7 @@
         </w:numPr>
       </w:pPr>
       <w:r>
-        <w:t>Count rounds</w:t>
+        <w:t>Deduct bet amount from the bank account</w:t>
       </w:r>
     </w:p>
     <w:p>
@@ -2405,7 +4745,7 @@
         </w:numPr>
       </w:pPr>
       <w:r>
-        <w:t>Calls dice rolling class to roll dice</w:t>
+        <w:t>Count rounds</w:t>
       </w:r>
     </w:p>
     <w:p>
@@ -2417,7 +4757,7 @@
         </w:numPr>
       </w:pPr>
       <w:r>
-        <w:t>Access results from the returned list</w:t>
+        <w:t>Calls dice rolling class to roll dice</w:t>
       </w:r>
     </w:p>
     <w:p>
@@ -2429,7 +4769,7 @@
         </w:numPr>
       </w:pPr>
       <w:r>
-        <w:t>Set new bank balance using reward condition class</w:t>
+        <w:t>Access results from the returned list</w:t>
       </w:r>
     </w:p>
     <w:p>
@@ -2441,13 +4781,7 @@
         </w:numPr>
       </w:pPr>
       <w:r>
-        <w:t>Record each round with each loop (loop until</w:t>
-      </w:r>
-      <w:r>
-        <w:t xml:space="preserve"> </w:t>
-      </w:r>
-      <w:r>
-        <w:t>bank account is 0 or round count &lt;= 5)</w:t>
+        <w:t>Set new bank balance using reward condition class</w:t>
       </w:r>
     </w:p>
     <w:p>
@@ -2459,7 +4793,13 @@
         </w:numPr>
       </w:pPr>
       <w:r>
-        <w:t>After the loop ends, check bank account to see ending condition and show players</w:t>
+        <w:t>Record each round with each loop (loop until</w:t>
+      </w:r>
+      <w:r>
+        <w:t xml:space="preserve"> </w:t>
+      </w:r>
+      <w:r>
+        <w:t>bank account is 0 or round count &lt;= 5)</w:t>
       </w:r>
     </w:p>
     <w:p>
@@ -2471,7 +4811,7 @@
         </w:numPr>
       </w:pPr>
       <w:r>
-        <w:t>Calls result board class to show the game history</w:t>
+        <w:t>After the loop ends, check bank account to see ending condition and show players</w:t>
       </w:r>
     </w:p>
     <w:p>
@@ -2483,6 +4823,19 @@
         </w:numPr>
       </w:pPr>
       <w:r>
+        <w:t>Calls result board class to show the game history</w:t>
+      </w:r>
+    </w:p>
+    <w:p>
+      <w:pPr>
+        <w:pStyle w:val="ListParagraph"/>
+        <w:numPr>
+          <w:ilvl w:val="0"/>
+          <w:numId w:val="14"/>
+        </w:numPr>
+      </w:pPr>
+      <w:r>
+        <w:lastRenderedPageBreak/>
         <w:t>Calls score board class to show player’s ranking among dummy users</w:t>
       </w:r>
     </w:p>
@@ -2490,225 +4843,291 @@
       <w:pPr>
         <w:pStyle w:val="Heading3"/>
       </w:pPr>
-      <w:bookmarkStart w:id="7" w:name="_Toc237254360"/>
+      <w:bookmarkStart w:id="8" w:name="_Toc237343949"/>
+      <w:r>
+        <w:t>Dice Rolling Class</w:t>
+      </w:r>
+      <w:bookmarkEnd w:id="8"/>
+    </w:p>
+    <w:p>
+      <w:r>
+        <w:tab/>
+      </w:r>
+      <w:r>
+        <w:t xml:space="preserve">The dice rolling class is specifically written to roll the dice and is called by the betting program. This improves the code reusability, as the class can be called again and again, whenever we need to roll the dice. </w:t>
+      </w:r>
+      <w:r>
+        <w:t xml:space="preserve">The program includes </w:t>
+      </w:r>
+      <w:r>
+        <w:t>dice program method with the random rolling function.</w:t>
+      </w:r>
+    </w:p>
+    <w:p>
+      <w:pPr>
+        <w:pStyle w:val="Heading3"/>
+      </w:pPr>
+      <w:bookmarkStart w:id="9" w:name="_Toc237343950"/>
+      <w:r>
+        <w:t>Reward Conditions</w:t>
+      </w:r>
+      <w:bookmarkEnd w:id="9"/>
+    </w:p>
+    <w:p>
+      <w:r>
+        <w:tab/>
+      </w:r>
+      <w:r>
+        <w:t xml:space="preserve">The class checks the winning conditions of the dice game. The code is separated into another class to improve readability and cleanliness. </w:t>
+      </w:r>
+      <w:r>
+        <w:t xml:space="preserve">The class is called by the betting program to see the winning conditions of the player and if their bet has doubled, tripled, or lost the round. The condition checking is called within each loop of the betting program until the game is finished. </w:t>
+      </w:r>
+      <w:r>
+        <w:t xml:space="preserve">The class consists of two methods, apply payout and get result message, to give users both String and </w:t>
+      </w:r>
+      <w:r>
+        <w:t>calculated output for bank</w:t>
+      </w:r>
+      <w:r>
+        <w:t xml:space="preserve"> balance.</w:t>
+      </w:r>
+    </w:p>
+    <w:p>
+      <w:pPr>
+        <w:keepNext/>
+        <w:jc w:val="center"/>
+      </w:pPr>
+      <w:r>
+        <w:drawing>
+          <wp:inline distT="0" distB="0" distL="0" distR="0" wp14:anchorId="5E628BBC" wp14:editId="0D968984">
+            <wp:extent cx="5943600" cy="3418840"/>
+            <wp:effectExtent l="19050" t="19050" r="19050" b="10160"/>
+            <wp:docPr id="492559119" name="Picture 1"/>
+            <wp:cNvGraphicFramePr>
+              <a:graphicFrameLocks xmlns:a="http://schemas.openxmlformats.org/drawingml/2006/main" noChangeAspect="1"/>
+            </wp:cNvGraphicFramePr>
+            <a:graphic xmlns:a="http://schemas.openxmlformats.org/drawingml/2006/main">
+              <a:graphicData uri="http://schemas.openxmlformats.org/drawingml/2006/picture">
+                <pic:pic xmlns:pic="http://schemas.openxmlformats.org/drawingml/2006/picture">
+                  <pic:nvPicPr>
+                    <pic:cNvPr id="492559119" name=""/>
+                    <pic:cNvPicPr/>
+                  </pic:nvPicPr>
+                  <pic:blipFill>
+                    <a:blip r:embed="rId13"/>
+                    <a:stretch>
+                      <a:fillRect/>
+                    </a:stretch>
+                  </pic:blipFill>
+                  <pic:spPr>
+                    <a:xfrm>
+                      <a:off x="0" y="0"/>
+                      <a:ext cx="5943600" cy="3418840"/>
+                    </a:xfrm>
+                    <a:prstGeom prst="rect">
+                      <a:avLst/>
+                    </a:prstGeom>
+                    <a:ln>
+                      <a:solidFill>
+                        <a:schemeClr val="tx1"/>
+                      </a:solidFill>
+                    </a:ln>
+                  </pic:spPr>
+                </pic:pic>
+              </a:graphicData>
+            </a:graphic>
+          </wp:inline>
+        </w:drawing>
+      </w:r>
+    </w:p>
+    <w:p>
+      <w:pPr>
+        <w:jc w:val="center"/>
+      </w:pPr>
+      <w:r>
+        <w:t xml:space="preserve">Figure </w:t>
+      </w:r>
+      <w:fldSimple w:instr=" SEQ Figure \* ARABIC ">
+        <w:r>
+          <w:rPr>
+            <w:noProof/>
+          </w:rPr>
+          <w:t>2</w:t>
+        </w:r>
+      </w:fldSimple>
+      <w:r>
+        <w:t xml:space="preserve"> Rewarding conditions</w:t>
+      </w:r>
+    </w:p>
+    <w:p>
+      <w:pPr>
+        <w:pStyle w:val="Heading3"/>
+      </w:pPr>
+      <w:bookmarkStart w:id="10" w:name="_Toc237343951"/>
       <w:r>
         <w:lastRenderedPageBreak/>
-        <w:t>Dice Rolling Class</w:t>
-      </w:r>
-      <w:bookmarkEnd w:id="7"/>
+        <w:t>Round Recorder</w:t>
+      </w:r>
+      <w:bookmarkEnd w:id="10"/>
     </w:p>
     <w:p>
       <w:r>
         <w:tab/>
       </w:r>
       <w:r>
-        <w:t xml:space="preserve">The dice rolling class is specifically written to roll the dice and is called by the betting program. This improves the code reusability, as the class can be called again and again, whenever we need to roll the dice. </w:t>
-      </w:r>
-      <w:r>
-        <w:t xml:space="preserve">The program includes </w:t>
-      </w:r>
-      <w:r>
-        <w:t>dice program method with the random rolling function.</w:t>
+        <w:t xml:space="preserve">The round recorder is a class that </w:t>
+      </w:r>
+      <w:r>
+        <w:t>records</w:t>
+      </w:r>
+      <w:r>
+        <w:t xml:space="preserve"> the results of each round and </w:t>
+      </w:r>
+      <w:r>
+        <w:t>stores</w:t>
+      </w:r>
+      <w:r>
+        <w:t xml:space="preserve"> them as history. </w:t>
+      </w:r>
+      <w:r>
+        <w:t xml:space="preserve">The class is called by betting program, </w:t>
+      </w:r>
+      <w:r>
+        <w:t>scoreboard</w:t>
+      </w:r>
+      <w:r>
+        <w:t xml:space="preserve"> class, and result board class. </w:t>
+      </w:r>
+      <w:r>
+        <w:t>The class contains</w:t>
+      </w:r>
+      <w:r>
+        <w:t xml:space="preserve"> </w:t>
+      </w:r>
+      <w:r>
+        <w:t>recording</w:t>
+      </w:r>
+      <w:r>
+        <w:t xml:space="preserve"> round method to record rounds, a get method to return history, and reset method which reset the recording.</w:t>
       </w:r>
     </w:p>
     <w:p>
       <w:pPr>
         <w:pStyle w:val="Heading3"/>
       </w:pPr>
-      <w:bookmarkStart w:id="8" w:name="_Toc237254361"/>
-      <w:r>
-        <w:t>Reward Conditions</w:t>
-      </w:r>
-      <w:bookmarkEnd w:id="8"/>
+      <w:bookmarkStart w:id="11" w:name="_Toc237343952"/>
+      <w:r>
+        <w:t>Scoreboard Class</w:t>
+      </w:r>
+      <w:bookmarkEnd w:id="11"/>
     </w:p>
     <w:p>
       <w:r>
         <w:tab/>
       </w:r>
       <w:r>
-        <w:t xml:space="preserve">The class checks the winning conditions of the dice game. The code is separated into another class to improve readability and cleanliness. </w:t>
-      </w:r>
-      <w:r>
-        <w:t xml:space="preserve">The class is called by the betting program to see the winning conditions of the player and if their bet has doubled, tripled, or lost the round. The condition checking is called within each loop of the betting program until the game is finished. </w:t>
-      </w:r>
-      <w:r>
-        <w:t xml:space="preserve">The class consists of two methods, apply payout and get result message, to give users both String and </w:t>
-      </w:r>
-      <w:r>
-        <w:t>calculated output for bank</w:t>
-      </w:r>
-      <w:r>
-        <w:t xml:space="preserve"> balance.</w:t>
+        <w:t xml:space="preserve">The class is for displaying user’s scoreboard. It is called a betting program and consists of board method. This method uses username parameters entered in betting program to set player’s </w:t>
+      </w:r>
+      <w:r>
+        <w:t>name,</w:t>
+      </w:r>
+      <w:r>
+        <w:t xml:space="preserve"> and board method uses </w:t>
+      </w:r>
+      <w:r>
+        <w:t>username</w:t>
+      </w:r>
+      <w:r>
+        <w:t xml:space="preserve"> and bank balance to place a ranking of user among dummy players. </w:t>
+      </w:r>
+      <w:r>
+        <w:t xml:space="preserve">This method mainly uses simple </w:t>
+      </w:r>
+      <w:proofErr w:type="spellStart"/>
+      <w:r>
+        <w:t>Arrays.sort</w:t>
+      </w:r>
+      <w:proofErr w:type="spellEnd"/>
+      <w:r>
+        <w:t>() to tackle the ranking problem.</w:t>
       </w:r>
     </w:p>
     <w:p>
       <w:pPr>
         <w:pStyle w:val="Heading3"/>
       </w:pPr>
-      <w:bookmarkStart w:id="9" w:name="_Toc237254362"/>
-      <w:r>
-        <w:t>Round Recorder</w:t>
-      </w:r>
-      <w:bookmarkEnd w:id="9"/>
+      <w:bookmarkStart w:id="12" w:name="_Toc237343953"/>
+      <w:r>
+        <w:t xml:space="preserve">Result </w:t>
+      </w:r>
+      <w:r>
+        <w:t>B</w:t>
+      </w:r>
+      <w:r>
+        <w:t>oard Class</w:t>
+      </w:r>
+      <w:bookmarkEnd w:id="12"/>
     </w:p>
     <w:p>
       <w:r>
         <w:tab/>
       </w:r>
       <w:r>
-        <w:t xml:space="preserve">The round recorder is a class that </w:t>
-      </w:r>
-      <w:r>
-        <w:t>records</w:t>
-      </w:r>
-      <w:r>
-        <w:t xml:space="preserve"> the results of each round and </w:t>
-      </w:r>
-      <w:r>
-        <w:t>stores</w:t>
-      </w:r>
-      <w:r>
-        <w:t xml:space="preserve"> them as history. </w:t>
-      </w:r>
-      <w:r>
-        <w:t xml:space="preserve">The class is called by betting program, </w:t>
-      </w:r>
-      <w:r>
-        <w:t>scoreboard</w:t>
-      </w:r>
-      <w:r>
-        <w:t xml:space="preserve"> class, and result board class. </w:t>
-      </w:r>
-      <w:r>
-        <w:t>The class contains</w:t>
-      </w:r>
-      <w:r>
-        <w:t xml:space="preserve"> </w:t>
-      </w:r>
-      <w:r>
-        <w:t>recording</w:t>
-      </w:r>
-      <w:r>
-        <w:t xml:space="preserve"> round method to record rounds, a get method to return history, and reset method which reset the recording.</w:t>
+        <w:t xml:space="preserve">The class is for displaying user’s results and </w:t>
+      </w:r>
+      <w:r>
+        <w:t>works</w:t>
+      </w:r>
+      <w:r>
+        <w:t xml:space="preserve"> almost the same as high score board. However, this board contains only one method that displays the result of the betting history of the user</w:t>
+      </w:r>
+      <w:r>
+        <w:t>, and the class is called by the betting program.</w:t>
+      </w:r>
+    </w:p>
+    <w:p>
+      <w:pPr>
+        <w:pStyle w:val="Heading2"/>
+      </w:pPr>
+      <w:bookmarkStart w:id="13" w:name="_Toc237343954"/>
+      <w:r>
+        <w:t>Extensibility Code</w:t>
+      </w:r>
+      <w:bookmarkEnd w:id="13"/>
+    </w:p>
+    <w:p>
+      <w:r>
+        <w:tab/>
+      </w:r>
+      <w:r>
+        <w:t xml:space="preserve">The dice game program is </w:t>
+      </w:r>
+      <w:r>
+        <w:t>extensible,</w:t>
+      </w:r>
+      <w:r>
+        <w:t xml:space="preserve"> and the program variables are very easy to change. </w:t>
+      </w:r>
+      <w:r>
+        <w:t xml:space="preserve">The program uses professional practices and other means to ensure that functions can be added, modified, or deleted without </w:t>
+      </w:r>
+      <w:r>
+        <w:t>rewriting</w:t>
+      </w:r>
+      <w:r>
+        <w:t xml:space="preserve"> most of the code.</w:t>
       </w:r>
     </w:p>
     <w:p>
       <w:pPr>
         <w:pStyle w:val="Heading3"/>
       </w:pPr>
-      <w:bookmarkStart w:id="10" w:name="_Toc237254363"/>
-      <w:r>
-        <w:t>Scoreboard Class</w:t>
-      </w:r>
-      <w:bookmarkEnd w:id="10"/>
-    </w:p>
-    <w:p>
-      <w:r>
-        <w:tab/>
-      </w:r>
-      <w:r>
-        <w:t xml:space="preserve">The class is for displaying user’s scoreboard. It is called a betting program and consists of board method. This method uses username parameters entered in betting program to set player’s </w:t>
-      </w:r>
-      <w:r>
-        <w:t>name,</w:t>
-      </w:r>
-      <w:r>
-        <w:t xml:space="preserve"> and board method uses </w:t>
-      </w:r>
-      <w:r>
-        <w:t>username</w:t>
-      </w:r>
-      <w:r>
-        <w:t xml:space="preserve"> and bank balance to place a ranking of user among dummy players. </w:t>
-      </w:r>
-      <w:r>
-        <w:t xml:space="preserve">This method mainly uses simple </w:t>
-      </w:r>
-      <w:proofErr w:type="spellStart"/>
-      <w:r>
-        <w:t>Arrays.sort</w:t>
-      </w:r>
-      <w:proofErr w:type="spellEnd"/>
-      <w:r>
-        <w:t>() to tackle the ranking problem.</w:t>
-      </w:r>
-    </w:p>
-    <w:p>
-      <w:pPr>
-        <w:pStyle w:val="Heading3"/>
-      </w:pPr>
-      <w:bookmarkStart w:id="11" w:name="_Toc237254364"/>
-      <w:r>
-        <w:t xml:space="preserve">Result </w:t>
-      </w:r>
-      <w:r>
-        <w:t>B</w:t>
-      </w:r>
-      <w:r>
-        <w:t>oard Class</w:t>
-      </w:r>
-      <w:bookmarkEnd w:id="11"/>
-    </w:p>
-    <w:p>
-      <w:r>
-        <w:tab/>
-      </w:r>
-      <w:r>
-        <w:t xml:space="preserve">The class is for displaying user’s results and </w:t>
-      </w:r>
-      <w:r>
-        <w:t>works</w:t>
-      </w:r>
-      <w:r>
-        <w:t xml:space="preserve"> almost the same as high score board. However, this board contains only one method that displays the result of the betting history of the user</w:t>
-      </w:r>
-      <w:r>
-        <w:t>, and the class is called by the betting program.</w:t>
-      </w:r>
-    </w:p>
-    <w:p>
-      <w:pPr>
-        <w:pStyle w:val="Heading2"/>
-      </w:pPr>
-      <w:bookmarkStart w:id="12" w:name="_Toc237254365"/>
-      <w:r>
-        <w:lastRenderedPageBreak/>
-        <w:t>Extensibility Code</w:t>
-      </w:r>
-      <w:bookmarkEnd w:id="12"/>
-    </w:p>
-    <w:p>
-      <w:r>
-        <w:tab/>
-      </w:r>
-      <w:r>
-        <w:t xml:space="preserve">The dice game program is </w:t>
-      </w:r>
-      <w:r>
-        <w:t>extensible,</w:t>
-      </w:r>
-      <w:r>
-        <w:t xml:space="preserve"> and the program variables are very easy to change. </w:t>
-      </w:r>
-      <w:r>
-        <w:t xml:space="preserve">The program uses professional practices and other means to ensure that functions can be added, modified, or deleted without </w:t>
-      </w:r>
-      <w:r>
-        <w:t>rewriting</w:t>
-      </w:r>
-      <w:r>
-        <w:t xml:space="preserve"> most of the code.</w:t>
-      </w:r>
-    </w:p>
-    <w:p>
-      <w:pPr>
-        <w:pStyle w:val="Heading3"/>
-      </w:pPr>
-      <w:bookmarkStart w:id="13" w:name="_Toc237254366"/>
+      <w:bookmarkStart w:id="14" w:name="_Toc237343955"/>
       <w:r>
         <w:t>Separation of Methods</w:t>
       </w:r>
-      <w:bookmarkEnd w:id="13"/>
+      <w:bookmarkEnd w:id="14"/>
     </w:p>
     <w:p>
       <w:r>
@@ -2728,15 +5147,17 @@
         <w:t xml:space="preserve"> through the complex single code base file.</w:t>
       </w:r>
     </w:p>
+    <w:p/>
     <w:p>
       <w:pPr>
         <w:pStyle w:val="Heading3"/>
       </w:pPr>
-      <w:bookmarkStart w:id="14" w:name="_Toc237254367"/>
-      <w:r>
+      <w:bookmarkStart w:id="15" w:name="_Toc237343956"/>
+      <w:r>
+        <w:lastRenderedPageBreak/>
         <w:t>Method Reusability</w:t>
       </w:r>
-      <w:bookmarkEnd w:id="14"/>
+      <w:bookmarkEnd w:id="15"/>
     </w:p>
     <w:p>
       <w:r>
@@ -2857,17 +5278,15 @@
         <w:t xml:space="preserve"> also reusable in order to apply rewards to bank balance in the future games.</w:t>
       </w:r>
     </w:p>
-    <w:p/>
     <w:p>
       <w:pPr>
         <w:pStyle w:val="Heading3"/>
       </w:pPr>
-      <w:bookmarkStart w:id="15" w:name="_Toc237254368"/>
-      <w:r>
-        <w:lastRenderedPageBreak/>
+      <w:bookmarkStart w:id="16" w:name="_Toc237343957"/>
+      <w:r>
         <w:t>Reward Condition Class</w:t>
       </w:r>
-      <w:bookmarkEnd w:id="15"/>
+      <w:bookmarkEnd w:id="16"/>
     </w:p>
     <w:p>
       <w:r>
@@ -2879,11 +5298,11 @@
       <w:pPr>
         <w:pStyle w:val="Heading3"/>
       </w:pPr>
-      <w:bookmarkStart w:id="16" w:name="_Toc237254369"/>
+      <w:bookmarkStart w:id="17" w:name="_Toc237343958"/>
       <w:r>
         <w:t>Number of rounds</w:t>
       </w:r>
-      <w:bookmarkEnd w:id="16"/>
+      <w:bookmarkEnd w:id="17"/>
     </w:p>
     <w:p>
       <w:r>
@@ -2901,11 +5320,9 @@
       <w:r>
         <w:t xml:space="preserve"> </w:t>
       </w:r>
-      <w:proofErr w:type="gramStart"/>
-      <w:r>
-        <w:t>are</w:t>
-      </w:r>
-      <w:proofErr w:type="gramEnd"/>
+      <w:r>
+        <w:t>is</w:t>
+      </w:r>
       <w:r>
         <w:t xml:space="preserve"> passed into the betting program as a parameter so that when there is a need to modify the number of rounds, users can simply modify the variable parameter in the wrapper class dice game</w:t>
       </w:r>
@@ -2922,6 +5339,7 @@
         <w:rPr>
           <w:noProof/>
         </w:rPr>
+        <w:lastRenderedPageBreak/>
         <w:drawing>
           <wp:inline distT="0" distB="0" distL="0" distR="0" wp14:anchorId="7DBF1C8B" wp14:editId="61C62DF5">
             <wp:extent cx="5631299" cy="2198370"/>
@@ -2938,7 +5356,7 @@
                     <pic:cNvPicPr/>
                   </pic:nvPicPr>
                   <pic:blipFill>
-                    <a:blip r:embed="rId9"/>
+                    <a:blip r:embed="rId14"/>
                     <a:stretch>
                       <a:fillRect/>
                     </a:stretch>
@@ -2976,7 +5394,7 @@
           <w:rPr>
             <w:noProof/>
           </w:rPr>
-          <w:t>2</w:t>
+          <w:t>3</w:t>
         </w:r>
       </w:fldSimple>
       <w:r>
@@ -2992,7 +5410,6 @@
         <w:rPr>
           <w:noProof/>
         </w:rPr>
-        <w:lastRenderedPageBreak/>
         <w:drawing>
           <wp:inline distT="0" distB="0" distL="0" distR="0" wp14:anchorId="523FB0E6" wp14:editId="26122AAE">
             <wp:extent cx="5912667" cy="4248150"/>
@@ -3009,7 +5426,7 @@
                     <pic:cNvPicPr/>
                   </pic:nvPicPr>
                   <pic:blipFill>
-                    <a:blip r:embed="rId10"/>
+                    <a:blip r:embed="rId15"/>
                     <a:stretch>
                       <a:fillRect/>
                     </a:stretch>
@@ -3047,7 +5464,7 @@
           <w:rPr>
             <w:noProof/>
           </w:rPr>
-          <w:t>3</w:t>
+          <w:t>4</w:t>
         </w:r>
       </w:fldSimple>
       <w:r>
@@ -3058,11 +5475,12 @@
       <w:pPr>
         <w:pStyle w:val="Heading3"/>
       </w:pPr>
-      <w:bookmarkStart w:id="17" w:name="_Toc237254370"/>
-      <w:r>
+      <w:bookmarkStart w:id="18" w:name="_Toc237343959"/>
+      <w:r>
+        <w:lastRenderedPageBreak/>
         <w:t>Sides of die</w:t>
       </w:r>
-      <w:bookmarkEnd w:id="17"/>
+      <w:bookmarkEnd w:id="18"/>
     </w:p>
     <w:p>
       <w:r>
@@ -3087,7 +5505,6 @@
         <w:rPr>
           <w:noProof/>
         </w:rPr>
-        <w:lastRenderedPageBreak/>
         <w:drawing>
           <wp:inline distT="0" distB="0" distL="0" distR="0" wp14:anchorId="4DD874A3" wp14:editId="6EAF52C0">
             <wp:extent cx="5943600" cy="2705100"/>
@@ -3104,7 +5521,7 @@
                     <pic:cNvPicPr/>
                   </pic:nvPicPr>
                   <pic:blipFill>
-                    <a:blip r:embed="rId11"/>
+                    <a:blip r:embed="rId16"/>
                     <a:stretch>
                       <a:fillRect/>
                     </a:stretch>
@@ -3142,7 +5559,7 @@
           <w:rPr>
             <w:noProof/>
           </w:rPr>
-          <w:t>4</w:t>
+          <w:t>5</w:t>
         </w:r>
       </w:fldSimple>
       <w:r>
@@ -3158,11 +5575,11 @@
       <w:pPr>
         <w:pStyle w:val="Heading3"/>
       </w:pPr>
-      <w:bookmarkStart w:id="18" w:name="_Toc237254371"/>
+      <w:bookmarkStart w:id="19" w:name="_Toc237343960"/>
       <w:r>
         <w:t>Number of dice</w:t>
       </w:r>
-      <w:bookmarkEnd w:id="18"/>
+      <w:bookmarkEnd w:id="19"/>
     </w:p>
     <w:p>
       <w:r>
@@ -3182,6 +5599,7 @@
         <w:rPr>
           <w:noProof/>
         </w:rPr>
+        <w:lastRenderedPageBreak/>
         <w:drawing>
           <wp:inline distT="0" distB="0" distL="0" distR="0" wp14:anchorId="29C5D12B" wp14:editId="1D703B1B">
             <wp:extent cx="5943600" cy="2090420"/>
@@ -3198,7 +5616,7 @@
                     <pic:cNvPicPr/>
                   </pic:nvPicPr>
                   <pic:blipFill>
-                    <a:blip r:embed="rId12"/>
+                    <a:blip r:embed="rId17"/>
                     <a:stretch>
                       <a:fillRect/>
                     </a:stretch>
@@ -3236,7 +5654,7 @@
           <w:rPr>
             <w:noProof/>
           </w:rPr>
-          <w:t>5</w:t>
+          <w:t>6</w:t>
         </w:r>
       </w:fldSimple>
       <w:r>
@@ -3258,7 +5676,6 @@
         <w:rPr>
           <w:noProof/>
         </w:rPr>
-        <w:lastRenderedPageBreak/>
         <w:drawing>
           <wp:inline distT="0" distB="0" distL="0" distR="0" wp14:anchorId="37C94701" wp14:editId="419F401D">
             <wp:extent cx="4663844" cy="4244708"/>
@@ -3275,7 +5692,7 @@
                     <pic:cNvPicPr/>
                   </pic:nvPicPr>
                   <pic:blipFill>
-                    <a:blip r:embed="rId13"/>
+                    <a:blip r:embed="rId18"/>
                     <a:stretch>
                       <a:fillRect/>
                     </a:stretch>
@@ -3313,7 +5730,7 @@
           <w:rPr>
             <w:noProof/>
           </w:rPr>
-          <w:t>6</w:t>
+          <w:t>7</w:t>
         </w:r>
       </w:fldSimple>
       <w:r>
@@ -3322,6 +5739,7 @@
     </w:p>
     <w:p>
       <w:r>
+        <w:lastRenderedPageBreak/>
         <w:t xml:space="preserve">By setting die number in die rolling class, the number of </w:t>
       </w:r>
       <w:r>
@@ -3339,23 +5757,13 @@
     </w:p>
     <w:p>
       <w:pPr>
-        <w:spacing w:line="278" w:lineRule="auto"/>
-        <w:jc w:val="left"/>
-      </w:pPr>
-      <w:r>
-        <w:br w:type="page"/>
-      </w:r>
-    </w:p>
-    <w:p>
-      <w:pPr>
         <w:pStyle w:val="Heading2"/>
       </w:pPr>
-      <w:bookmarkStart w:id="19" w:name="_Toc237254372"/>
-      <w:r>
-        <w:lastRenderedPageBreak/>
+      <w:bookmarkStart w:id="20" w:name="_Toc237343961"/>
+      <w:r>
         <w:t>Advanced Features</w:t>
       </w:r>
-      <w:bookmarkEnd w:id="19"/>
+      <w:bookmarkEnd w:id="20"/>
     </w:p>
     <w:p>
       <w:r>
@@ -3393,11 +5801,11 @@
       <w:pPr>
         <w:pStyle w:val="Heading3"/>
       </w:pPr>
-      <w:bookmarkStart w:id="20" w:name="_Toc237254373"/>
+      <w:bookmarkStart w:id="21" w:name="_Toc237343962"/>
       <w:r>
         <w:t>Variable bet amount</w:t>
       </w:r>
-      <w:bookmarkEnd w:id="20"/>
+      <w:bookmarkEnd w:id="21"/>
     </w:p>
     <w:p>
       <w:r>
@@ -3432,7 +5840,7 @@
                     <pic:cNvPicPr/>
                   </pic:nvPicPr>
                   <pic:blipFill>
-                    <a:blip r:embed="rId14"/>
+                    <a:blip r:embed="rId19"/>
                     <a:stretch>
                       <a:fillRect/>
                     </a:stretch>
@@ -3470,7 +5878,7 @@
           <w:rPr>
             <w:noProof/>
           </w:rPr>
-          <w:t>7</w:t>
+          <w:t>8</w:t>
         </w:r>
       </w:fldSimple>
       <w:r>
@@ -3483,17 +5891,16 @@
       </w:r>
     </w:p>
     <w:p/>
-    <w:p/>
     <w:p>
       <w:pPr>
         <w:pStyle w:val="Heading3"/>
       </w:pPr>
-      <w:bookmarkStart w:id="21" w:name="_Toc237254374"/>
+      <w:bookmarkStart w:id="22" w:name="_Toc237343963"/>
       <w:r>
         <w:lastRenderedPageBreak/>
         <w:t>High Score Table</w:t>
       </w:r>
-      <w:bookmarkEnd w:id="21"/>
+      <w:bookmarkEnd w:id="22"/>
     </w:p>
     <w:p>
       <w:r>
@@ -3554,7 +5961,7 @@
                     <pic:cNvPicPr/>
                   </pic:nvPicPr>
                   <pic:blipFill>
-                    <a:blip r:embed="rId15"/>
+                    <a:blip r:embed="rId20"/>
                     <a:stretch>
                       <a:fillRect/>
                     </a:stretch>
@@ -3592,7 +5999,7 @@
           <w:rPr>
             <w:noProof/>
           </w:rPr>
-          <w:t>8</w:t>
+          <w:t>9</w:t>
         </w:r>
       </w:fldSimple>
       <w:r>
@@ -3625,7 +6032,7 @@
                     <pic:cNvPicPr/>
                   </pic:nvPicPr>
                   <pic:blipFill>
-                    <a:blip r:embed="rId16"/>
+                    <a:blip r:embed="rId21"/>
                     <a:stretch>
                       <a:fillRect/>
                     </a:stretch>
@@ -3663,7 +6070,7 @@
           <w:rPr>
             <w:noProof/>
           </w:rPr>
-          <w:t>9</w:t>
+          <w:t>10</w:t>
         </w:r>
       </w:fldSimple>
       <w:r>
@@ -3674,11 +6081,11 @@
       <w:pPr>
         <w:pStyle w:val="Heading2"/>
       </w:pPr>
-      <w:bookmarkStart w:id="22" w:name="_Toc237254375"/>
+      <w:bookmarkStart w:id="23" w:name="_Toc237343964"/>
       <w:r>
         <w:t>Additional Features</w:t>
       </w:r>
-      <w:bookmarkEnd w:id="22"/>
+      <w:bookmarkEnd w:id="23"/>
     </w:p>
     <w:p>
       <w:r>
@@ -3699,11 +6106,11 @@
       <w:pPr>
         <w:pStyle w:val="Heading3"/>
       </w:pPr>
-      <w:bookmarkStart w:id="23" w:name="_Toc237254376"/>
+      <w:bookmarkStart w:id="24" w:name="_Toc237343965"/>
       <w:r>
         <w:t>Currency Changer</w:t>
       </w:r>
-      <w:bookmarkEnd w:id="23"/>
+      <w:bookmarkEnd w:id="24"/>
     </w:p>
     <w:p>
       <w:r>
@@ -3765,7 +6172,7 @@
                     <pic:cNvPicPr/>
                   </pic:nvPicPr>
                   <pic:blipFill>
-                    <a:blip r:embed="rId17"/>
+                    <a:blip r:embed="rId22"/>
                     <a:stretch>
                       <a:fillRect/>
                     </a:stretch>
@@ -3803,7 +6210,7 @@
           <w:rPr>
             <w:noProof/>
           </w:rPr>
-          <w:t>10</w:t>
+          <w:t>11</w:t>
         </w:r>
       </w:fldSimple>
       <w:r>
@@ -3841,7 +6248,7 @@
                     <pic:cNvPicPr/>
                   </pic:nvPicPr>
                   <pic:blipFill>
-                    <a:blip r:embed="rId18"/>
+                    <a:blip r:embed="rId23"/>
                     <a:stretch>
                       <a:fillRect/>
                     </a:stretch>
@@ -3879,7 +6286,7 @@
           <w:rPr>
             <w:noProof/>
           </w:rPr>
-          <w:t>11</w:t>
+          <w:t>12</w:t>
         </w:r>
       </w:fldSimple>
       <w:r>
@@ -3928,7 +6335,7 @@
                     <pic:cNvPicPr/>
                   </pic:nvPicPr>
                   <pic:blipFill>
-                    <a:blip r:embed="rId19"/>
+                    <a:blip r:embed="rId24"/>
                     <a:stretch>
                       <a:fillRect/>
                     </a:stretch>
@@ -3966,7 +6373,7 @@
           <w:rPr>
             <w:noProof/>
           </w:rPr>
-          <w:t>12</w:t>
+          <w:t>13</w:t>
         </w:r>
       </w:fldSimple>
       <w:r>
@@ -3995,12 +6402,12 @@
       <w:pPr>
         <w:pStyle w:val="Heading3"/>
       </w:pPr>
-      <w:bookmarkStart w:id="24" w:name="_Toc237254377"/>
+      <w:bookmarkStart w:id="25" w:name="_Toc237343966"/>
       <w:r>
         <w:lastRenderedPageBreak/>
         <w:t>Dice Fighter</w:t>
       </w:r>
-      <w:bookmarkEnd w:id="24"/>
+      <w:bookmarkEnd w:id="25"/>
     </w:p>
     <w:p>
       <w:r>
@@ -4022,6 +6429,9 @@
         <w:jc w:val="center"/>
       </w:pPr>
       <w:r>
+        <w:rPr>
+          <w:noProof/>
+        </w:rPr>
         <w:drawing>
           <wp:inline distT="0" distB="0" distL="0" distR="0" wp14:anchorId="668A1B18" wp14:editId="22B163B5">
             <wp:extent cx="5943600" cy="5660390"/>
@@ -4038,7 +6448,7 @@
                     <pic:cNvPicPr/>
                   </pic:nvPicPr>
                   <pic:blipFill>
-                    <a:blip r:embed="rId20"/>
+                    <a:blip r:embed="rId25"/>
                     <a:stretch>
                       <a:fillRect/>
                     </a:stretch>
@@ -4076,7 +6486,7 @@
           <w:rPr>
             <w:noProof/>
           </w:rPr>
-          <w:t>13</w:t>
+          <w:t>14</w:t>
         </w:r>
       </w:fldSimple>
       <w:r>
@@ -4106,6 +6516,9 @@
         <w:jc w:val="center"/>
       </w:pPr>
       <w:r>
+        <w:rPr>
+          <w:noProof/>
+        </w:rPr>
         <w:drawing>
           <wp:inline distT="0" distB="0" distL="0" distR="0" wp14:anchorId="50ABA2D4" wp14:editId="40B5142B">
             <wp:extent cx="3067478" cy="1362265"/>
@@ -4122,7 +6535,7 @@
                     <pic:cNvPicPr/>
                   </pic:nvPicPr>
                   <pic:blipFill>
-                    <a:blip r:embed="rId21"/>
+                    <a:blip r:embed="rId26"/>
                     <a:stretch>
                       <a:fillRect/>
                     </a:stretch>
@@ -4160,7 +6573,7 @@
           <w:rPr>
             <w:noProof/>
           </w:rPr>
-          <w:t>14</w:t>
+          <w:t>15</w:t>
         </w:r>
       </w:fldSimple>
       <w:r>
@@ -4173,6 +6586,9 @@
         <w:jc w:val="center"/>
       </w:pPr>
       <w:r>
+        <w:rPr>
+          <w:noProof/>
+        </w:rPr>
         <w:drawing>
           <wp:inline distT="0" distB="0" distL="0" distR="0" wp14:anchorId="66A75883" wp14:editId="7C7772DF">
             <wp:extent cx="5943600" cy="4530725"/>
@@ -4189,7 +6605,7 @@
                     <pic:cNvPicPr/>
                   </pic:nvPicPr>
                   <pic:blipFill>
-                    <a:blip r:embed="rId22"/>
+                    <a:blip r:embed="rId27"/>
                     <a:stretch>
                       <a:fillRect/>
                     </a:stretch>
@@ -4227,7 +6643,7 @@
           <w:rPr>
             <w:noProof/>
           </w:rPr>
-          <w:t>15</w:t>
+          <w:t>16</w:t>
         </w:r>
       </w:fldSimple>
       <w:r>
@@ -4243,12 +6659,12 @@
       <w:pPr>
         <w:pStyle w:val="Heading3"/>
       </w:pPr>
-      <w:bookmarkStart w:id="25" w:name="_Toc237254378"/>
+      <w:bookmarkStart w:id="26" w:name="_Toc237343967"/>
       <w:r>
         <w:lastRenderedPageBreak/>
         <w:t>Updated Class Diagram</w:t>
       </w:r>
-      <w:bookmarkEnd w:id="25"/>
+      <w:bookmarkEnd w:id="26"/>
     </w:p>
     <w:p>
       <w:pPr>
@@ -4277,7 +6693,7 @@
                     </pic:cNvPicPr>
                   </pic:nvPicPr>
                   <pic:blipFill>
-                    <a:blip r:embed="rId23">
+                    <a:blip r:embed="rId28">
                       <a:extLst>
                         <a:ext uri="{28A0092B-C50C-407E-A947-70E740481C1C}">
                           <a14:useLocalDpi xmlns:a14="http://schemas.microsoft.com/office/drawing/2010/main" val="0"/>
@@ -4323,7 +6739,7 @@
           <w:rPr>
             <w:noProof/>
           </w:rPr>
-          <w:t>16</w:t>
+          <w:t>17</w:t>
         </w:r>
       </w:fldSimple>
       <w:r>
@@ -6474,7 +8890,7 @@
     <w:lsdException w:name="Closing" w:semiHidden="1" w:unhideWhenUsed="1"/>
     <w:lsdException w:name="Signature" w:semiHidden="1" w:unhideWhenUsed="1"/>
     <w:lsdException w:name="Default Paragraph Font" w:semiHidden="1" w:uiPriority="1" w:unhideWhenUsed="1"/>
-    <w:lsdException w:name="Body Text" w:semiHidden="1" w:unhideWhenUsed="1"/>
+    <w:lsdException w:name="Body Text" w:semiHidden="1" w:uiPriority="1" w:unhideWhenUsed="1" w:qFormat="1"/>
     <w:lsdException w:name="Body Text Indent" w:semiHidden="1" w:unhideWhenUsed="1"/>
     <w:lsdException w:name="List Continue" w:semiHidden="1" w:unhideWhenUsed="1"/>
     <w:lsdException w:name="List Continue 2" w:semiHidden="1" w:unhideWhenUsed="1"/>
@@ -7490,6 +9906,60 @@
       <w:color w:val="666666"/>
     </w:rPr>
   </w:style>
+  <w:style w:type="paragraph" w:styleId="BodyText">
+    <w:name w:val="Body Text"/>
+    <w:basedOn w:val="Normal"/>
+    <w:link w:val="BodyTextChar"/>
+    <w:uiPriority w:val="1"/>
+    <w:qFormat/>
+    <w:rsid w:val="00066E0E"/>
+    <w:pPr>
+      <w:widowControl w:val="0"/>
+      <w:autoSpaceDE w:val="0"/>
+      <w:autoSpaceDN w:val="0"/>
+      <w:spacing w:after="0" w:line="240" w:lineRule="auto"/>
+      <w:jc w:val="left"/>
+    </w:pPr>
+    <w:rPr>
+      <w:rFonts w:ascii="Arial MT" w:eastAsia="Arial MT" w:hAnsi="Arial MT" w:cs="Arial MT"/>
+      <w:kern w:val="0"/>
+      <w14:ligatures w14:val="none"/>
+    </w:rPr>
+  </w:style>
+  <w:style w:type="character" w:customStyle="1" w:styleId="BodyTextChar">
+    <w:name w:val="Body Text Char"/>
+    <w:basedOn w:val="DefaultParagraphFont"/>
+    <w:link w:val="BodyText"/>
+    <w:uiPriority w:val="1"/>
+    <w:rsid w:val="00066E0E"/>
+    <w:rPr>
+      <w:rFonts w:ascii="Arial MT" w:eastAsia="Arial MT" w:hAnsi="Arial MT" w:cs="Arial MT"/>
+      <w:kern w:val="0"/>
+      <w14:ligatures w14:val="none"/>
+    </w:rPr>
+  </w:style>
+  <w:style w:type="paragraph" w:customStyle="1" w:styleId="TableParagraph">
+    <w:name w:val="Table Paragraph"/>
+    <w:basedOn w:val="Normal"/>
+    <w:uiPriority w:val="1"/>
+    <w:qFormat/>
+    <w:rsid w:val="00066E0E"/>
+    <w:pPr>
+      <w:widowControl w:val="0"/>
+      <w:autoSpaceDE w:val="0"/>
+      <w:autoSpaceDN w:val="0"/>
+      <w:spacing w:after="0" w:line="240" w:lineRule="auto"/>
+      <w:ind w:left="95"/>
+      <w:jc w:val="left"/>
+    </w:pPr>
+    <w:rPr>
+      <w:rFonts w:ascii="Arial MT" w:eastAsia="Arial MT" w:hAnsi="Arial MT" w:cs="Arial MT"/>
+      <w:kern w:val="0"/>
+      <w:sz w:val="22"/>
+      <w:szCs w:val="22"/>
+      <w14:ligatures w14:val="none"/>
+    </w:rPr>
+  </w:style>
 </w:styles>
 </file>
 

</xml_diff>

<commit_message>
Small changes to java project
</commit_message>
<xml_diff>
--- a/Java School Projects/40841063_HLUM HTET AUNG Coursework 2/40841063_Part 2 - Software Development Report.docx
+++ b/Java School Projects/40841063_HLUM HTET AUNG Coursework 2/40841063_Part 2 - Software Development Report.docx
@@ -1695,11 +1695,9 @@
         </w:rPr>
         <w:t xml:space="preserve"> </w:t>
       </w:r>
-      <w:proofErr w:type="gramStart"/>
       <w:r>
         <w:t>sources'</w:t>
       </w:r>
-      <w:proofErr w:type="gramEnd"/>
       <w:r>
         <w:rPr>
           <w:spacing w:val="-4"/>
@@ -4420,6 +4418,90 @@
       <w:r>
         <w:t xml:space="preserve"> Class Diagram</w:t>
       </w:r>
+      <w:r>
+        <w:t xml:space="preserve"> Plan</w:t>
+      </w:r>
+    </w:p>
+    <w:p>
+      <w:pPr>
+        <w:keepNext/>
+        <w:jc w:val="center"/>
+      </w:pPr>
+      <w:r>
+        <w:rPr>
+          <w:noProof/>
+        </w:rPr>
+        <w:lastRenderedPageBreak/>
+        <w:drawing>
+          <wp:inline distT="0" distB="0" distL="0" distR="0" wp14:anchorId="2EC7EBFE" wp14:editId="6C4DF787">
+            <wp:extent cx="5943600" cy="2560955"/>
+            <wp:effectExtent l="19050" t="19050" r="19050" b="10795"/>
+            <wp:docPr id="1842531529" name="Picture 3"/>
+            <wp:cNvGraphicFramePr>
+              <a:graphicFrameLocks xmlns:a="http://schemas.openxmlformats.org/drawingml/2006/main" noChangeAspect="1"/>
+            </wp:cNvGraphicFramePr>
+            <a:graphic xmlns:a="http://schemas.openxmlformats.org/drawingml/2006/main">
+              <a:graphicData uri="http://schemas.openxmlformats.org/drawingml/2006/picture">
+                <pic:pic xmlns:pic="http://schemas.openxmlformats.org/drawingml/2006/picture">
+                  <pic:nvPicPr>
+                    <pic:cNvPr id="0" name="Picture 1"/>
+                    <pic:cNvPicPr>
+                      <a:picLocks noChangeAspect="1" noChangeArrowheads="1"/>
+                    </pic:cNvPicPr>
+                  </pic:nvPicPr>
+                  <pic:blipFill>
+                    <a:blip r:embed="rId13">
+                      <a:extLst>
+                        <a:ext uri="{28A0092B-C50C-407E-A947-70E740481C1C}">
+                          <a14:useLocalDpi xmlns:a14="http://schemas.microsoft.com/office/drawing/2010/main" val="0"/>
+                        </a:ext>
+                      </a:extLst>
+                    </a:blip>
+                    <a:srcRect/>
+                    <a:stretch>
+                      <a:fillRect/>
+                    </a:stretch>
+                  </pic:blipFill>
+                  <pic:spPr bwMode="auto">
+                    <a:xfrm>
+                      <a:off x="0" y="0"/>
+                      <a:ext cx="5943600" cy="2560955"/>
+                    </a:xfrm>
+                    <a:prstGeom prst="rect">
+                      <a:avLst/>
+                    </a:prstGeom>
+                    <a:noFill/>
+                    <a:ln>
+                      <a:solidFill>
+                        <a:schemeClr val="tx1"/>
+                      </a:solidFill>
+                    </a:ln>
+                  </pic:spPr>
+                </pic:pic>
+              </a:graphicData>
+            </a:graphic>
+          </wp:inline>
+        </w:drawing>
+      </w:r>
+    </w:p>
+    <w:p>
+      <w:pPr>
+        <w:jc w:val="center"/>
+      </w:pPr>
+      <w:r>
+        <w:t xml:space="preserve">Figure </w:t>
+      </w:r>
+      <w:fldSimple w:instr=" SEQ Figure \* ARABIC ">
+        <w:r>
+          <w:rPr>
+            <w:noProof/>
+          </w:rPr>
+          <w:t>2</w:t>
+        </w:r>
+      </w:fldSimple>
+      <w:r>
+        <w:t xml:space="preserve"> Implemented class diagram</w:t>
+      </w:r>
     </w:p>
     <w:p>
       <w:r>
@@ -4573,7 +4655,6 @@
         </w:numPr>
       </w:pPr>
       <w:r>
-        <w:lastRenderedPageBreak/>
         <w:t xml:space="preserve">Result Board </w:t>
       </w:r>
       <w:r>
@@ -4632,6 +4713,7 @@
       </w:pPr>
       <w:bookmarkStart w:id="5" w:name="_Toc237343946"/>
       <w:r>
+        <w:lastRenderedPageBreak/>
         <w:t>Main Class</w:t>
       </w:r>
       <w:bookmarkEnd w:id="5"/>
@@ -4835,40 +4917,40 @@
         </w:numPr>
       </w:pPr>
       <w:r>
+        <w:t>Calls score board class to show player’s ranking among dummy users</w:t>
+      </w:r>
+    </w:p>
+    <w:p>
+      <w:pPr>
+        <w:pStyle w:val="Heading3"/>
+      </w:pPr>
+      <w:bookmarkStart w:id="8" w:name="_Toc237343949"/>
+      <w:r>
+        <w:t>Dice Rolling Class</w:t>
+      </w:r>
+      <w:bookmarkEnd w:id="8"/>
+    </w:p>
+    <w:p>
+      <w:r>
+        <w:tab/>
+      </w:r>
+      <w:r>
+        <w:t xml:space="preserve">The dice rolling class is specifically written to roll the dice and is called by the betting program. This improves the code reusability, as the class can be called again and again, whenever we need to roll the dice. </w:t>
+      </w:r>
+      <w:r>
+        <w:t xml:space="preserve">The program includes </w:t>
+      </w:r>
+      <w:r>
+        <w:t>dice program method with the random rolling function.</w:t>
+      </w:r>
+    </w:p>
+    <w:p>
+      <w:pPr>
+        <w:pStyle w:val="Heading3"/>
+      </w:pPr>
+      <w:bookmarkStart w:id="9" w:name="_Toc237343950"/>
+      <w:r>
         <w:lastRenderedPageBreak/>
-        <w:t>Calls score board class to show player’s ranking among dummy users</w:t>
-      </w:r>
-    </w:p>
-    <w:p>
-      <w:pPr>
-        <w:pStyle w:val="Heading3"/>
-      </w:pPr>
-      <w:bookmarkStart w:id="8" w:name="_Toc237343949"/>
-      <w:r>
-        <w:t>Dice Rolling Class</w:t>
-      </w:r>
-      <w:bookmarkEnd w:id="8"/>
-    </w:p>
-    <w:p>
-      <w:r>
-        <w:tab/>
-      </w:r>
-      <w:r>
-        <w:t xml:space="preserve">The dice rolling class is specifically written to roll the dice and is called by the betting program. This improves the code reusability, as the class can be called again and again, whenever we need to roll the dice. </w:t>
-      </w:r>
-      <w:r>
-        <w:t xml:space="preserve">The program includes </w:t>
-      </w:r>
-      <w:r>
-        <w:t>dice program method with the random rolling function.</w:t>
-      </w:r>
-    </w:p>
-    <w:p>
-      <w:pPr>
-        <w:pStyle w:val="Heading3"/>
-      </w:pPr>
-      <w:bookmarkStart w:id="9" w:name="_Toc237343950"/>
-      <w:r>
         <w:t>Reward Conditions</w:t>
       </w:r>
       <w:bookmarkEnd w:id="9"/>
@@ -4899,6 +4981,9 @@
         <w:jc w:val="center"/>
       </w:pPr>
       <w:r>
+        <w:rPr>
+          <w:noProof/>
+        </w:rPr>
         <w:drawing>
           <wp:inline distT="0" distB="0" distL="0" distR="0" wp14:anchorId="5E628BBC" wp14:editId="0D968984">
             <wp:extent cx="5943600" cy="3418840"/>
@@ -4915,7 +5000,7 @@
                     <pic:cNvPicPr/>
                   </pic:nvPicPr>
                   <pic:blipFill>
-                    <a:blip r:embed="rId13"/>
+                    <a:blip r:embed="rId14"/>
                     <a:stretch>
                       <a:fillRect/>
                     </a:stretch>
@@ -4953,7 +5038,7 @@
           <w:rPr>
             <w:noProof/>
           </w:rPr>
-          <w:t>2</w:t>
+          <w:t>3</w:t>
         </w:r>
       </w:fldSimple>
       <w:r>
@@ -4966,58 +5051,58 @@
       </w:pPr>
       <w:bookmarkStart w:id="10" w:name="_Toc237343951"/>
       <w:r>
+        <w:t>Round Recorder</w:t>
+      </w:r>
+      <w:bookmarkEnd w:id="10"/>
+    </w:p>
+    <w:p>
+      <w:r>
+        <w:tab/>
+      </w:r>
+      <w:r>
+        <w:t xml:space="preserve">The round recorder is a class that </w:t>
+      </w:r>
+      <w:r>
+        <w:t>records</w:t>
+      </w:r>
+      <w:r>
+        <w:t xml:space="preserve"> the results of each round and </w:t>
+      </w:r>
+      <w:r>
+        <w:t>stores</w:t>
+      </w:r>
+      <w:r>
+        <w:t xml:space="preserve"> them as history. </w:t>
+      </w:r>
+      <w:r>
+        <w:t xml:space="preserve">The class is called by betting program, </w:t>
+      </w:r>
+      <w:r>
+        <w:t>scoreboard</w:t>
+      </w:r>
+      <w:r>
+        <w:t xml:space="preserve"> class, and result board class. </w:t>
+      </w:r>
+      <w:r>
+        <w:t>The class contains</w:t>
+      </w:r>
+      <w:r>
+        <w:t xml:space="preserve"> </w:t>
+      </w:r>
+      <w:r>
+        <w:t>recording</w:t>
+      </w:r>
+      <w:r>
+        <w:t xml:space="preserve"> round method to record rounds, a get method to return history, and reset method which reset the recording.</w:t>
+      </w:r>
+    </w:p>
+    <w:p>
+      <w:pPr>
+        <w:pStyle w:val="Heading3"/>
+      </w:pPr>
+      <w:bookmarkStart w:id="11" w:name="_Toc237343952"/>
+      <w:r>
         <w:lastRenderedPageBreak/>
-        <w:t>Round Recorder</w:t>
-      </w:r>
-      <w:bookmarkEnd w:id="10"/>
-    </w:p>
-    <w:p>
-      <w:r>
-        <w:tab/>
-      </w:r>
-      <w:r>
-        <w:t xml:space="preserve">The round recorder is a class that </w:t>
-      </w:r>
-      <w:r>
-        <w:t>records</w:t>
-      </w:r>
-      <w:r>
-        <w:t xml:space="preserve"> the results of each round and </w:t>
-      </w:r>
-      <w:r>
-        <w:t>stores</w:t>
-      </w:r>
-      <w:r>
-        <w:t xml:space="preserve"> them as history. </w:t>
-      </w:r>
-      <w:r>
-        <w:t xml:space="preserve">The class is called by betting program, </w:t>
-      </w:r>
-      <w:r>
-        <w:t>scoreboard</w:t>
-      </w:r>
-      <w:r>
-        <w:t xml:space="preserve"> class, and result board class. </w:t>
-      </w:r>
-      <w:r>
-        <w:t>The class contains</w:t>
-      </w:r>
-      <w:r>
-        <w:t xml:space="preserve"> </w:t>
-      </w:r>
-      <w:r>
-        <w:t>recording</w:t>
-      </w:r>
-      <w:r>
-        <w:t xml:space="preserve"> round method to record rounds, a get method to return history, and reset method which reset the recording.</w:t>
-      </w:r>
-    </w:p>
-    <w:p>
-      <w:pPr>
-        <w:pStyle w:val="Heading3"/>
-      </w:pPr>
-      <w:bookmarkStart w:id="11" w:name="_Toc237343952"/>
-      <w:r>
         <w:t>Scoreboard Class</w:t>
       </w:r>
       <w:bookmarkEnd w:id="11"/>
@@ -5154,7 +5239,6 @@
       </w:pPr>
       <w:bookmarkStart w:id="15" w:name="_Toc237343956"/>
       <w:r>
-        <w:lastRenderedPageBreak/>
         <w:t>Method Reusability</w:t>
       </w:r>
       <w:bookmarkEnd w:id="15"/>
@@ -5201,6 +5285,7 @@
       </w:pPr>
       <w:proofErr w:type="spellStart"/>
       <w:r>
+        <w:lastRenderedPageBreak/>
         <w:t>DiceRolling.diceprogram</w:t>
       </w:r>
       <w:proofErr w:type="spellEnd"/>
@@ -5339,7 +5424,6 @@
         <w:rPr>
           <w:noProof/>
         </w:rPr>
-        <w:lastRenderedPageBreak/>
         <w:drawing>
           <wp:inline distT="0" distB="0" distL="0" distR="0" wp14:anchorId="7DBF1C8B" wp14:editId="61C62DF5">
             <wp:extent cx="5631299" cy="2198370"/>
@@ -5356,7 +5440,7 @@
                     <pic:cNvPicPr/>
                   </pic:nvPicPr>
                   <pic:blipFill>
-                    <a:blip r:embed="rId14"/>
+                    <a:blip r:embed="rId15"/>
                     <a:stretch>
                       <a:fillRect/>
                     </a:stretch>
@@ -5394,7 +5478,7 @@
           <w:rPr>
             <w:noProof/>
           </w:rPr>
-          <w:t>3</w:t>
+          <w:t>4</w:t>
         </w:r>
       </w:fldSimple>
       <w:r>
@@ -5410,6 +5494,7 @@
         <w:rPr>
           <w:noProof/>
         </w:rPr>
+        <w:lastRenderedPageBreak/>
         <w:drawing>
           <wp:inline distT="0" distB="0" distL="0" distR="0" wp14:anchorId="523FB0E6" wp14:editId="26122AAE">
             <wp:extent cx="5912667" cy="4248150"/>
@@ -5426,7 +5511,7 @@
                     <pic:cNvPicPr/>
                   </pic:nvPicPr>
                   <pic:blipFill>
-                    <a:blip r:embed="rId15"/>
+                    <a:blip r:embed="rId16"/>
                     <a:stretch>
                       <a:fillRect/>
                     </a:stretch>
@@ -5464,7 +5549,7 @@
           <w:rPr>
             <w:noProof/>
           </w:rPr>
-          <w:t>4</w:t>
+          <w:t>5</w:t>
         </w:r>
       </w:fldSimple>
       <w:r>
@@ -5477,7 +5562,6 @@
       </w:pPr>
       <w:bookmarkStart w:id="18" w:name="_Toc237343959"/>
       <w:r>
-        <w:lastRenderedPageBreak/>
         <w:t>Sides of die</w:t>
       </w:r>
       <w:bookmarkEnd w:id="18"/>
@@ -5505,6 +5589,7 @@
         <w:rPr>
           <w:noProof/>
         </w:rPr>
+        <w:lastRenderedPageBreak/>
         <w:drawing>
           <wp:inline distT="0" distB="0" distL="0" distR="0" wp14:anchorId="4DD874A3" wp14:editId="6EAF52C0">
             <wp:extent cx="5943600" cy="2705100"/>
@@ -5521,7 +5606,7 @@
                     <pic:cNvPicPr/>
                   </pic:nvPicPr>
                   <pic:blipFill>
-                    <a:blip r:embed="rId16"/>
+                    <a:blip r:embed="rId17"/>
                     <a:stretch>
                       <a:fillRect/>
                     </a:stretch>
@@ -5559,7 +5644,7 @@
           <w:rPr>
             <w:noProof/>
           </w:rPr>
-          <w:t>5</w:t>
+          <w:t>6</w:t>
         </w:r>
       </w:fldSimple>
       <w:r>
@@ -5599,7 +5684,6 @@
         <w:rPr>
           <w:noProof/>
         </w:rPr>
-        <w:lastRenderedPageBreak/>
         <w:drawing>
           <wp:inline distT="0" distB="0" distL="0" distR="0" wp14:anchorId="29C5D12B" wp14:editId="1D703B1B">
             <wp:extent cx="5943600" cy="2090420"/>
@@ -5616,7 +5700,7 @@
                     <pic:cNvPicPr/>
                   </pic:nvPicPr>
                   <pic:blipFill>
-                    <a:blip r:embed="rId17"/>
+                    <a:blip r:embed="rId18"/>
                     <a:stretch>
                       <a:fillRect/>
                     </a:stretch>
@@ -5654,7 +5738,7 @@
           <w:rPr>
             <w:noProof/>
           </w:rPr>
-          <w:t>6</w:t>
+          <w:t>7</w:t>
         </w:r>
       </w:fldSimple>
       <w:r>
@@ -5676,6 +5760,7 @@
         <w:rPr>
           <w:noProof/>
         </w:rPr>
+        <w:lastRenderedPageBreak/>
         <w:drawing>
           <wp:inline distT="0" distB="0" distL="0" distR="0" wp14:anchorId="37C94701" wp14:editId="419F401D">
             <wp:extent cx="4663844" cy="4244708"/>
@@ -5692,7 +5777,7 @@
                     <pic:cNvPicPr/>
                   </pic:nvPicPr>
                   <pic:blipFill>
-                    <a:blip r:embed="rId18"/>
+                    <a:blip r:embed="rId19"/>
                     <a:stretch>
                       <a:fillRect/>
                     </a:stretch>
@@ -5730,7 +5815,7 @@
           <w:rPr>
             <w:noProof/>
           </w:rPr>
-          <w:t>7</w:t>
+          <w:t>8</w:t>
         </w:r>
       </w:fldSimple>
       <w:r>
@@ -5739,7 +5824,6 @@
     </w:p>
     <w:p>
       <w:r>
-        <w:lastRenderedPageBreak/>
         <w:t xml:space="preserve">By setting die number in die rolling class, the number of </w:t>
       </w:r>
       <w:r>
@@ -5824,6 +5908,7 @@
         <w:rPr>
           <w:noProof/>
         </w:rPr>
+        <w:lastRenderedPageBreak/>
         <w:drawing>
           <wp:inline distT="0" distB="0" distL="0" distR="0" wp14:anchorId="258EB0E1" wp14:editId="176BD905">
             <wp:extent cx="5943600" cy="3067050"/>
@@ -5840,7 +5925,7 @@
                     <pic:cNvPicPr/>
                   </pic:nvPicPr>
                   <pic:blipFill>
-                    <a:blip r:embed="rId19"/>
+                    <a:blip r:embed="rId20"/>
                     <a:stretch>
                       <a:fillRect/>
                     </a:stretch>
@@ -5878,7 +5963,7 @@
           <w:rPr>
             <w:noProof/>
           </w:rPr>
-          <w:t>8</w:t>
+          <w:t>9</w:t>
         </w:r>
       </w:fldSimple>
       <w:r>
@@ -5897,7 +5982,6 @@
       </w:pPr>
       <w:bookmarkStart w:id="22" w:name="_Toc237343963"/>
       <w:r>
-        <w:lastRenderedPageBreak/>
         <w:t>High Score Table</w:t>
       </w:r>
       <w:bookmarkEnd w:id="22"/>
@@ -5945,6 +6029,7 @@
         <w:rPr>
           <w:noProof/>
         </w:rPr>
+        <w:lastRenderedPageBreak/>
         <w:drawing>
           <wp:inline distT="0" distB="0" distL="0" distR="0" wp14:anchorId="0B158AA9" wp14:editId="1FAB13EA">
             <wp:extent cx="5782576" cy="4629150"/>
@@ -5961,7 +6046,7 @@
                     <pic:cNvPicPr/>
                   </pic:nvPicPr>
                   <pic:blipFill>
-                    <a:blip r:embed="rId20"/>
+                    <a:blip r:embed="rId21"/>
                     <a:stretch>
                       <a:fillRect/>
                     </a:stretch>
@@ -5999,7 +6084,7 @@
           <w:rPr>
             <w:noProof/>
           </w:rPr>
-          <w:t>9</w:t>
+          <w:t>10</w:t>
         </w:r>
       </w:fldSimple>
       <w:r>
@@ -6032,7 +6117,7 @@
                     <pic:cNvPicPr/>
                   </pic:nvPicPr>
                   <pic:blipFill>
-                    <a:blip r:embed="rId21"/>
+                    <a:blip r:embed="rId22"/>
                     <a:stretch>
                       <a:fillRect/>
                     </a:stretch>
@@ -6070,7 +6155,7 @@
           <w:rPr>
             <w:noProof/>
           </w:rPr>
-          <w:t>10</w:t>
+          <w:t>11</w:t>
         </w:r>
       </w:fldSimple>
       <w:r>
@@ -6172,7 +6257,7 @@
                     <pic:cNvPicPr/>
                   </pic:nvPicPr>
                   <pic:blipFill>
-                    <a:blip r:embed="rId22"/>
+                    <a:blip r:embed="rId23"/>
                     <a:stretch>
                       <a:fillRect/>
                     </a:stretch>
@@ -6210,7 +6295,7 @@
           <w:rPr>
             <w:noProof/>
           </w:rPr>
-          <w:t>11</w:t>
+          <w:t>12</w:t>
         </w:r>
       </w:fldSimple>
       <w:r>
@@ -6248,7 +6333,7 @@
                     <pic:cNvPicPr/>
                   </pic:nvPicPr>
                   <pic:blipFill>
-                    <a:blip r:embed="rId23"/>
+                    <a:blip r:embed="rId24"/>
                     <a:stretch>
                       <a:fillRect/>
                     </a:stretch>
@@ -6286,7 +6371,7 @@
           <w:rPr>
             <w:noProof/>
           </w:rPr>
-          <w:t>12</w:t>
+          <w:t>13</w:t>
         </w:r>
       </w:fldSimple>
       <w:r>
@@ -6335,7 +6420,7 @@
                     <pic:cNvPicPr/>
                   </pic:nvPicPr>
                   <pic:blipFill>
-                    <a:blip r:embed="rId24"/>
+                    <a:blip r:embed="rId25"/>
                     <a:stretch>
                       <a:fillRect/>
                     </a:stretch>
@@ -6373,7 +6458,7 @@
           <w:rPr>
             <w:noProof/>
           </w:rPr>
-          <w:t>13</w:t>
+          <w:t>14</w:t>
         </w:r>
       </w:fldSimple>
       <w:r>
@@ -6448,7 +6533,7 @@
                     <pic:cNvPicPr/>
                   </pic:nvPicPr>
                   <pic:blipFill>
-                    <a:blip r:embed="rId25"/>
+                    <a:blip r:embed="rId26"/>
                     <a:stretch>
                       <a:fillRect/>
                     </a:stretch>
@@ -6486,7 +6571,7 @@
           <w:rPr>
             <w:noProof/>
           </w:rPr>
-          <w:t>14</w:t>
+          <w:t>15</w:t>
         </w:r>
       </w:fldSimple>
       <w:r>
@@ -6499,15 +6584,7 @@
       </w:r>
       <w:r>
         <w:lastRenderedPageBreak/>
-        <w:t xml:space="preserve">call. Now after adding dice fighter, there is a conditional statement in dice game where it </w:t>
-      </w:r>
-      <w:proofErr w:type="gramStart"/>
-      <w:r>
-        <w:t>ask</w:t>
-      </w:r>
-      <w:proofErr w:type="gramEnd"/>
-      <w:r>
-        <w:t xml:space="preserve"> users if they want to play dice fighter or dice poker.</w:t>
+        <w:t>call. Now after adding dice fighter, there is a conditional statement in dice game where it ask users if they want to play dice fighter or dice poker.</w:t>
       </w:r>
     </w:p>
     <w:p>
@@ -6535,7 +6612,7 @@
                     <pic:cNvPicPr/>
                   </pic:nvPicPr>
                   <pic:blipFill>
-                    <a:blip r:embed="rId26"/>
+                    <a:blip r:embed="rId27"/>
                     <a:stretch>
                       <a:fillRect/>
                     </a:stretch>
@@ -6573,7 +6650,7 @@
           <w:rPr>
             <w:noProof/>
           </w:rPr>
-          <w:t>15</w:t>
+          <w:t>16</w:t>
         </w:r>
       </w:fldSimple>
       <w:r>
@@ -6605,7 +6682,7 @@
                     <pic:cNvPicPr/>
                   </pic:nvPicPr>
                   <pic:blipFill>
-                    <a:blip r:embed="rId27"/>
+                    <a:blip r:embed="rId28"/>
                     <a:stretch>
                       <a:fillRect/>
                     </a:stretch>
@@ -6643,7 +6720,7 @@
           <w:rPr>
             <w:noProof/>
           </w:rPr>
-          <w:t>16</w:t>
+          <w:t>17</w:t>
         </w:r>
       </w:fldSimple>
       <w:r>
@@ -6693,7 +6770,7 @@
                     </pic:cNvPicPr>
                   </pic:nvPicPr>
                   <pic:blipFill>
-                    <a:blip r:embed="rId28">
+                    <a:blip r:embed="rId29">
                       <a:extLst>
                         <a:ext uri="{28A0092B-C50C-407E-A947-70E740481C1C}">
                           <a14:useLocalDpi xmlns:a14="http://schemas.microsoft.com/office/drawing/2010/main" val="0"/>
@@ -6739,11 +6816,91 @@
           <w:rPr>
             <w:noProof/>
           </w:rPr>
-          <w:t>17</w:t>
+          <w:t>18</w:t>
         </w:r>
       </w:fldSimple>
       <w:r>
         <w:t xml:space="preserve"> Updated Class Diagram</w:t>
+      </w:r>
+    </w:p>
+    <w:p>
+      <w:pPr>
+        <w:keepNext/>
+        <w:jc w:val="center"/>
+      </w:pPr>
+      <w:r>
+        <w:rPr>
+          <w:noProof/>
+        </w:rPr>
+        <w:drawing>
+          <wp:inline distT="0" distB="0" distL="0" distR="0" wp14:anchorId="2054392D" wp14:editId="49C1315B">
+            <wp:extent cx="5943600" cy="2560955"/>
+            <wp:effectExtent l="19050" t="19050" r="19050" b="10795"/>
+            <wp:docPr id="1365725413" name="Picture 4"/>
+            <wp:cNvGraphicFramePr>
+              <a:graphicFrameLocks xmlns:a="http://schemas.openxmlformats.org/drawingml/2006/main" noChangeAspect="1"/>
+            </wp:cNvGraphicFramePr>
+            <a:graphic xmlns:a="http://schemas.openxmlformats.org/drawingml/2006/main">
+              <a:graphicData uri="http://schemas.openxmlformats.org/drawingml/2006/picture">
+                <pic:pic xmlns:pic="http://schemas.openxmlformats.org/drawingml/2006/picture">
+                  <pic:nvPicPr>
+                    <pic:cNvPr id="0" name="Picture 3"/>
+                    <pic:cNvPicPr>
+                      <a:picLocks noChangeAspect="1" noChangeArrowheads="1"/>
+                    </pic:cNvPicPr>
+                  </pic:nvPicPr>
+                  <pic:blipFill>
+                    <a:blip r:embed="rId13">
+                      <a:extLst>
+                        <a:ext uri="{28A0092B-C50C-407E-A947-70E740481C1C}">
+                          <a14:useLocalDpi xmlns:a14="http://schemas.microsoft.com/office/drawing/2010/main" val="0"/>
+                        </a:ext>
+                      </a:extLst>
+                    </a:blip>
+                    <a:srcRect/>
+                    <a:stretch>
+                      <a:fillRect/>
+                    </a:stretch>
+                  </pic:blipFill>
+                  <pic:spPr bwMode="auto">
+                    <a:xfrm>
+                      <a:off x="0" y="0"/>
+                      <a:ext cx="5943600" cy="2560955"/>
+                    </a:xfrm>
+                    <a:prstGeom prst="rect">
+                      <a:avLst/>
+                    </a:prstGeom>
+                    <a:noFill/>
+                    <a:ln>
+                      <a:solidFill>
+                        <a:schemeClr val="tx1"/>
+                      </a:solidFill>
+                    </a:ln>
+                  </pic:spPr>
+                </pic:pic>
+              </a:graphicData>
+            </a:graphic>
+          </wp:inline>
+        </w:drawing>
+      </w:r>
+    </w:p>
+    <w:p>
+      <w:pPr>
+        <w:jc w:val="center"/>
+      </w:pPr>
+      <w:r>
+        <w:t xml:space="preserve">Figure </w:t>
+      </w:r>
+      <w:fldSimple w:instr=" SEQ Figure \* ARABIC ">
+        <w:r>
+          <w:rPr>
+            <w:noProof/>
+          </w:rPr>
+          <w:t>19</w:t>
+        </w:r>
+      </w:fldSimple>
+      <w:r>
+        <w:t xml:space="preserve"> Implemented class diagram</w:t>
       </w:r>
     </w:p>
     <w:sectPr>

</xml_diff>